<commit_message>
adelante hasta el punto b
</commit_message>
<xml_diff>
--- a/laboratorio 1/Laboratorio 1.docx
+++ b/laboratorio 1/Laboratorio 1.docx
@@ -43,7 +43,7 @@
                     <pic:cNvPicPr/>
                   </pic:nvPicPr>
                   <pic:blipFill>
-                    <a:blip r:embed="rId4"/>
+                    <a:blip r:embed="rId5"/>
                     <a:stretch>
                       <a:fillRect/>
                     </a:stretch>
@@ -138,8 +138,14 @@
     <w:p>
       <w:pPr>
         <w:spacing w:after="0"/>
-      </w:pPr>
-      <w:r>
+        <w:rPr>
+          <w:lang w:val="en-US"/>
+        </w:rPr>
+      </w:pPr>
+      <w:r>
+        <w:rPr>
+          <w:lang w:val="en-US"/>
+        </w:rPr>
         <w:t>Rta a: canvas, triangle,circule and rectangle</w:t>
       </w:r>
     </w:p>
@@ -302,7 +308,7 @@
                     <pic:cNvPicPr/>
                   </pic:nvPicPr>
                   <pic:blipFill rotWithShape="1">
-                    <a:blip r:embed="rId5"/>
+                    <a:blip r:embed="rId6"/>
                     <a:srcRect l="1933" t="3914" r="43576" b="1463"/>
                     <a:stretch>
                       <a:fillRect/>
@@ -357,7 +363,7 @@
                     <pic:cNvPicPr/>
                   </pic:nvPicPr>
                   <pic:blipFill>
-                    <a:blip r:embed="rId6"/>
+                    <a:blip r:embed="rId7"/>
                     <a:stretch>
                       <a:fillRect/>
                     </a:stretch>
@@ -545,8 +551,14 @@
     <w:p>
       <w:pPr>
         <w:spacing w:after="0"/>
-      </w:pPr>
-      <w:r>
+        <w:rPr>
+          <w:lang w:val="en-US"/>
+        </w:rPr>
+      </w:pPr>
+      <w:r>
+        <w:rPr>
+          <w:lang w:val="en-US"/>
+        </w:rPr>
         <w:t xml:space="preserve">Rta e: </w:t>
       </w:r>
     </w:p>
@@ -744,137 +756,83 @@
     <w:p>
       <w:pPr>
         <w:spacing w:after="0"/>
-        <w:rPr>
-          <w:lang w:val="en-US"/>
-        </w:rPr>
-      </w:pPr>
-      <w:r>
-        <w:rPr>
-          <w:lang w:val="en-US"/>
-        </w:rPr>
-        <w:t xml:space="preserve">        draw();</w:t>
-      </w:r>
-    </w:p>
-    <w:p>
-      <w:pPr>
-        <w:spacing w:after="0"/>
-        <w:rPr>
-          <w:lang w:val="en-US"/>
-        </w:rPr>
-      </w:pPr>
-      <w:r>
-        <w:rPr>
-          <w:lang w:val="en-US"/>
-        </w:rPr>
+      </w:pPr>
+      <w:r>
+        <w:rPr>
+          <w:lang w:val="en-US"/>
+        </w:rPr>
+        <w:t xml:space="preserve">        </w:t>
+      </w:r>
+      <w:r>
+        <w:t>draw();</w:t>
+      </w:r>
+    </w:p>
+    <w:p>
+      <w:pPr>
+        <w:spacing w:after="0"/>
+      </w:pPr>
+      <w:r>
         <w:t xml:space="preserve">    }</w:t>
       </w:r>
     </w:p>
     <w:p>
       <w:pPr>
         <w:spacing w:after="0"/>
-        <w:rPr>
-          <w:lang w:val="en-US"/>
-        </w:rPr>
-      </w:pPr>
-    </w:p>
-    <w:p>
-      <w:pPr>
-        <w:spacing w:after="0"/>
-        <w:rPr>
-          <w:lang w:val="en-US"/>
-        </w:rPr>
-      </w:pPr>
-      <w:r>
-        <w:rPr>
-          <w:lang w:val="en-US"/>
-        </w:rPr>
-        <w:t xml:space="preserve">8. </w:t>
-      </w:r>
-      <w:r>
-        <w:rPr>
-          <w:lang w:val="en-US"/>
-        </w:rPr>
-        <w:t>Si creamos 100 rectángulos, (a) ¿cuántos EDGES y cuántos width tendríamos? (b) Justifique.</w:t>
-      </w:r>
-    </w:p>
-    <w:p>
-      <w:pPr>
-        <w:spacing w:after="0"/>
-        <w:rPr>
-          <w:lang w:val="en-US"/>
-        </w:rPr>
-      </w:pPr>
-      <w:r>
-        <w:rPr>
-          <w:lang w:val="en-US"/>
-        </w:rPr>
+      </w:pPr>
+    </w:p>
+    <w:p>
+      <w:pPr>
+        <w:spacing w:after="0"/>
+      </w:pPr>
+      <w:r>
+        <w:t>8. Si creamos 100 rectángulos, (a) ¿cuántos EDGES y cuántos width tendríamos? (b) Justifique.</w:t>
+      </w:r>
+    </w:p>
+    <w:p>
+      <w:pPr>
+        <w:spacing w:after="0"/>
+      </w:pPr>
+      <w:r>
         <w:t>a) tendriamos 1 EDGE y 100 width</w:t>
       </w:r>
     </w:p>
     <w:p>
       <w:pPr>
         <w:spacing w:after="0"/>
-        <w:rPr>
-          <w:lang w:val="en-US"/>
-        </w:rPr>
-      </w:pPr>
-      <w:r>
-        <w:rPr>
-          <w:lang w:val="en-US"/>
-        </w:rPr>
+      </w:pPr>
+      <w:r>
         <w:t>b) porque el edge es static eso quiere decir que todos los objetos van a compartir el mismo valor de ese atributo pase lo que pase</w:t>
       </w:r>
     </w:p>
     <w:p>
       <w:pPr>
         <w:spacing w:after="0"/>
-        <w:rPr>
-          <w:lang w:val="en-US"/>
-        </w:rPr>
-      </w:pPr>
-    </w:p>
-    <w:p>
-      <w:pPr>
-        <w:spacing w:after="0"/>
-        <w:rPr>
-          <w:lang w:val="en-US"/>
-        </w:rPr>
-      </w:pPr>
-      <w:r>
-        <w:rPr>
-          <w:lang w:val="en-US"/>
-        </w:rPr>
+      </w:pPr>
+    </w:p>
+    <w:p>
+      <w:pPr>
+        <w:spacing w:after="0"/>
+      </w:pPr>
+      <w:r>
         <w:t>9. ¿Cuál dirían es el propósito del proyecto shapes?</w:t>
       </w:r>
     </w:p>
     <w:p>
       <w:pPr>
         <w:spacing w:after="0"/>
-        <w:rPr>
-          <w:lang w:val="en-US"/>
-        </w:rPr>
-      </w:pPr>
-      <w:r>
-        <w:rPr>
-          <w:lang w:val="en-US"/>
-        </w:rPr>
+      </w:pPr>
+      <w:r>
         <w:t>Permitri la visibilidad y manipulación de las figuras geometriccas bascias sobre un canvas</w:t>
       </w:r>
     </w:p>
     <w:p>
       <w:pPr>
         <w:spacing w:after="0"/>
-        <w:rPr>
-          <w:lang w:val="en-US"/>
-        </w:rPr>
-      </w:pPr>
-    </w:p>
-    <w:p>
-      <w:pPr>
-        <w:spacing w:after="0"/>
-        <w:rPr>
-          <w:lang w:val="en-US"/>
-        </w:rPr>
+      </w:pPr>
+    </w:p>
+    <w:p>
+      <w:pPr>
+        <w:spacing w:after="0"/>
       </w:pPr>
     </w:p>
     <w:p>
@@ -883,28 +841,22 @@
         <w:rPr>
           <w:b/>
           <w:bCs/>
-          <w:lang w:val="en-US"/>
         </w:rPr>
       </w:pPr>
       <w:r>
         <w:rPr>
           <w:b/>
           <w:bCs/>
-          <w:lang w:val="en-US"/>
         </w:rPr>
         <w:t>B</w:t>
       </w:r>
       <w:r>
-        <w:rPr>
-          <w:lang w:val="en-US"/>
-        </w:rPr>
         <w:t xml:space="preserve"> </w:t>
       </w:r>
       <w:r>
         <w:rPr>
           <w:b/>
           <w:bCs/>
-          <w:lang w:val="en-US"/>
         </w:rPr>
         <w:t>Manipulando objetos. Usando un objeto.</w:t>
       </w:r>
@@ -912,70 +864,431 @@
     <w:p>
       <w:pPr>
         <w:spacing w:after="0"/>
-        <w:rPr>
-          <w:lang w:val="en-US"/>
-        </w:rPr>
-      </w:pPr>
-      <w:r>
-        <w:rPr>
-          <w:lang w:val="en-US"/>
-        </w:rPr>
-        <w:t>1. Creen un objeto de cada una de las clases que lo permitan. (a) ¿Cuántas clases hay? (b) ¿Cuántos objetos</w:t>
-      </w:r>
-      <w:r>
-        <w:rPr>
-          <w:lang w:val="en-US"/>
-        </w:rPr>
+      </w:pPr>
+      <w:r>
+        <w:t>1. Creen un objeto de cada una de las clases que lo permitan. (a) ¿Cuántas clases hay? (b) ¿Cuántos objetos crearon? (c) ¿Quién se crea de forma diferente? ¿Por qué?</w:t>
+      </w:r>
+    </w:p>
+    <w:p>
+      <w:pPr>
+        <w:spacing w:after="0"/>
+      </w:pPr>
+      <w:r>
+        <w:t>a) hay 4 clases</w:t>
+      </w:r>
+    </w:p>
+    <w:p>
+      <w:pPr>
+        <w:spacing w:after="0"/>
+      </w:pPr>
+      <w:r>
+        <w:t>b) hay 3 objetos</w:t>
+      </w:r>
+    </w:p>
+    <w:p>
+      <w:pPr>
+        <w:spacing w:after="0"/>
+      </w:pPr>
+      <w:r>
+        <w:t>c) el canvas porque es el “lienzo” donde se van a dibujar los demas conceptos</w:t>
+      </w:r>
+    </w:p>
+    <w:p>
+      <w:pPr>
+        <w:spacing w:after="0"/>
+      </w:pPr>
+    </w:p>
+    <w:p>
+      <w:pPr>
+        <w:spacing w:after="0"/>
+      </w:pPr>
+      <w:r>
+        <w:t>2. Inspeccionen los creadores de cada una de las clases. (a) ¿Cuál es la principal diferencia entre ellos? (b)¿Qué se busca con la clase que tiene el creador diferente?</w:t>
+      </w:r>
+    </w:p>
+    <w:p>
+      <w:pPr>
+        <w:spacing w:after="0"/>
+      </w:pPr>
+    </w:p>
+    <w:p>
+      <w:pPr>
+        <w:pStyle w:val="Prrafodelista"/>
+        <w:numPr>
+          <w:ilvl w:val="0"/>
+          <w:numId w:val="1"/>
+        </w:numPr>
+        <w:spacing w:after="0"/>
+      </w:pPr>
+      <w:r>
+        <w:t xml:space="preserve">Los métodos constructores de las formas normales son casi iguales pero comparado con el canvas el método constructor es static </w:t>
+      </w:r>
+    </w:p>
+    <w:p>
+      <w:pPr>
+        <w:pStyle w:val="Prrafodelista"/>
+        <w:numPr>
+          <w:ilvl w:val="0"/>
+          <w:numId w:val="1"/>
+        </w:numPr>
+        <w:spacing w:after="0"/>
+      </w:pPr>
+      <w:r>
+        <w:t xml:space="preserve">Esto se hace para que no se cree ningún otro canvas por que como nos damos cuenta el método estático revisa el atributo estático </w:t>
+      </w:r>
+      <w:r>
+        <w:t>private static Canvas canvasSingleton;</w:t>
+      </w:r>
+    </w:p>
+    <w:p>
+      <w:pPr>
+        <w:pStyle w:val="Prrafodelista"/>
+        <w:spacing w:after="0"/>
+      </w:pPr>
+      <w:r>
+        <w:t>Ese atributo sirve para saber que si ya existe un canvas</w:t>
+      </w:r>
+    </w:p>
+    <w:p>
+      <w:pPr>
+        <w:spacing w:after="0"/>
+      </w:pPr>
+    </w:p>
+    <w:p>
+      <w:pPr>
+        <w:spacing w:after="0"/>
+      </w:pPr>
+      <w:r>
+        <w:t>3. Inspeccionen el estado del objeto :Rectangle. (a) Capturen la pantalla.(b) ¿Cuál es el color inicial?</w:t>
+      </w:r>
+      <w:r>
         <w:t xml:space="preserve"> </w:t>
       </w:r>
-      <w:r>
-        <w:rPr>
-          <w:lang w:val="en-US"/>
-        </w:rPr>
-        <w:t>crearon? (c) ¿Quién se crea de forma diferente? ¿Por qué?</w:t>
-      </w:r>
-    </w:p>
-    <w:p>
-      <w:pPr>
-        <w:spacing w:after="0"/>
-        <w:rPr>
-          <w:lang w:val="en-US"/>
-        </w:rPr>
-      </w:pPr>
-      <w:r>
-        <w:rPr>
-          <w:lang w:val="en-US"/>
-        </w:rPr>
-        <w:t>a) hay 4 clases</w:t>
-      </w:r>
-    </w:p>
-    <w:p>
-      <w:pPr>
-        <w:spacing w:after="0"/>
-        <w:rPr>
-          <w:lang w:val="en-US"/>
-        </w:rPr>
-      </w:pPr>
-      <w:r>
-        <w:rPr>
-          <w:lang w:val="en-US"/>
-        </w:rPr>
-        <w:t>b) hay 3 objetos</w:t>
-      </w:r>
-    </w:p>
-    <w:p>
-      <w:pPr>
-        <w:spacing w:after="0"/>
-        <w:rPr>
-          <w:lang w:val="en-US"/>
-        </w:rPr>
-      </w:pPr>
-      <w:r>
-        <w:rPr>
-          <w:lang w:val="en-US"/>
-        </w:rPr>
-        <w:t>c) el canvas porque es el “lienzo” donde se van a dibujar los demas conceptos</w:t>
-      </w:r>
+    </w:p>
+    <w:p>
+      <w:pPr>
+        <w:spacing w:after="0"/>
+      </w:pPr>
+    </w:p>
+    <w:p>
+      <w:pPr>
+        <w:spacing w:after="0"/>
+      </w:pPr>
+    </w:p>
+    <w:p>
+      <w:pPr>
+        <w:spacing w:after="0"/>
+      </w:pPr>
+    </w:p>
+    <w:p>
+      <w:pPr>
+        <w:spacing w:after="0"/>
+      </w:pPr>
+      <w:r>
+        <w:lastRenderedPageBreak/>
+        <w:t xml:space="preserve">a) </w:t>
+      </w:r>
+    </w:p>
+    <w:p>
+      <w:pPr>
+        <w:spacing w:after="0"/>
+      </w:pPr>
+      <w:r>
+        <w:drawing>
+          <wp:inline distT="0" distB="0" distL="0" distR="0" wp14:anchorId="7A1C70E0" wp14:editId="51951396">
+            <wp:extent cx="5753903" cy="3705742"/>
+            <wp:effectExtent l="0" t="0" r="0" b="9525"/>
+            <wp:docPr id="199829428" name="Imagen 1" descr="Interfaz de usuario gráfica, Sitio web&#10;&#10;El contenido generado por IA puede ser incorrecto."/>
+            <wp:cNvGraphicFramePr>
+              <a:graphicFrameLocks xmlns:a="http://schemas.openxmlformats.org/drawingml/2006/main" noChangeAspect="1"/>
+            </wp:cNvGraphicFramePr>
+            <a:graphic xmlns:a="http://schemas.openxmlformats.org/drawingml/2006/main">
+              <a:graphicData uri="http://schemas.openxmlformats.org/drawingml/2006/picture">
+                <pic:pic xmlns:pic="http://schemas.openxmlformats.org/drawingml/2006/picture">
+                  <pic:nvPicPr>
+                    <pic:cNvPr id="199829428" name="Imagen 1" descr="Interfaz de usuario gráfica, Sitio web&#10;&#10;El contenido generado por IA puede ser incorrecto."/>
+                    <pic:cNvPicPr/>
+                  </pic:nvPicPr>
+                  <pic:blipFill>
+                    <a:blip r:embed="rId8"/>
+                    <a:stretch>
+                      <a:fillRect/>
+                    </a:stretch>
+                  </pic:blipFill>
+                  <pic:spPr>
+                    <a:xfrm>
+                      <a:off x="0" y="0"/>
+                      <a:ext cx="5753903" cy="3705742"/>
+                    </a:xfrm>
+                    <a:prstGeom prst="rect">
+                      <a:avLst/>
+                    </a:prstGeom>
+                  </pic:spPr>
+                </pic:pic>
+              </a:graphicData>
+            </a:graphic>
+          </wp:inline>
+        </w:drawing>
+      </w:r>
+    </w:p>
+    <w:p>
+      <w:pPr>
+        <w:spacing w:after="0"/>
+      </w:pPr>
+      <w:r>
+        <w:t>B) el color inicial es magenta</w:t>
+      </w:r>
+    </w:p>
+    <w:p>
+      <w:pPr>
+        <w:spacing w:after="0"/>
+      </w:pPr>
+    </w:p>
+    <w:p>
+      <w:pPr>
+        <w:spacing w:after="0"/>
+      </w:pPr>
+      <w:r>
+        <w:t>4. Inspeccionen el comportamiento que ofrece el objeto :Rectangle5. (a) Capturen la pantalla. (b) ¿Por qué</w:t>
+      </w:r>
+      <w:r>
+        <w:t xml:space="preserve"> </w:t>
+      </w:r>
+      <w:r>
+        <w:t>no aparecen todos los métodos que están en el código?</w:t>
+      </w:r>
+    </w:p>
+    <w:p>
+      <w:pPr>
+        <w:spacing w:after="0"/>
+      </w:pPr>
+      <w:r>
+        <w:t>a)</w:t>
+      </w:r>
+    </w:p>
+    <w:p>
+      <w:pPr>
+        <w:spacing w:after="0"/>
+      </w:pPr>
+      <w:r>
+        <w:drawing>
+          <wp:inline distT="0" distB="0" distL="0" distR="0" wp14:anchorId="7422D2D2" wp14:editId="273A9E1D">
+            <wp:extent cx="2348160" cy="3152775"/>
+            <wp:effectExtent l="0" t="0" r="0" b="0"/>
+            <wp:docPr id="1235461188" name="Imagen 1" descr="Interfaz de usuario gráfica, Texto, Aplicación&#10;&#10;El contenido generado por IA puede ser incorrecto."/>
+            <wp:cNvGraphicFramePr>
+              <a:graphicFrameLocks xmlns:a="http://schemas.openxmlformats.org/drawingml/2006/main" noChangeAspect="1"/>
+            </wp:cNvGraphicFramePr>
+            <a:graphic xmlns:a="http://schemas.openxmlformats.org/drawingml/2006/main">
+              <a:graphicData uri="http://schemas.openxmlformats.org/drawingml/2006/picture">
+                <pic:pic xmlns:pic="http://schemas.openxmlformats.org/drawingml/2006/picture">
+                  <pic:nvPicPr>
+                    <pic:cNvPr id="1235461188" name="Imagen 1" descr="Interfaz de usuario gráfica, Texto, Aplicación&#10;&#10;El contenido generado por IA puede ser incorrecto."/>
+                    <pic:cNvPicPr/>
+                  </pic:nvPicPr>
+                  <pic:blipFill>
+                    <a:blip r:embed="rId9"/>
+                    <a:stretch>
+                      <a:fillRect/>
+                    </a:stretch>
+                  </pic:blipFill>
+                  <pic:spPr>
+                    <a:xfrm>
+                      <a:off x="0" y="0"/>
+                      <a:ext cx="2351340" cy="3157044"/>
+                    </a:xfrm>
+                    <a:prstGeom prst="rect">
+                      <a:avLst/>
+                    </a:prstGeom>
+                  </pic:spPr>
+                </pic:pic>
+              </a:graphicData>
+            </a:graphic>
+          </wp:inline>
+        </w:drawing>
+      </w:r>
+    </w:p>
+    <w:p>
+      <w:pPr>
+        <w:spacing w:after="0"/>
+      </w:pPr>
+    </w:p>
+    <w:p>
+      <w:pPr>
+        <w:spacing w:after="0"/>
+      </w:pPr>
+      <w:r>
+        <w:lastRenderedPageBreak/>
+        <w:t>b)  porque unos métodos aparecen en privado por lo tanto el usuario no los puede usar</w:t>
+      </w:r>
+    </w:p>
+    <w:p>
+      <w:pPr>
+        <w:spacing w:after="0"/>
+      </w:pPr>
+    </w:p>
+    <w:p>
+      <w:pPr>
+        <w:spacing w:after="0"/>
+      </w:pPr>
+      <w:r>
+        <w:t>5. Construyan, con shapes sin escribir código, una propuesta de la imagen del logo de su videojuego favorito.</w:t>
+      </w:r>
+      <w:r>
+        <w:t xml:space="preserve"> </w:t>
+      </w:r>
+      <w:r>
+        <w:t>(a) ¿Cuántas y cuáles clases se necesitan? (b) ¿Cuántos objetos se usan en total? (c) Capturen la pantalla.(d) Incluyan el logo original</w:t>
+      </w:r>
+    </w:p>
+    <w:p>
+      <w:pPr>
+        <w:spacing w:after="0"/>
+      </w:pPr>
+    </w:p>
+    <w:p>
+      <w:pPr>
+        <w:spacing w:after="0"/>
+      </w:pPr>
+      <w:r>
+        <w:t>a) se necesitaron las 4 clases porque usamos circule,rectangule y triangule, además del canvas</w:t>
+      </w:r>
+    </w:p>
+    <w:p>
+      <w:pPr>
+        <w:spacing w:after="0"/>
+      </w:pPr>
+      <w:r>
+        <w:t>b)</w:t>
+      </w:r>
+      <w:r>
+        <w:t xml:space="preserve"> se necesitaron 16 objetos </w:t>
+      </w:r>
+    </w:p>
+    <w:p>
+      <w:pPr>
+        <w:spacing w:after="0"/>
+      </w:pPr>
+      <w:r>
+        <w:t>c)</w:t>
+      </w:r>
+      <w:r>
+        <w:rPr>
+          <w:noProof/>
+        </w:rPr>
+        <w:t xml:space="preserve"> </w:t>
+      </w:r>
+      <w:r>
+        <w:drawing>
+          <wp:inline distT="0" distB="0" distL="0" distR="0" wp14:anchorId="067F68FD" wp14:editId="7FC86AA6">
+            <wp:extent cx="5943600" cy="3170555"/>
+            <wp:effectExtent l="0" t="0" r="0" b="0"/>
+            <wp:docPr id="1844853267" name="Imagen 1" descr="Interfaz de usuario gráfica, Aplicación&#10;&#10;El contenido generado por IA puede ser incorrecto."/>
+            <wp:cNvGraphicFramePr>
+              <a:graphicFrameLocks xmlns:a="http://schemas.openxmlformats.org/drawingml/2006/main" noChangeAspect="1"/>
+            </wp:cNvGraphicFramePr>
+            <a:graphic xmlns:a="http://schemas.openxmlformats.org/drawingml/2006/main">
+              <a:graphicData uri="http://schemas.openxmlformats.org/drawingml/2006/picture">
+                <pic:pic xmlns:pic="http://schemas.openxmlformats.org/drawingml/2006/picture">
+                  <pic:nvPicPr>
+                    <pic:cNvPr id="1844853267" name="Imagen 1" descr="Interfaz de usuario gráfica, Aplicación&#10;&#10;El contenido generado por IA puede ser incorrecto."/>
+                    <pic:cNvPicPr/>
+                  </pic:nvPicPr>
+                  <pic:blipFill>
+                    <a:blip r:embed="rId10"/>
+                    <a:stretch>
+                      <a:fillRect/>
+                    </a:stretch>
+                  </pic:blipFill>
+                  <pic:spPr>
+                    <a:xfrm>
+                      <a:off x="0" y="0"/>
+                      <a:ext cx="5943600" cy="3170555"/>
+                    </a:xfrm>
+                    <a:prstGeom prst="rect">
+                      <a:avLst/>
+                    </a:prstGeom>
+                  </pic:spPr>
+                </pic:pic>
+              </a:graphicData>
+            </a:graphic>
+          </wp:inline>
+        </w:drawing>
+      </w:r>
+    </w:p>
+    <w:p>
+      <w:pPr>
+        <w:spacing w:after="0"/>
+      </w:pPr>
+      <w:r>
+        <w:t>d)</w:t>
+      </w:r>
+    </w:p>
+    <w:p>
+      <w:pPr>
+        <w:spacing w:after="0"/>
+        <w:rPr>
+          <w:u w:val="single"/>
+        </w:rPr>
+      </w:pPr>
+      <w:r>
+        <w:rPr>
+          <w:noProof/>
+        </w:rPr>
+        <w:drawing>
+          <wp:inline distT="0" distB="0" distL="0" distR="0" wp14:anchorId="349F1CF6" wp14:editId="54C8915C">
+            <wp:extent cx="2438400" cy="2438400"/>
+            <wp:effectExtent l="0" t="0" r="0" b="0"/>
+            <wp:docPr id="32142181" name="Imagen 1" descr="Icon for God of War by Greez"/>
+            <wp:cNvGraphicFramePr>
+              <a:graphicFrameLocks xmlns:a="http://schemas.openxmlformats.org/drawingml/2006/main" noChangeAspect="1"/>
+            </wp:cNvGraphicFramePr>
+            <a:graphic xmlns:a="http://schemas.openxmlformats.org/drawingml/2006/main">
+              <a:graphicData uri="http://schemas.openxmlformats.org/drawingml/2006/picture">
+                <pic:pic xmlns:pic="http://schemas.openxmlformats.org/drawingml/2006/picture">
+                  <pic:nvPicPr>
+                    <pic:cNvPr id="0" name="Picture 1" descr="Icon for God of War by Greez"/>
+                    <pic:cNvPicPr>
+                      <a:picLocks noChangeAspect="1" noChangeArrowheads="1"/>
+                    </pic:cNvPicPr>
+                  </pic:nvPicPr>
+                  <pic:blipFill>
+                    <a:blip r:embed="rId11">
+                      <a:extLst>
+                        <a:ext uri="{28A0092B-C50C-407E-A947-70E740481C1C}">
+                          <a14:useLocalDpi xmlns:a14="http://schemas.microsoft.com/office/drawing/2010/main" val="0"/>
+                        </a:ext>
+                      </a:extLst>
+                    </a:blip>
+                    <a:srcRect/>
+                    <a:stretch>
+                      <a:fillRect/>
+                    </a:stretch>
+                  </pic:blipFill>
+                  <pic:spPr bwMode="auto">
+                    <a:xfrm>
+                      <a:off x="0" y="0"/>
+                      <a:ext cx="2438400" cy="2438400"/>
+                    </a:xfrm>
+                    <a:prstGeom prst="rect">
+                      <a:avLst/>
+                    </a:prstGeom>
+                    <a:noFill/>
+                    <a:ln>
+                      <a:noFill/>
+                    </a:ln>
+                  </pic:spPr>
+                </pic:pic>
+              </a:graphicData>
+            </a:graphic>
+          </wp:inline>
+        </w:drawing>
+      </w:r>
+    </w:p>
+    <w:p>
+      <w:pPr>
+        <w:spacing w:after="0"/>
+      </w:pPr>
     </w:p>
     <w:sectPr>
       <w:pgSz w:w="12240" w:h="15840"/>
@@ -985,6 +1298,103 @@
     </w:sectPr>
   </w:body>
 </w:document>
+</file>
+
+<file path=word/numbering.xml><?xml version="1.0" encoding="utf-8"?>
+<w:numbering xmlns:wpc="http://schemas.microsoft.com/office/word/2010/wordprocessingCanvas" xmlns:cx="http://schemas.microsoft.com/office/drawing/2014/chartex" xmlns:cx1="http://schemas.microsoft.com/office/drawing/2015/9/8/chartex" xmlns:cx2="http://schemas.microsoft.com/office/drawing/2015/10/21/chartex" xmlns:cx3="http://schemas.microsoft.com/office/drawing/2016/5/9/chartex" xmlns:cx4="http://schemas.microsoft.com/office/drawing/2016/5/10/chartex" xmlns:cx5="http://schemas.microsoft.com/office/drawing/2016/5/11/chartex" xmlns:cx6="http://schemas.microsoft.com/office/drawing/2016/5/12/chartex" xmlns:cx7="http://schemas.microsoft.com/office/drawing/2016/5/13/chartex" xmlns:cx8="http://schemas.microsoft.com/office/drawing/2016/5/14/chartex" xmlns:mc="http://schemas.openxmlformats.org/markup-compatibility/2006" xmlns:aink="http://schemas.microsoft.com/office/drawing/2016/ink" xmlns:am3d="http://schemas.microsoft.com/office/drawing/2017/model3d" xmlns:o="urn:schemas-microsoft-com:office:office" xmlns:oel="http://schemas.microsoft.com/office/2019/extlst" xmlns:r="http://schemas.openxmlformats.org/officeDocument/2006/relationships" xmlns:m="http://schemas.openxmlformats.org/officeDocument/2006/math" xmlns:v="urn:schemas-microsoft-com:vml" xmlns:wp14="http://schemas.microsoft.com/office/word/2010/wordprocessingDrawing" xmlns:wp="http://schemas.openxmlformats.org/drawingml/2006/wordprocessingDrawing" xmlns:w10="urn:schemas-microsoft-com:office:word" xmlns:w="http://schemas.openxmlformats.org/wordprocessingml/2006/main" xmlns:w14="http://schemas.microsoft.com/office/word/2010/wordml" xmlns:w15="http://schemas.microsoft.com/office/word/2012/wordml" xmlns:w16cex="http://schemas.microsoft.com/office/word/2018/wordml/cex" xmlns:w16cid="http://schemas.microsoft.com/office/word/2016/wordml/cid" xmlns:w16="http://schemas.microsoft.com/office/word/2018/wordml" xmlns:w16du="http://schemas.microsoft.com/office/word/2023/wordml/word16du" xmlns:w16sdtdh="http://schemas.microsoft.com/office/word/2020/wordml/sdtdatahash" xmlns:w16sdtfl="http://schemas.microsoft.com/office/word/2024/wordml/sdtformatlock" xmlns:w16se="http://schemas.microsoft.com/office/word/2015/wordml/symex" xmlns:wpg="http://schemas.microsoft.com/office/word/2010/wordprocessingGroup" xmlns:wpi="http://schemas.microsoft.com/office/word/2010/wordprocessingInk" xmlns:wne="http://schemas.microsoft.com/office/word/2006/wordml" xmlns:wps="http://schemas.microsoft.com/office/word/2010/wordprocessingShape" mc:Ignorable="w14 w15 w16se w16cid w16 w16cex w16sdtdh w16sdtfl w16du wp14">
+  <w:abstractNum w:abstractNumId="0" w15:restartNumberingAfterBreak="0">
+    <w:nsid w:val="4FFC40AA"/>
+    <w:multiLevelType w:val="hybridMultilevel"/>
+    <w:tmpl w:val="6E2ADBA8"/>
+    <w:lvl w:ilvl="0" w:tplc="240A0017">
+      <w:start w:val="1"/>
+      <w:numFmt w:val="lowerLetter"/>
+      <w:lvlText w:val="%1)"/>
+      <w:lvlJc w:val="left"/>
+      <w:pPr>
+        <w:ind w:left="720" w:hanging="360"/>
+      </w:pPr>
+      <w:rPr>
+        <w:rFonts w:hint="default"/>
+      </w:rPr>
+    </w:lvl>
+    <w:lvl w:ilvl="1" w:tplc="240A0019" w:tentative="1">
+      <w:start w:val="1"/>
+      <w:numFmt w:val="lowerLetter"/>
+      <w:lvlText w:val="%2."/>
+      <w:lvlJc w:val="left"/>
+      <w:pPr>
+        <w:ind w:left="1440" w:hanging="360"/>
+      </w:pPr>
+    </w:lvl>
+    <w:lvl w:ilvl="2" w:tplc="240A001B" w:tentative="1">
+      <w:start w:val="1"/>
+      <w:numFmt w:val="lowerRoman"/>
+      <w:lvlText w:val="%3."/>
+      <w:lvlJc w:val="right"/>
+      <w:pPr>
+        <w:ind w:left="2160" w:hanging="180"/>
+      </w:pPr>
+    </w:lvl>
+    <w:lvl w:ilvl="3" w:tplc="240A000F" w:tentative="1">
+      <w:start w:val="1"/>
+      <w:numFmt w:val="decimal"/>
+      <w:lvlText w:val="%4."/>
+      <w:lvlJc w:val="left"/>
+      <w:pPr>
+        <w:ind w:left="2880" w:hanging="360"/>
+      </w:pPr>
+    </w:lvl>
+    <w:lvl w:ilvl="4" w:tplc="240A0019" w:tentative="1">
+      <w:start w:val="1"/>
+      <w:numFmt w:val="lowerLetter"/>
+      <w:lvlText w:val="%5."/>
+      <w:lvlJc w:val="left"/>
+      <w:pPr>
+        <w:ind w:left="3600" w:hanging="360"/>
+      </w:pPr>
+    </w:lvl>
+    <w:lvl w:ilvl="5" w:tplc="240A001B" w:tentative="1">
+      <w:start w:val="1"/>
+      <w:numFmt w:val="lowerRoman"/>
+      <w:lvlText w:val="%6."/>
+      <w:lvlJc w:val="right"/>
+      <w:pPr>
+        <w:ind w:left="4320" w:hanging="180"/>
+      </w:pPr>
+    </w:lvl>
+    <w:lvl w:ilvl="6" w:tplc="240A000F" w:tentative="1">
+      <w:start w:val="1"/>
+      <w:numFmt w:val="decimal"/>
+      <w:lvlText w:val="%7."/>
+      <w:lvlJc w:val="left"/>
+      <w:pPr>
+        <w:ind w:left="5040" w:hanging="360"/>
+      </w:pPr>
+    </w:lvl>
+    <w:lvl w:ilvl="7" w:tplc="240A0019" w:tentative="1">
+      <w:start w:val="1"/>
+      <w:numFmt w:val="lowerLetter"/>
+      <w:lvlText w:val="%8."/>
+      <w:lvlJc w:val="left"/>
+      <w:pPr>
+        <w:ind w:left="5760" w:hanging="360"/>
+      </w:pPr>
+    </w:lvl>
+    <w:lvl w:ilvl="8" w:tplc="240A001B" w:tentative="1">
+      <w:start w:val="1"/>
+      <w:numFmt w:val="lowerRoman"/>
+      <w:lvlText w:val="%9."/>
+      <w:lvlJc w:val="right"/>
+      <w:pPr>
+        <w:ind w:left="6480" w:hanging="180"/>
+      </w:pPr>
+    </w:lvl>
+  </w:abstractNum>
+  <w:num w:numId="1" w16cid:durableId="929850912">
+    <w:abstractNumId w:val="0"/>
+  </w:num>
+</w:numbering>
 </file>
 
 <file path=word/styles.xml><?xml version="1.0" encoding="utf-8"?>

</xml_diff>

<commit_message>
subo el shapes con los cambios en rectangle y agrego parte D del laboratorio
</commit_message>
<xml_diff>
--- a/laboratorio 1/Laboratorio 1.docx
+++ b/laboratorio 1/Laboratorio 1.docx
@@ -1,6 +1,6 @@
 
 <file path=word/document.xml><?xml version="1.0" encoding="utf-8"?>
-<w:document xmlns:wpc="http://schemas.microsoft.com/office/word/2010/wordprocessingCanvas" xmlns:cx="http://schemas.microsoft.com/office/drawing/2014/chartex" xmlns:cx1="http://schemas.microsoft.com/office/drawing/2015/9/8/chartex" xmlns:cx2="http://schemas.microsoft.com/office/drawing/2015/10/21/chartex" xmlns:cx3="http://schemas.microsoft.com/office/drawing/2016/5/9/chartex" xmlns:cx4="http://schemas.microsoft.com/office/drawing/2016/5/10/chartex" xmlns:cx5="http://schemas.microsoft.com/office/drawing/2016/5/11/chartex" xmlns:cx6="http://schemas.microsoft.com/office/drawing/2016/5/12/chartex" xmlns:cx7="http://schemas.microsoft.com/office/drawing/2016/5/13/chartex" xmlns:cx8="http://schemas.microsoft.com/office/drawing/2016/5/14/chartex" xmlns:mc="http://schemas.openxmlformats.org/markup-compatibility/2006" xmlns:aink="http://schemas.microsoft.com/office/drawing/2016/ink" xmlns:am3d="http://schemas.microsoft.com/office/drawing/2017/model3d" xmlns:o="urn:schemas-microsoft-com:office:office" xmlns:oel="http://schemas.microsoft.com/office/2019/extlst" xmlns:r="http://schemas.openxmlformats.org/officeDocument/2006/relationships" xmlns:m="http://schemas.openxmlformats.org/officeDocument/2006/math" xmlns:v="urn:schemas-microsoft-com:vml" xmlns:wp14="http://schemas.microsoft.com/office/word/2010/wordprocessingDrawing" xmlns:wp="http://schemas.openxmlformats.org/drawingml/2006/wordprocessingDrawing" xmlns:w10="urn:schemas-microsoft-com:office:word" xmlns:w="http://schemas.openxmlformats.org/wordprocessingml/2006/main" xmlns:w14="http://schemas.microsoft.com/office/word/2010/wordml" xmlns:w15="http://schemas.microsoft.com/office/word/2012/wordml" xmlns:w16cex="http://schemas.microsoft.com/office/word/2018/wordml/cex" xmlns:w16cid="http://schemas.microsoft.com/office/word/2016/wordml/cid" xmlns:w16="http://schemas.microsoft.com/office/word/2018/wordml" xmlns:w16du="http://schemas.microsoft.com/office/word/2023/wordml/word16du" xmlns:w16sdtdh="http://schemas.microsoft.com/office/word/2020/wordml/sdtdatahash" xmlns:w16sdtfl="http://schemas.microsoft.com/office/word/2024/wordml/sdtformatlock" xmlns:w16se="http://schemas.microsoft.com/office/word/2015/wordml/symex" xmlns:wpg="http://schemas.microsoft.com/office/word/2010/wordprocessingGroup" xmlns:wpi="http://schemas.microsoft.com/office/word/2010/wordprocessingInk" xmlns:wne="http://schemas.microsoft.com/office/word/2006/wordml" xmlns:wps="http://schemas.microsoft.com/office/word/2010/wordprocessingShape" mc:Ignorable="w14 w15 w16se w16cid w16 w16cex w16sdtdh w16sdtfl w16du wp14">
+<w:document xmlns:wpc="http://schemas.microsoft.com/office/word/2010/wordprocessingCanvas" xmlns:cx="http://schemas.microsoft.com/office/drawing/2014/chartex" xmlns:cx1="http://schemas.microsoft.com/office/drawing/2015/9/8/chartex" xmlns:cx2="http://schemas.microsoft.com/office/drawing/2015/10/21/chartex" xmlns:cx3="http://schemas.microsoft.com/office/drawing/2016/5/9/chartex" xmlns:cx4="http://schemas.microsoft.com/office/drawing/2016/5/10/chartex" xmlns:cx5="http://schemas.microsoft.com/office/drawing/2016/5/11/chartex" xmlns:cx6="http://schemas.microsoft.com/office/drawing/2016/5/12/chartex" xmlns:cx7="http://schemas.microsoft.com/office/drawing/2016/5/13/chartex" xmlns:cx8="http://schemas.microsoft.com/office/drawing/2016/5/14/chartex" xmlns:mc="http://schemas.openxmlformats.org/markup-compatibility/2006" xmlns:aink="http://schemas.microsoft.com/office/drawing/2016/ink" xmlns:am3d="http://schemas.microsoft.com/office/drawing/2017/model3d" xmlns:o="urn:schemas-microsoft-com:office:office" xmlns:r="http://schemas.openxmlformats.org/officeDocument/2006/relationships" xmlns:m="http://schemas.openxmlformats.org/officeDocument/2006/math" xmlns:v="urn:schemas-microsoft-com:vml" xmlns:wp14="http://schemas.microsoft.com/office/word/2010/wordprocessingDrawing" xmlns:wp="http://schemas.openxmlformats.org/drawingml/2006/wordprocessingDrawing" xmlns:w10="urn:schemas-microsoft-com:office:word" xmlns:w="http://schemas.openxmlformats.org/wordprocessingml/2006/main" xmlns:w14="http://schemas.microsoft.com/office/word/2010/wordml" xmlns:w15="http://schemas.microsoft.com/office/word/2012/wordml" xmlns:w16cid="http://schemas.microsoft.com/office/word/2016/wordml/cid" xmlns:w16se="http://schemas.microsoft.com/office/word/2015/wordml/symex" xmlns:wpg="http://schemas.microsoft.com/office/word/2010/wordprocessingGroup" xmlns:wpi="http://schemas.microsoft.com/office/word/2010/wordprocessingInk" xmlns:wne="http://schemas.microsoft.com/office/word/2006/wordml" xmlns:wps="http://schemas.microsoft.com/office/word/2010/wordprocessingShape" mc:Ignorable="w14 w15 w16se w16cid wp14">
   <w:body>
     <w:p>
       <w:r>
@@ -67,7 +67,7 @@
                     <pic:cNvPicPr/>
                   </pic:nvPicPr>
                   <pic:blipFill>
-                    <a:blip r:embed="rId5"/>
+                    <a:blip r:embed="rId6"/>
                     <a:stretch>
                       <a:fillRect/>
                     </a:stretch>
@@ -207,11 +207,7 @@
       </w:r>
       <w:proofErr w:type="spellStart"/>
       <w:r>
-        <w:t xml:space="preserve">de </w:t>
-      </w:r>
-      <w:proofErr w:type="gramStart"/>
-      <w:r>
-        <w:t>el</w:t>
+        <w:t>de el</w:t>
       </w:r>
       <w:proofErr w:type="spellEnd"/>
       <w:r>
@@ -222,7 +218,6 @@
         <w:t>canvas</w:t>
       </w:r>
       <w:proofErr w:type="spellEnd"/>
-      <w:proofErr w:type="gramEnd"/>
     </w:p>
     <w:p/>
     <w:p>
@@ -569,7 +564,7 @@
                     <pic:cNvPicPr/>
                   </pic:nvPicPr>
                   <pic:blipFill rotWithShape="1">
-                    <a:blip r:embed="rId6"/>
+                    <a:blip r:embed="rId7"/>
                     <a:srcRect l="1933" t="3914" r="43576" b="1463"/>
                     <a:stretch>
                       <a:fillRect/>
@@ -624,7 +619,7 @@
                     <pic:cNvPicPr/>
                   </pic:nvPicPr>
                   <pic:blipFill>
-                    <a:blip r:embed="rId7"/>
+                    <a:blip r:embed="rId8"/>
                     <a:stretch>
                       <a:fillRect/>
                     </a:stretch>
@@ -1074,11 +1069,94 @@
         <w:t xml:space="preserve">, int </w:t>
       </w:r>
       <w:proofErr w:type="spellStart"/>
+      <w:r>
+        <w:rPr>
+          <w:lang w:val="en-US"/>
+        </w:rPr>
+        <w:t>newWidth</w:t>
+      </w:r>
+      <w:proofErr w:type="spellEnd"/>
+      <w:r>
+        <w:rPr>
+          <w:lang w:val="en-US"/>
+        </w:rPr>
+        <w:t>) {</w:t>
+      </w:r>
+    </w:p>
+    <w:p>
+      <w:pPr>
+        <w:spacing w:after="0"/>
+        <w:rPr>
+          <w:lang w:val="en-US"/>
+        </w:rPr>
+      </w:pPr>
+      <w:r>
+        <w:rPr>
+          <w:lang w:val="en-US"/>
+        </w:rPr>
+        <w:t xml:space="preserve">        </w:t>
+      </w:r>
       <w:proofErr w:type="gramStart"/>
       <w:r>
         <w:rPr>
           <w:lang w:val="en-US"/>
         </w:rPr>
+        <w:t>erase(</w:t>
+      </w:r>
+      <w:proofErr w:type="gramEnd"/>
+      <w:r>
+        <w:rPr>
+          <w:lang w:val="en-US"/>
+        </w:rPr>
+        <w:t>);</w:t>
+      </w:r>
+    </w:p>
+    <w:p>
+      <w:pPr>
+        <w:spacing w:after="0"/>
+        <w:rPr>
+          <w:lang w:val="en-US"/>
+        </w:rPr>
+      </w:pPr>
+      <w:r>
+        <w:rPr>
+          <w:lang w:val="en-US"/>
+        </w:rPr>
+        <w:t xml:space="preserve">        height = </w:t>
+      </w:r>
+      <w:proofErr w:type="spellStart"/>
+      <w:r>
+        <w:rPr>
+          <w:lang w:val="en-US"/>
+        </w:rPr>
+        <w:t>newHeight</w:t>
+      </w:r>
+      <w:proofErr w:type="spellEnd"/>
+      <w:r>
+        <w:rPr>
+          <w:lang w:val="en-US"/>
+        </w:rPr>
+        <w:t>;</w:t>
+      </w:r>
+    </w:p>
+    <w:p>
+      <w:pPr>
+        <w:spacing w:after="0"/>
+        <w:rPr>
+          <w:lang w:val="en-US"/>
+        </w:rPr>
+      </w:pPr>
+      <w:r>
+        <w:rPr>
+          <w:lang w:val="en-US"/>
+        </w:rPr>
+        <w:t xml:space="preserve">        width = </w:t>
+      </w:r>
+      <w:proofErr w:type="spellStart"/>
+      <w:r>
+        <w:rPr>
+          <w:lang w:val="en-US"/>
+        </w:rPr>
         <w:t>newWidth</w:t>
       </w:r>
       <w:proofErr w:type="spellEnd"/>
@@ -1086,31 +1164,174 @@
         <w:rPr>
           <w:lang w:val="en-US"/>
         </w:rPr>
+        <w:t>;</w:t>
+      </w:r>
+    </w:p>
+    <w:p>
+      <w:pPr>
+        <w:spacing w:after="0"/>
+        <w:rPr>
+          <w:lang w:val="en-US"/>
+        </w:rPr>
+      </w:pPr>
+      <w:r>
+        <w:rPr>
+          <w:lang w:val="en-US"/>
+        </w:rPr>
+        <w:t xml:space="preserve">        </w:t>
+      </w:r>
+      <w:proofErr w:type="gramStart"/>
+      <w:r>
+        <w:rPr>
+          <w:lang w:val="en-US"/>
+        </w:rPr>
+        <w:t>draw(</w:t>
+      </w:r>
+      <w:proofErr w:type="gramEnd"/>
+      <w:r>
+        <w:rPr>
+          <w:lang w:val="en-US"/>
+        </w:rPr>
+        <w:t>);</w:t>
+      </w:r>
+    </w:p>
+    <w:p>
+      <w:pPr>
+        <w:spacing w:after="0"/>
+        <w:rPr>
+          <w:lang w:val="en-US"/>
+        </w:rPr>
+      </w:pPr>
+      <w:r>
+        <w:rPr>
+          <w:lang w:val="en-US"/>
+        </w:rPr>
+        <w:t xml:space="preserve">    }</w:t>
+      </w:r>
+    </w:p>
+    <w:p>
+      <w:pPr>
+        <w:spacing w:after="0"/>
+        <w:rPr>
+          <w:lang w:val="en-US"/>
+        </w:rPr>
+      </w:pPr>
+      <w:r>
+        <w:rPr>
+          <w:lang w:val="en-US"/>
+        </w:rPr>
+        <w:t>NUEVO:</w:t>
+      </w:r>
+    </w:p>
+    <w:p>
+      <w:pPr>
+        <w:spacing w:after="0"/>
+        <w:rPr>
+          <w:lang w:val="en-US"/>
+        </w:rPr>
+      </w:pPr>
+      <w:r>
+        <w:rPr>
+          <w:lang w:val="en-US"/>
+        </w:rPr>
+        <w:t xml:space="preserve">public void </w:t>
+      </w:r>
+      <w:proofErr w:type="spellStart"/>
+      <w:proofErr w:type="gramStart"/>
+      <w:r>
+        <w:rPr>
+          <w:lang w:val="en-US"/>
+        </w:rPr>
+        <w:t>changeSize</w:t>
+      </w:r>
+      <w:proofErr w:type="spellEnd"/>
+      <w:r>
+        <w:rPr>
+          <w:lang w:val="en-US"/>
+        </w:rPr>
+        <w:t>(</w:t>
+      </w:r>
+      <w:proofErr w:type="gramEnd"/>
+      <w:r>
+        <w:rPr>
+          <w:lang w:val="en-US"/>
+        </w:rPr>
+        <w:t>double</w:t>
+      </w:r>
+      <w:r>
+        <w:rPr>
+          <w:lang w:val="en-US"/>
+        </w:rPr>
+        <w:t xml:space="preserve"> </w:t>
+      </w:r>
+      <w:proofErr w:type="spellStart"/>
+      <w:r>
+        <w:rPr>
+          <w:lang w:val="en-US"/>
+        </w:rPr>
+        <w:t>newHeight</w:t>
+      </w:r>
+      <w:proofErr w:type="spellEnd"/>
+      <w:r>
+        <w:rPr>
+          <w:lang w:val="en-US"/>
+        </w:rPr>
+        <w:t xml:space="preserve">, </w:t>
+      </w:r>
+      <w:r>
+        <w:rPr>
+          <w:lang w:val="en-US"/>
+        </w:rPr>
+        <w:t>double</w:t>
+      </w:r>
+      <w:r>
+        <w:rPr>
+          <w:lang w:val="en-US"/>
+        </w:rPr>
+        <w:t xml:space="preserve"> </w:t>
+      </w:r>
+      <w:proofErr w:type="spellStart"/>
+      <w:r>
+        <w:rPr>
+          <w:lang w:val="en-US"/>
+        </w:rPr>
+        <w:t>newWidth</w:t>
+      </w:r>
+      <w:proofErr w:type="spellEnd"/>
+      <w:r>
+        <w:rPr>
+          <w:lang w:val="en-US"/>
+        </w:rPr>
         <w:t>) {</w:t>
       </w:r>
+    </w:p>
+    <w:p>
+      <w:pPr>
+        <w:spacing w:after="0"/>
+        <w:rPr>
+          <w:lang w:val="en-US"/>
+        </w:rPr>
+      </w:pPr>
+      <w:r>
+        <w:rPr>
+          <w:lang w:val="en-US"/>
+        </w:rPr>
+        <w:t xml:space="preserve">        </w:t>
+      </w:r>
+      <w:proofErr w:type="gramStart"/>
+      <w:r>
+        <w:rPr>
+          <w:lang w:val="en-US"/>
+        </w:rPr>
+        <w:t>erase(</w:t>
+      </w:r>
       <w:proofErr w:type="gramEnd"/>
-    </w:p>
-    <w:p>
-      <w:pPr>
-        <w:spacing w:after="0"/>
-        <w:rPr>
-          <w:lang w:val="en-US"/>
-        </w:rPr>
-      </w:pPr>
-      <w:r>
-        <w:rPr>
-          <w:lang w:val="en-US"/>
-        </w:rPr>
-        <w:t xml:space="preserve">        </w:t>
-      </w:r>
-      <w:proofErr w:type="gramStart"/>
-      <w:r>
-        <w:rPr>
-          <w:lang w:val="en-US"/>
-        </w:rPr>
-        <w:t>erase();</w:t>
-      </w:r>
-      <w:proofErr w:type="gramEnd"/>
+      <w:r>
+        <w:rPr>
+          <w:lang w:val="en-US"/>
+        </w:rPr>
+        <w:t>);</w:t>
+      </w:r>
     </w:p>
     <w:p>
       <w:pPr>
@@ -1126,7 +1347,6 @@
         <w:t xml:space="preserve">        height = </w:t>
       </w:r>
       <w:proofErr w:type="spellStart"/>
-      <w:proofErr w:type="gramStart"/>
       <w:r>
         <w:rPr>
           <w:lang w:val="en-US"/>
@@ -1140,7 +1360,6 @@
         </w:rPr>
         <w:t>;</w:t>
       </w:r>
-      <w:proofErr w:type="gramEnd"/>
     </w:p>
     <w:p>
       <w:pPr>
@@ -1156,7 +1375,6 @@
         <w:t xml:space="preserve">        width = </w:t>
       </w:r>
       <w:proofErr w:type="spellStart"/>
-      <w:proofErr w:type="gramStart"/>
       <w:r>
         <w:rPr>
           <w:lang w:val="en-US"/>
@@ -1170,221 +1388,6 @@
         </w:rPr>
         <w:t>;</w:t>
       </w:r>
-      <w:proofErr w:type="gramEnd"/>
-    </w:p>
-    <w:p>
-      <w:pPr>
-        <w:spacing w:after="0"/>
-        <w:rPr>
-          <w:lang w:val="en-US"/>
-        </w:rPr>
-      </w:pPr>
-      <w:r>
-        <w:rPr>
-          <w:lang w:val="en-US"/>
-        </w:rPr>
-        <w:t xml:space="preserve">        </w:t>
-      </w:r>
-      <w:proofErr w:type="gramStart"/>
-      <w:r>
-        <w:rPr>
-          <w:lang w:val="en-US"/>
-        </w:rPr>
-        <w:t>draw();</w:t>
-      </w:r>
-      <w:proofErr w:type="gramEnd"/>
-    </w:p>
-    <w:p>
-      <w:pPr>
-        <w:spacing w:after="0"/>
-        <w:rPr>
-          <w:lang w:val="en-US"/>
-        </w:rPr>
-      </w:pPr>
-      <w:r>
-        <w:rPr>
-          <w:lang w:val="en-US"/>
-        </w:rPr>
-        <w:t xml:space="preserve">    }</w:t>
-      </w:r>
-    </w:p>
-    <w:p>
-      <w:pPr>
-        <w:spacing w:after="0"/>
-        <w:rPr>
-          <w:lang w:val="en-US"/>
-        </w:rPr>
-      </w:pPr>
-      <w:r>
-        <w:rPr>
-          <w:lang w:val="en-US"/>
-        </w:rPr>
-        <w:t>NUEVO:</w:t>
-      </w:r>
-    </w:p>
-    <w:p>
-      <w:pPr>
-        <w:spacing w:after="0"/>
-        <w:rPr>
-          <w:lang w:val="en-US"/>
-        </w:rPr>
-      </w:pPr>
-      <w:r>
-        <w:rPr>
-          <w:lang w:val="en-US"/>
-        </w:rPr>
-        <w:t xml:space="preserve">public void </w:t>
-      </w:r>
-      <w:proofErr w:type="spellStart"/>
-      <w:proofErr w:type="gramStart"/>
-      <w:r>
-        <w:rPr>
-          <w:lang w:val="en-US"/>
-        </w:rPr>
-        <w:t>changeSize</w:t>
-      </w:r>
-      <w:proofErr w:type="spellEnd"/>
-      <w:r>
-        <w:rPr>
-          <w:lang w:val="en-US"/>
-        </w:rPr>
-        <w:t>(</w:t>
-      </w:r>
-      <w:proofErr w:type="gramEnd"/>
-      <w:r>
-        <w:rPr>
-          <w:lang w:val="en-US"/>
-        </w:rPr>
-        <w:t>double</w:t>
-      </w:r>
-      <w:r>
-        <w:rPr>
-          <w:lang w:val="en-US"/>
-        </w:rPr>
-        <w:t xml:space="preserve"> </w:t>
-      </w:r>
-      <w:proofErr w:type="spellStart"/>
-      <w:r>
-        <w:rPr>
-          <w:lang w:val="en-US"/>
-        </w:rPr>
-        <w:t>newHeight</w:t>
-      </w:r>
-      <w:proofErr w:type="spellEnd"/>
-      <w:r>
-        <w:rPr>
-          <w:lang w:val="en-US"/>
-        </w:rPr>
-        <w:t xml:space="preserve">, </w:t>
-      </w:r>
-      <w:r>
-        <w:rPr>
-          <w:lang w:val="en-US"/>
-        </w:rPr>
-        <w:t>double</w:t>
-      </w:r>
-      <w:r>
-        <w:rPr>
-          <w:lang w:val="en-US"/>
-        </w:rPr>
-        <w:t xml:space="preserve"> </w:t>
-      </w:r>
-      <w:proofErr w:type="spellStart"/>
-      <w:r>
-        <w:rPr>
-          <w:lang w:val="en-US"/>
-        </w:rPr>
-        <w:t>newWidth</w:t>
-      </w:r>
-      <w:proofErr w:type="spellEnd"/>
-      <w:r>
-        <w:rPr>
-          <w:lang w:val="en-US"/>
-        </w:rPr>
-        <w:t>) {</w:t>
-      </w:r>
-    </w:p>
-    <w:p>
-      <w:pPr>
-        <w:spacing w:after="0"/>
-        <w:rPr>
-          <w:lang w:val="en-US"/>
-        </w:rPr>
-      </w:pPr>
-      <w:r>
-        <w:rPr>
-          <w:lang w:val="en-US"/>
-        </w:rPr>
-        <w:t xml:space="preserve">        </w:t>
-      </w:r>
-      <w:proofErr w:type="gramStart"/>
-      <w:r>
-        <w:rPr>
-          <w:lang w:val="en-US"/>
-        </w:rPr>
-        <w:t>erase();</w:t>
-      </w:r>
-      <w:proofErr w:type="gramEnd"/>
-    </w:p>
-    <w:p>
-      <w:pPr>
-        <w:spacing w:after="0"/>
-        <w:rPr>
-          <w:lang w:val="en-US"/>
-        </w:rPr>
-      </w:pPr>
-      <w:r>
-        <w:rPr>
-          <w:lang w:val="en-US"/>
-        </w:rPr>
-        <w:t xml:space="preserve">        height = </w:t>
-      </w:r>
-      <w:proofErr w:type="spellStart"/>
-      <w:proofErr w:type="gramStart"/>
-      <w:r>
-        <w:rPr>
-          <w:lang w:val="en-US"/>
-        </w:rPr>
-        <w:t>newHeight</w:t>
-      </w:r>
-      <w:proofErr w:type="spellEnd"/>
-      <w:r>
-        <w:rPr>
-          <w:lang w:val="en-US"/>
-        </w:rPr>
-        <w:t>;</w:t>
-      </w:r>
-      <w:proofErr w:type="gramEnd"/>
-    </w:p>
-    <w:p>
-      <w:pPr>
-        <w:spacing w:after="0"/>
-        <w:rPr>
-          <w:lang w:val="en-US"/>
-        </w:rPr>
-      </w:pPr>
-      <w:r>
-        <w:rPr>
-          <w:lang w:val="en-US"/>
-        </w:rPr>
-        <w:t xml:space="preserve">        width = </w:t>
-      </w:r>
-      <w:proofErr w:type="spellStart"/>
-      <w:proofErr w:type="gramStart"/>
-      <w:r>
-        <w:rPr>
-          <w:lang w:val="en-US"/>
-        </w:rPr>
-        <w:t>newWidth</w:t>
-      </w:r>
-      <w:proofErr w:type="spellEnd"/>
-      <w:r>
-        <w:rPr>
-          <w:lang w:val="en-US"/>
-        </w:rPr>
-        <w:t>;</w:t>
-      </w:r>
-      <w:proofErr w:type="gramEnd"/>
     </w:p>
     <w:p>
       <w:pPr>
@@ -1651,7 +1654,7 @@
     </w:p>
     <w:p>
       <w:pPr>
-        <w:pStyle w:val="Prrafodelista"/>
+        <w:pStyle w:val="ListParagraph"/>
         <w:numPr>
           <w:ilvl w:val="0"/>
           <w:numId w:val="1"/>
@@ -1680,7 +1683,7 @@
     </w:p>
     <w:p>
       <w:pPr>
-        <w:pStyle w:val="Prrafodelista"/>
+        <w:pStyle w:val="ListParagraph"/>
         <w:numPr>
           <w:ilvl w:val="0"/>
           <w:numId w:val="1"/>
@@ -1733,7 +1736,7 @@
     </w:p>
     <w:p>
       <w:pPr>
-        <w:pStyle w:val="Prrafodelista"/>
+        <w:pStyle w:val="ListParagraph"/>
         <w:spacing w:after="0"/>
       </w:pPr>
       <w:r>
@@ -1827,7 +1830,7 @@
                     <pic:cNvPicPr/>
                   </pic:nvPicPr>
                   <pic:blipFill>
-                    <a:blip r:embed="rId8"/>
+                    <a:blip r:embed="rId9"/>
                     <a:stretch>
                       <a:fillRect/>
                     </a:stretch>
@@ -1909,7 +1912,7 @@
                     <pic:cNvPicPr/>
                   </pic:nvPicPr>
                   <pic:blipFill>
-                    <a:blip r:embed="rId9"/>
+                    <a:blip r:embed="rId10"/>
                     <a:stretch>
                       <a:fillRect/>
                     </a:stretch>
@@ -2045,7 +2048,7 @@
                     <pic:cNvPicPr/>
                   </pic:nvPicPr>
                   <pic:blipFill>
-                    <a:blip r:embed="rId10"/>
+                    <a:blip r:embed="rId11"/>
                     <a:stretch>
                       <a:fillRect/>
                     </a:stretch>
@@ -2103,7 +2106,7 @@
                     </pic:cNvPicPr>
                   </pic:nvPicPr>
                   <pic:blipFill>
-                    <a:blip r:embed="rId11">
+                    <a:blip r:embed="rId12">
                       <a:extLst>
                         <a:ext uri="{28A0092B-C50C-407E-A947-70E740481C1C}">
                           <a14:useLocalDpi xmlns:a14="http://schemas.microsoft.com/office/drawing/2010/main" val="0"/>
@@ -2203,54 +2206,31 @@
         <w:t xml:space="preserve">1. </w:t>
       </w:r>
       <w:r>
-        <w:t>Lean el código anterior. (a) ¿Cuál creen que es la figura resultante? (b) Píntenla.</w:t>
-      </w:r>
-    </w:p>
-    <w:p>
-      <w:pPr>
-        <w:pStyle w:val="Prrafodelista"/>
-        <w:numPr>
-          <w:ilvl w:val="0"/>
-          <w:numId w:val="3"/>
-        </w:numPr>
-        <w:spacing w:after="0"/>
-      </w:pPr>
-      <w:r>
-        <w:t xml:space="preserve">Nos va a dar 2 </w:t>
-      </w:r>
-      <w:proofErr w:type="spellStart"/>
-      <w:r>
-        <w:t>rectagnulos</w:t>
-      </w:r>
-      <w:proofErr w:type="spellEnd"/>
-      <w:r>
-        <w:t xml:space="preserve"> separados uno de color negro y otro de color azul </w:t>
-      </w:r>
-    </w:p>
-    <w:p>
-      <w:pPr>
-        <w:pStyle w:val="Prrafodelista"/>
-        <w:numPr>
-          <w:ilvl w:val="0"/>
-          <w:numId w:val="3"/>
-        </w:numPr>
-        <w:spacing w:after="0"/>
-      </w:pPr>
-    </w:p>
-    <w:p>
-      <w:pPr>
-        <w:spacing w:after="0"/>
-        <w:ind w:left="720"/>
-        <w:rPr>
-          <w:u w:val="single"/>
-        </w:rPr>
-      </w:pPr>
-      <w:r>
+        <w:t xml:space="preserve">Lean el código anterior. </w:t>
+      </w:r>
+    </w:p>
+    <w:p>
+      <w:pPr>
+        <w:spacing w:after="0"/>
+        <w:ind w:firstLine="720"/>
+      </w:pPr>
+      <w:r>
+        <w:t>(a) ¿Cuál creen que es la figura resultante? (b) Píntenla.</w:t>
+      </w:r>
+    </w:p>
+    <w:p>
+      <w:pPr>
+        <w:pStyle w:val="NormalWeb"/>
+      </w:pPr>
+      <w:r>
+        <w:rPr>
+          <w:noProof/>
+        </w:rPr>
         <w:drawing>
-          <wp:inline distT="0" distB="0" distL="0" distR="0" wp14:anchorId="1F0647D3" wp14:editId="75708B7D">
-            <wp:extent cx="2848373" cy="3077004"/>
-            <wp:effectExtent l="0" t="0" r="9525" b="0"/>
-            <wp:docPr id="1500118089" name="Imagen 1" descr="Imagen que contiene Interfaz de usuario gráfica&#10;&#10;El contenido generado por IA puede ser incorrecto."/>
+          <wp:inline distT="0" distB="0" distL="0" distR="0" wp14:anchorId="1EE960D8" wp14:editId="18347E91">
+            <wp:extent cx="1981200" cy="1402715"/>
+            <wp:effectExtent l="0" t="0" r="0" b="6985"/>
+            <wp:docPr id="3" name="Picture 3" descr="C:\Users\javier.caicedo-g\Downloads\WhatsApp Image 2026-02-06 at 10.52.21 AM.jpeg"/>
             <wp:cNvGraphicFramePr>
               <a:graphicFrameLocks xmlns:a="http://schemas.openxmlformats.org/drawingml/2006/main" noChangeAspect="1"/>
             </wp:cNvGraphicFramePr>
@@ -2258,11 +2238,1083 @@
               <a:graphicData uri="http://schemas.openxmlformats.org/drawingml/2006/picture">
                 <pic:pic xmlns:pic="http://schemas.openxmlformats.org/drawingml/2006/picture">
                   <pic:nvPicPr>
-                    <pic:cNvPr id="1500118089" name="Imagen 1" descr="Imagen que contiene Interfaz de usuario gráfica&#10;&#10;El contenido generado por IA puede ser incorrecto."/>
+                    <pic:cNvPr id="0" name="Picture 1" descr="C:\Users\javier.caicedo-g\Downloads\WhatsApp Image 2026-02-06 at 10.52.21 AM.jpeg"/>
+                    <pic:cNvPicPr>
+                      <a:picLocks noChangeAspect="1" noChangeArrowheads="1"/>
+                    </pic:cNvPicPr>
+                  </pic:nvPicPr>
+                  <pic:blipFill>
+                    <a:blip r:embed="rId13" cstate="print">
+                      <a:extLst>
+                        <a:ext uri="{28A0092B-C50C-407E-A947-70E740481C1C}">
+                          <a14:useLocalDpi xmlns:a14="http://schemas.microsoft.com/office/drawing/2010/main" val="0"/>
+                        </a:ext>
+                      </a:extLst>
+                    </a:blip>
+                    <a:srcRect/>
+                    <a:stretch>
+                      <a:fillRect/>
+                    </a:stretch>
+                  </pic:blipFill>
+                  <pic:spPr bwMode="auto">
+                    <a:xfrm>
+                      <a:off x="0" y="0"/>
+                      <a:ext cx="1989658" cy="1408703"/>
+                    </a:xfrm>
+                    <a:prstGeom prst="rect">
+                      <a:avLst/>
+                    </a:prstGeom>
+                    <a:noFill/>
+                    <a:ln>
+                      <a:noFill/>
+                    </a:ln>
+                  </pic:spPr>
+                </pic:pic>
+              </a:graphicData>
+            </a:graphic>
+          </wp:inline>
+        </w:drawing>
+      </w:r>
+    </w:p>
+    <w:p>
+      <w:pPr>
+        <w:spacing w:after="0"/>
+      </w:pPr>
+      <w:r>
+        <w:t xml:space="preserve">Nos va a dar 2 </w:t>
+      </w:r>
+      <w:r>
+        <w:t>rectángulos</w:t>
+      </w:r>
+      <w:r>
+        <w:t xml:space="preserve"> separados uno de color negro y otro de color azul </w:t>
+      </w:r>
+    </w:p>
+    <w:p>
+      <w:pPr>
+        <w:pStyle w:val="ListParagraph"/>
+        <w:spacing w:after="0"/>
+        <w:ind w:left="1080"/>
+      </w:pPr>
+    </w:p>
+    <w:p>
+      <w:pPr>
+        <w:spacing w:after="0"/>
+      </w:pPr>
+      <w:r>
+        <w:t xml:space="preserve">2. </w:t>
+      </w:r>
+      <w:r>
+        <w:t xml:space="preserve">Para cada punto señalado: (a) ¿cuántas variables existen? (b) ¿cuántos objetos existen? (no cuenten ni </w:t>
+      </w:r>
+      <w:proofErr w:type="spellStart"/>
+      <w:r>
+        <w:t>losobjetos</w:t>
+      </w:r>
+      <w:proofErr w:type="spellEnd"/>
+      <w:r>
+        <w:t xml:space="preserve"> </w:t>
+      </w:r>
+      <w:proofErr w:type="spellStart"/>
+      <w:r>
+        <w:t>String</w:t>
+      </w:r>
+      <w:proofErr w:type="spellEnd"/>
+      <w:r>
+        <w:t xml:space="preserve"> ni el objeto </w:t>
+      </w:r>
+      <w:proofErr w:type="spellStart"/>
+      <w:r>
+        <w:t>Canvas</w:t>
+      </w:r>
+      <w:proofErr w:type="spellEnd"/>
+      <w:r>
+        <w:t>) (c) ¿cuántos objetos se ven?</w:t>
+      </w:r>
+    </w:p>
+    <w:tbl>
+      <w:tblPr>
+        <w:tblStyle w:val="TableGrid"/>
+        <w:tblW w:w="0" w:type="auto"/>
+        <w:tblLook w:val="04A0" w:firstRow="1" w:lastRow="0" w:firstColumn="1" w:lastColumn="0" w:noHBand="0" w:noVBand="1"/>
+      </w:tblPr>
+      <w:tblGrid>
+        <w:gridCol w:w="895"/>
+        <w:gridCol w:w="3779"/>
+        <w:gridCol w:w="2338"/>
+        <w:gridCol w:w="2338"/>
+      </w:tblGrid>
+      <w:tr>
+        <w:tc>
+          <w:tcPr>
+            <w:tcW w:w="895" w:type="dxa"/>
+            <w:vMerge w:val="restart"/>
+          </w:tcPr>
+          <w:p/>
+        </w:tc>
+        <w:tc>
+          <w:tcPr>
+            <w:tcW w:w="3779" w:type="dxa"/>
+            <w:vMerge w:val="restart"/>
+          </w:tcPr>
+          <w:p>
+            <w:pPr>
+              <w:jc w:val="center"/>
+            </w:pPr>
+            <w:r>
+              <w:t>Variables</w:t>
+            </w:r>
+          </w:p>
+        </w:tc>
+        <w:tc>
+          <w:tcPr>
+            <w:tcW w:w="4676" w:type="dxa"/>
+            <w:gridSpan w:val="2"/>
+          </w:tcPr>
+          <w:p>
+            <w:pPr>
+              <w:jc w:val="center"/>
+            </w:pPr>
+            <w:r>
+              <w:t>Objetos</w:t>
+            </w:r>
+          </w:p>
+        </w:tc>
+      </w:tr>
+      <w:tr>
+        <w:tc>
+          <w:tcPr>
+            <w:tcW w:w="895" w:type="dxa"/>
+            <w:vMerge/>
+          </w:tcPr>
+          <w:p/>
+        </w:tc>
+        <w:tc>
+          <w:tcPr>
+            <w:tcW w:w="3779" w:type="dxa"/>
+            <w:vMerge/>
+          </w:tcPr>
+          <w:p>
+            <w:pPr>
+              <w:jc w:val="center"/>
+            </w:pPr>
+          </w:p>
+        </w:tc>
+        <w:tc>
+          <w:tcPr>
+            <w:tcW w:w="2338" w:type="dxa"/>
+          </w:tcPr>
+          <w:p>
+            <w:pPr>
+              <w:jc w:val="center"/>
+            </w:pPr>
+            <w:r>
+              <w:t>Existentes</w:t>
+            </w:r>
+          </w:p>
+        </w:tc>
+        <w:tc>
+          <w:tcPr>
+            <w:tcW w:w="2338" w:type="dxa"/>
+          </w:tcPr>
+          <w:p>
+            <w:pPr>
+              <w:jc w:val="center"/>
+            </w:pPr>
+            <w:r>
+              <w:t>Visibles</w:t>
+            </w:r>
+          </w:p>
+        </w:tc>
+      </w:tr>
+      <w:tr>
+        <w:tc>
+          <w:tcPr>
+            <w:tcW w:w="895" w:type="dxa"/>
+          </w:tcPr>
+          <w:p>
+            <w:r>
+              <w:t>#1</w:t>
+            </w:r>
+          </w:p>
+        </w:tc>
+        <w:tc>
+          <w:tcPr>
+            <w:tcW w:w="3779" w:type="dxa"/>
+          </w:tcPr>
+          <w:p>
+            <w:pPr>
+              <w:jc w:val="center"/>
+            </w:pPr>
+            <w:r>
+              <w:t>3</w:t>
+            </w:r>
+          </w:p>
+        </w:tc>
+        <w:tc>
+          <w:tcPr>
+            <w:tcW w:w="2338" w:type="dxa"/>
+          </w:tcPr>
+          <w:p>
+            <w:pPr>
+              <w:jc w:val="center"/>
+            </w:pPr>
+            <w:r>
+              <w:t>0</w:t>
+            </w:r>
+          </w:p>
+        </w:tc>
+        <w:tc>
+          <w:tcPr>
+            <w:tcW w:w="2338" w:type="dxa"/>
+          </w:tcPr>
+          <w:p>
+            <w:pPr>
+              <w:jc w:val="center"/>
+            </w:pPr>
+            <w:r>
+              <w:t>0</w:t>
+            </w:r>
+          </w:p>
+        </w:tc>
+      </w:tr>
+      <w:tr>
+        <w:tc>
+          <w:tcPr>
+            <w:tcW w:w="895" w:type="dxa"/>
+          </w:tcPr>
+          <w:p>
+            <w:r>
+              <w:t>#2</w:t>
+            </w:r>
+          </w:p>
+        </w:tc>
+        <w:tc>
+          <w:tcPr>
+            <w:tcW w:w="3779" w:type="dxa"/>
+          </w:tcPr>
+          <w:p>
+            <w:pPr>
+              <w:jc w:val="center"/>
+            </w:pPr>
+            <w:r>
+              <w:t>3</w:t>
+            </w:r>
+          </w:p>
+        </w:tc>
+        <w:tc>
+          <w:tcPr>
+            <w:tcW w:w="2338" w:type="dxa"/>
+          </w:tcPr>
+          <w:p>
+            <w:pPr>
+              <w:jc w:val="center"/>
+            </w:pPr>
+            <w:r>
+              <w:t>2</w:t>
+            </w:r>
+          </w:p>
+        </w:tc>
+        <w:tc>
+          <w:tcPr>
+            <w:tcW w:w="2338" w:type="dxa"/>
+          </w:tcPr>
+          <w:p>
+            <w:pPr>
+              <w:jc w:val="center"/>
+            </w:pPr>
+            <w:r>
+              <w:t>0</w:t>
+            </w:r>
+          </w:p>
+        </w:tc>
+      </w:tr>
+      <w:tr>
+        <w:tc>
+          <w:tcPr>
+            <w:tcW w:w="895" w:type="dxa"/>
+          </w:tcPr>
+          <w:p>
+            <w:r>
+              <w:t>#3</w:t>
+            </w:r>
+          </w:p>
+        </w:tc>
+        <w:tc>
+          <w:tcPr>
+            <w:tcW w:w="3779" w:type="dxa"/>
+          </w:tcPr>
+          <w:p>
+            <w:pPr>
+              <w:jc w:val="center"/>
+            </w:pPr>
+            <w:r>
+              <w:t>1</w:t>
+            </w:r>
+          </w:p>
+        </w:tc>
+        <w:tc>
+          <w:tcPr>
+            <w:tcW w:w="2338" w:type="dxa"/>
+          </w:tcPr>
+          <w:p>
+            <w:pPr>
+              <w:jc w:val="center"/>
+            </w:pPr>
+            <w:r>
+              <w:t>1</w:t>
+            </w:r>
+          </w:p>
+        </w:tc>
+        <w:tc>
+          <w:tcPr>
+            <w:tcW w:w="2338" w:type="dxa"/>
+          </w:tcPr>
+          <w:p>
+            <w:pPr>
+              <w:jc w:val="center"/>
+            </w:pPr>
+            <w:r>
+              <w:t>1</w:t>
+            </w:r>
+          </w:p>
+        </w:tc>
+      </w:tr>
+      <w:tr>
+        <w:tc>
+          <w:tcPr>
+            <w:tcW w:w="895" w:type="dxa"/>
+          </w:tcPr>
+          <w:p>
+            <w:r>
+              <w:t>#4</w:t>
+            </w:r>
+          </w:p>
+        </w:tc>
+        <w:tc>
+          <w:tcPr>
+            <w:tcW w:w="3779" w:type="dxa"/>
+          </w:tcPr>
+          <w:p>
+            <w:pPr>
+              <w:jc w:val="center"/>
+            </w:pPr>
+            <w:r>
+              <w:t>2</w:t>
+            </w:r>
+          </w:p>
+        </w:tc>
+        <w:tc>
+          <w:tcPr>
+            <w:tcW w:w="2338" w:type="dxa"/>
+          </w:tcPr>
+          <w:p>
+            <w:pPr>
+              <w:jc w:val="center"/>
+            </w:pPr>
+            <w:r>
+              <w:t>1</w:t>
+            </w:r>
+          </w:p>
+        </w:tc>
+        <w:tc>
+          <w:tcPr>
+            <w:tcW w:w="2338" w:type="dxa"/>
+          </w:tcPr>
+          <w:p>
+            <w:pPr>
+              <w:jc w:val="center"/>
+            </w:pPr>
+            <w:r>
+              <w:t>0</w:t>
+            </w:r>
+          </w:p>
+        </w:tc>
+      </w:tr>
+      <w:tr>
+        <w:tc>
+          <w:tcPr>
+            <w:tcW w:w="895" w:type="dxa"/>
+          </w:tcPr>
+          <w:p>
+            <w:r>
+              <w:t>#5</w:t>
+            </w:r>
+          </w:p>
+        </w:tc>
+        <w:tc>
+          <w:tcPr>
+            <w:tcW w:w="3779" w:type="dxa"/>
+          </w:tcPr>
+          <w:p>
+            <w:pPr>
+              <w:jc w:val="center"/>
+            </w:pPr>
+            <w:r>
+              <w:t>2</w:t>
+            </w:r>
+          </w:p>
+        </w:tc>
+        <w:tc>
+          <w:tcPr>
+            <w:tcW w:w="2338" w:type="dxa"/>
+          </w:tcPr>
+          <w:p>
+            <w:pPr>
+              <w:jc w:val="center"/>
+            </w:pPr>
+            <w:r>
+              <w:t>1</w:t>
+            </w:r>
+          </w:p>
+        </w:tc>
+        <w:tc>
+          <w:tcPr>
+            <w:tcW w:w="2338" w:type="dxa"/>
+          </w:tcPr>
+          <w:p>
+            <w:pPr>
+              <w:jc w:val="center"/>
+            </w:pPr>
+            <w:r>
+              <w:t>0</w:t>
+            </w:r>
+          </w:p>
+        </w:tc>
+      </w:tr>
+      <w:tr>
+        <w:tc>
+          <w:tcPr>
+            <w:tcW w:w="895" w:type="dxa"/>
+          </w:tcPr>
+          <w:p>
+            <w:r>
+              <w:t>#6</w:t>
+            </w:r>
+          </w:p>
+        </w:tc>
+        <w:tc>
+          <w:tcPr>
+            <w:tcW w:w="3779" w:type="dxa"/>
+          </w:tcPr>
+          <w:p>
+            <w:pPr>
+              <w:jc w:val="center"/>
+            </w:pPr>
+            <w:r>
+              <w:t>3</w:t>
+            </w:r>
+          </w:p>
+        </w:tc>
+        <w:tc>
+          <w:tcPr>
+            <w:tcW w:w="2338" w:type="dxa"/>
+          </w:tcPr>
+          <w:p>
+            <w:pPr>
+              <w:jc w:val="center"/>
+            </w:pPr>
+            <w:r>
+              <w:t>2</w:t>
+            </w:r>
+          </w:p>
+        </w:tc>
+        <w:tc>
+          <w:tcPr>
+            <w:tcW w:w="2338" w:type="dxa"/>
+          </w:tcPr>
+          <w:p>
+            <w:pPr>
+              <w:jc w:val="center"/>
+            </w:pPr>
+            <w:r>
+              <w:t>2</w:t>
+            </w:r>
+          </w:p>
+        </w:tc>
+      </w:tr>
+    </w:tbl>
+    <w:p>
+      <w:pPr>
+        <w:spacing w:after="0"/>
+        <w:rPr>
+          <w:u w:val="single"/>
+        </w:rPr>
+      </w:pPr>
+    </w:p>
+    <w:p>
+      <w:pPr>
+        <w:spacing w:after="0"/>
+      </w:pPr>
+      <w:r>
+        <w:t xml:space="preserve">3. </w:t>
+      </w:r>
+      <w:r>
+        <w:t>Habiliten la ventana de código en línea, escriban el código. (a) Capturen la pantalla.</w:t>
+      </w:r>
+      <w:r>
+        <w:rPr>
+          <w:noProof/>
+        </w:rPr>
+        <w:drawing>
+          <wp:inline distT="0" distB="0" distL="0" distR="0" wp14:anchorId="20D486BD" wp14:editId="10B054A3">
+            <wp:extent cx="2914650" cy="3086100"/>
+            <wp:effectExtent l="0" t="0" r="0" b="0"/>
+            <wp:docPr id="5" name="Picture 5" descr="C:\Users\javier.caicedo-g\Downloads\WhatsApp Image 2026-02-06 at 9.41.26 AM.jpeg"/>
+            <wp:cNvGraphicFramePr>
+              <a:graphicFrameLocks xmlns:a="http://schemas.openxmlformats.org/drawingml/2006/main" noChangeAspect="1"/>
+            </wp:cNvGraphicFramePr>
+            <a:graphic xmlns:a="http://schemas.openxmlformats.org/drawingml/2006/main">
+              <a:graphicData uri="http://schemas.openxmlformats.org/drawingml/2006/picture">
+                <pic:pic xmlns:pic="http://schemas.openxmlformats.org/drawingml/2006/picture">
+                  <pic:nvPicPr>
+                    <pic:cNvPr id="0" name="Picture 3" descr="C:\Users\javier.caicedo-g\Downloads\WhatsApp Image 2026-02-06 at 9.41.26 AM.jpeg"/>
+                    <pic:cNvPicPr>
+                      <a:picLocks noChangeAspect="1" noChangeArrowheads="1"/>
+                    </pic:cNvPicPr>
+                  </pic:nvPicPr>
+                  <pic:blipFill>
+                    <a:blip r:embed="rId14">
+                      <a:extLst>
+                        <a:ext uri="{28A0092B-C50C-407E-A947-70E740481C1C}">
+                          <a14:useLocalDpi xmlns:a14="http://schemas.microsoft.com/office/drawing/2010/main" val="0"/>
+                        </a:ext>
+                      </a:extLst>
+                    </a:blip>
+                    <a:srcRect/>
+                    <a:stretch>
+                      <a:fillRect/>
+                    </a:stretch>
+                  </pic:blipFill>
+                  <pic:spPr bwMode="auto">
+                    <a:xfrm>
+                      <a:off x="0" y="0"/>
+                      <a:ext cx="2929219" cy="3101526"/>
+                    </a:xfrm>
+                    <a:prstGeom prst="rect">
+                      <a:avLst/>
+                    </a:prstGeom>
+                    <a:noFill/>
+                    <a:ln>
+                      <a:noFill/>
+                    </a:ln>
+                  </pic:spPr>
+                </pic:pic>
+              </a:graphicData>
+            </a:graphic>
+          </wp:inline>
+        </w:drawing>
+      </w:r>
+    </w:p>
+    <w:p>
+      <w:pPr>
+        <w:spacing w:after="0"/>
+        <w:rPr>
+          <w:lang w:val="en-US"/>
+        </w:rPr>
+      </w:pPr>
+      <w:r>
+        <w:rPr>
+          <w:lang w:val="en-US"/>
+        </w:rPr>
+        <w:lastRenderedPageBreak/>
+        <w:t xml:space="preserve">4. </w:t>
+      </w:r>
+      <w:r>
+        <w:rPr>
+          <w:lang w:val="en-US"/>
+        </w:rPr>
+        <w:t xml:space="preserve">Compare la </w:t>
+      </w:r>
+      <w:proofErr w:type="spellStart"/>
+      <w:r>
+        <w:rPr>
+          <w:lang w:val="en-US"/>
+        </w:rPr>
+        <w:t>figura</w:t>
+      </w:r>
+      <w:proofErr w:type="spellEnd"/>
+      <w:r>
+        <w:rPr>
+          <w:lang w:val="en-US"/>
+        </w:rPr>
+        <w:t xml:space="preserve"> </w:t>
+      </w:r>
+      <w:proofErr w:type="spellStart"/>
+      <w:r>
+        <w:rPr>
+          <w:lang w:val="en-US"/>
+        </w:rPr>
+        <w:t>pintada</w:t>
+      </w:r>
+      <w:proofErr w:type="spellEnd"/>
+      <w:r>
+        <w:rPr>
+          <w:lang w:val="en-US"/>
+        </w:rPr>
+        <w:t xml:space="preserve"> </w:t>
+      </w:r>
+      <w:proofErr w:type="spellStart"/>
+      <w:r>
+        <w:rPr>
+          <w:lang w:val="en-US"/>
+        </w:rPr>
+        <w:t>en</w:t>
+      </w:r>
+      <w:proofErr w:type="spellEnd"/>
+      <w:r>
+        <w:rPr>
+          <w:lang w:val="en-US"/>
+        </w:rPr>
+        <w:t xml:space="preserve"> 1. con la </w:t>
+      </w:r>
+      <w:proofErr w:type="spellStart"/>
+      <w:r>
+        <w:rPr>
+          <w:lang w:val="en-US"/>
+        </w:rPr>
+        <w:t>figura</w:t>
+      </w:r>
+      <w:proofErr w:type="spellEnd"/>
+      <w:r>
+        <w:rPr>
+          <w:lang w:val="en-US"/>
+        </w:rPr>
+        <w:t xml:space="preserve"> </w:t>
+      </w:r>
+      <w:proofErr w:type="spellStart"/>
+      <w:r>
+        <w:rPr>
+          <w:lang w:val="en-US"/>
+        </w:rPr>
+        <w:t>capturada</w:t>
+      </w:r>
+      <w:proofErr w:type="spellEnd"/>
+      <w:r>
+        <w:rPr>
+          <w:lang w:val="en-US"/>
+        </w:rPr>
+        <w:t xml:space="preserve"> </w:t>
+      </w:r>
+      <w:proofErr w:type="spellStart"/>
+      <w:r>
+        <w:rPr>
+          <w:lang w:val="en-US"/>
+        </w:rPr>
+        <w:t>en</w:t>
+      </w:r>
+      <w:proofErr w:type="spellEnd"/>
+      <w:r>
+        <w:rPr>
+          <w:lang w:val="en-US"/>
+        </w:rPr>
+        <w:t xml:space="preserve"> 3.: (a) ¿son </w:t>
+      </w:r>
+      <w:proofErr w:type="spellStart"/>
+      <w:r>
+        <w:rPr>
+          <w:lang w:val="en-US"/>
+        </w:rPr>
+        <w:t>iguales</w:t>
+      </w:r>
+      <w:proofErr w:type="spellEnd"/>
+      <w:r>
+        <w:rPr>
+          <w:lang w:val="en-US"/>
+        </w:rPr>
+        <w:t xml:space="preserve">? (b) ¿por </w:t>
+      </w:r>
+      <w:proofErr w:type="spellStart"/>
+      <w:r>
+        <w:rPr>
+          <w:lang w:val="en-US"/>
+        </w:rPr>
+        <w:t>qué</w:t>
+      </w:r>
+      <w:proofErr w:type="spellEnd"/>
+      <w:r>
+        <w:rPr>
+          <w:lang w:val="en-US"/>
+        </w:rPr>
+        <w:t>?</w:t>
+      </w:r>
+    </w:p>
+    <w:p>
+      <w:pPr>
+        <w:spacing w:after="0"/>
+        <w:rPr>
+          <w:lang w:val="en-US"/>
+        </w:rPr>
+      </w:pPr>
+      <w:r>
+        <w:rPr>
+          <w:lang w:val="en-US"/>
+        </w:rPr>
+        <w:t xml:space="preserve">La </w:t>
+      </w:r>
+      <w:proofErr w:type="spellStart"/>
+      <w:r>
+        <w:rPr>
+          <w:lang w:val="en-US"/>
+        </w:rPr>
+        <w:t>unica</w:t>
+      </w:r>
+      <w:proofErr w:type="spellEnd"/>
+      <w:r>
+        <w:rPr>
+          <w:lang w:val="en-US"/>
+        </w:rPr>
+        <w:t xml:space="preserve"> </w:t>
+      </w:r>
+      <w:proofErr w:type="spellStart"/>
+      <w:r>
+        <w:rPr>
+          <w:lang w:val="en-US"/>
+        </w:rPr>
+        <w:t>diferencia</w:t>
+      </w:r>
+      <w:proofErr w:type="spellEnd"/>
+      <w:r>
+        <w:rPr>
+          <w:lang w:val="en-US"/>
+        </w:rPr>
+        <w:t xml:space="preserve"> es la </w:t>
+      </w:r>
+      <w:proofErr w:type="spellStart"/>
+      <w:r>
+        <w:rPr>
+          <w:lang w:val="en-US"/>
+        </w:rPr>
+        <w:t>orientacion</w:t>
+      </w:r>
+      <w:proofErr w:type="spellEnd"/>
+      <w:r>
+        <w:rPr>
+          <w:lang w:val="en-US"/>
+        </w:rPr>
+        <w:t xml:space="preserve"> de el </w:t>
+      </w:r>
+      <w:proofErr w:type="spellStart"/>
+      <w:r>
+        <w:rPr>
+          <w:lang w:val="en-US"/>
+        </w:rPr>
+        <w:t>rectangulo</w:t>
+      </w:r>
+      <w:proofErr w:type="spellEnd"/>
+      <w:r>
+        <w:rPr>
+          <w:lang w:val="en-US"/>
+        </w:rPr>
+        <w:t xml:space="preserve"> </w:t>
+      </w:r>
+      <w:proofErr w:type="spellStart"/>
+      <w:r>
+        <w:rPr>
+          <w:lang w:val="en-US"/>
+        </w:rPr>
+        <w:t>azul</w:t>
+      </w:r>
+      <w:proofErr w:type="spellEnd"/>
+      <w:r>
+        <w:rPr>
+          <w:lang w:val="en-US"/>
+        </w:rPr>
+        <w:t>.</w:t>
+      </w:r>
+    </w:p>
+    <w:p>
+      <w:pPr>
+        <w:spacing w:after="0"/>
+        <w:rPr>
+          <w:lang w:val="en-US"/>
+        </w:rPr>
+      </w:pPr>
+    </w:p>
+    <w:p>
+      <w:pPr>
+        <w:spacing w:after="0"/>
+        <w:rPr>
+          <w:lang w:val="en-US"/>
+        </w:rPr>
+      </w:pPr>
+    </w:p>
+    <w:p>
+      <w:pPr>
+        <w:spacing w:after="0"/>
+        <w:rPr>
+          <w:b/>
+          <w:sz w:val="32"/>
+          <w:szCs w:val="32"/>
+          <w:lang w:val="en-US"/>
+        </w:rPr>
+      </w:pPr>
+      <w:r>
+        <w:rPr>
+          <w:b/>
+          <w:sz w:val="32"/>
+          <w:szCs w:val="32"/>
+          <w:lang w:val="en-US"/>
+        </w:rPr>
+        <w:t xml:space="preserve">D </w:t>
+      </w:r>
+      <w:proofErr w:type="spellStart"/>
+      <w:r>
+        <w:rPr>
+          <w:b/>
+          <w:sz w:val="32"/>
+          <w:szCs w:val="32"/>
+          <w:lang w:val="en-US"/>
+        </w:rPr>
+        <w:t>Extendiendo</w:t>
+      </w:r>
+      <w:proofErr w:type="spellEnd"/>
+      <w:r>
+        <w:rPr>
+          <w:b/>
+          <w:sz w:val="32"/>
+          <w:szCs w:val="32"/>
+          <w:lang w:val="en-US"/>
+        </w:rPr>
+        <w:t xml:space="preserve"> una </w:t>
+      </w:r>
+      <w:proofErr w:type="spellStart"/>
+      <w:r>
+        <w:rPr>
+          <w:b/>
+          <w:sz w:val="32"/>
+          <w:szCs w:val="32"/>
+          <w:lang w:val="en-US"/>
+        </w:rPr>
+        <w:t>clase</w:t>
+      </w:r>
+      <w:proofErr w:type="spellEnd"/>
+      <w:r>
+        <w:rPr>
+          <w:b/>
+          <w:sz w:val="32"/>
+          <w:szCs w:val="32"/>
+          <w:lang w:val="en-US"/>
+        </w:rPr>
+        <w:t>. Rectangle. [</w:t>
+      </w:r>
+      <w:proofErr w:type="spellStart"/>
+      <w:r>
+        <w:rPr>
+          <w:b/>
+          <w:sz w:val="32"/>
+          <w:szCs w:val="32"/>
+          <w:lang w:val="en-US"/>
+        </w:rPr>
+        <w:t>En</w:t>
+      </w:r>
+      <w:proofErr w:type="spellEnd"/>
+      <w:r>
+        <w:rPr>
+          <w:b/>
+          <w:sz w:val="32"/>
+          <w:szCs w:val="32"/>
+          <w:lang w:val="en-US"/>
+        </w:rPr>
+        <w:t xml:space="preserve"> lab01.doc] [</w:t>
+      </w:r>
+      <w:proofErr w:type="spellStart"/>
+      <w:r>
+        <w:rPr>
+          <w:b/>
+          <w:sz w:val="32"/>
+          <w:szCs w:val="32"/>
+          <w:lang w:val="en-US"/>
+        </w:rPr>
+        <w:t>En</w:t>
+      </w:r>
+      <w:proofErr w:type="spellEnd"/>
+      <w:r>
+        <w:rPr>
+          <w:b/>
+          <w:sz w:val="32"/>
+          <w:szCs w:val="32"/>
+          <w:lang w:val="en-US"/>
+        </w:rPr>
+        <w:t xml:space="preserve"> .java]</w:t>
+      </w:r>
+    </w:p>
+    <w:p>
+      <w:pPr>
+        <w:spacing w:after="0"/>
+        <w:rPr>
+          <w:lang w:val="en-US"/>
+        </w:rPr>
+      </w:pPr>
+    </w:p>
+    <w:p>
+      <w:pPr>
+        <w:pStyle w:val="ListParagraph"/>
+        <w:numPr>
+          <w:ilvl w:val="0"/>
+          <w:numId w:val="4"/>
+        </w:numPr>
+        <w:spacing w:after="0"/>
+        <w:rPr>
+          <w:lang w:val="en-US"/>
+        </w:rPr>
+      </w:pPr>
+      <w:proofErr w:type="spellStart"/>
+      <w:r>
+        <w:rPr>
+          <w:lang w:val="en-US"/>
+        </w:rPr>
+        <w:t>Desarrollen</w:t>
+      </w:r>
+      <w:proofErr w:type="spellEnd"/>
+      <w:r>
+        <w:rPr>
+          <w:lang w:val="en-US"/>
+        </w:rPr>
+        <w:t xml:space="preserve"> </w:t>
+      </w:r>
+      <w:proofErr w:type="spellStart"/>
+      <w:r>
+        <w:rPr>
+          <w:lang w:val="en-US"/>
+        </w:rPr>
+        <w:t>en</w:t>
+      </w:r>
+      <w:proofErr w:type="spellEnd"/>
+      <w:r>
+        <w:rPr>
+          <w:lang w:val="en-US"/>
+        </w:rPr>
+        <w:t xml:space="preserve"> Rectangle el </w:t>
+      </w:r>
+      <w:proofErr w:type="spellStart"/>
+      <w:r>
+        <w:rPr>
+          <w:lang w:val="en-US"/>
+        </w:rPr>
+        <w:t>método</w:t>
+      </w:r>
+      <w:proofErr w:type="spellEnd"/>
+      <w:r>
+        <w:rPr>
+          <w:lang w:val="en-US"/>
+        </w:rPr>
+        <w:t xml:space="preserve"> </w:t>
+      </w:r>
+      <w:proofErr w:type="gramStart"/>
+      <w:r>
+        <w:rPr>
+          <w:lang w:val="en-US"/>
+        </w:rPr>
+        <w:t>perimeter(</w:t>
+      </w:r>
+      <w:proofErr w:type="gramEnd"/>
+      <w:r>
+        <w:rPr>
+          <w:lang w:val="en-US"/>
+        </w:rPr>
+        <w:t>) (</w:t>
+      </w:r>
+      <w:proofErr w:type="spellStart"/>
+      <w:r>
+        <w:rPr>
+          <w:lang w:val="en-US"/>
+        </w:rPr>
+        <w:t>retorna</w:t>
+      </w:r>
+      <w:proofErr w:type="spellEnd"/>
+      <w:r>
+        <w:rPr>
+          <w:lang w:val="en-US"/>
+        </w:rPr>
+        <w:t xml:space="preserve"> el </w:t>
+      </w:r>
+      <w:proofErr w:type="spellStart"/>
+      <w:r>
+        <w:rPr>
+          <w:lang w:val="en-US"/>
+        </w:rPr>
+        <w:t>perímetro</w:t>
+      </w:r>
+      <w:proofErr w:type="spellEnd"/>
+      <w:r>
+        <w:rPr>
+          <w:lang w:val="en-US"/>
+        </w:rPr>
+        <w:t>). ¡</w:t>
+      </w:r>
+      <w:proofErr w:type="spellStart"/>
+      <w:r>
+        <w:rPr>
+          <w:lang w:val="en-US"/>
+        </w:rPr>
+        <w:t>Pruébenlo</w:t>
+      </w:r>
+      <w:proofErr w:type="spellEnd"/>
+      <w:r>
+        <w:rPr>
+          <w:lang w:val="en-US"/>
+        </w:rPr>
+        <w:t xml:space="preserve">! </w:t>
+      </w:r>
+      <w:proofErr w:type="spellStart"/>
+      <w:r>
+        <w:rPr>
+          <w:lang w:val="en-US"/>
+        </w:rPr>
+        <w:t>Capturen</w:t>
+      </w:r>
+      <w:proofErr w:type="spellEnd"/>
+      <w:r>
+        <w:rPr>
+          <w:lang w:val="en-US"/>
+        </w:rPr>
+        <w:t xml:space="preserve"> una </w:t>
+      </w:r>
+      <w:proofErr w:type="spellStart"/>
+      <w:r>
+        <w:rPr>
+          <w:lang w:val="en-US"/>
+        </w:rPr>
+        <w:t>pantalla</w:t>
+      </w:r>
+      <w:proofErr w:type="spellEnd"/>
+      <w:r>
+        <w:rPr>
+          <w:lang w:val="en-US"/>
+        </w:rPr>
+        <w:t>.</w:t>
+      </w:r>
+    </w:p>
+    <w:p>
+      <w:pPr>
+        <w:pStyle w:val="ListParagraph"/>
+        <w:spacing w:after="0"/>
+        <w:rPr>
+          <w:lang w:val="en-US"/>
+        </w:rPr>
+      </w:pPr>
+      <w:r>
+        <w:rPr>
+          <w:lang w:val="en-US"/>
+        </w:rPr>
+        <w:drawing>
+          <wp:inline distT="0" distB="0" distL="0" distR="0" wp14:anchorId="3DCDD32E" wp14:editId="7F11F613">
+            <wp:extent cx="3571875" cy="2383157"/>
+            <wp:effectExtent l="0" t="0" r="0" b="0"/>
+            <wp:docPr id="6" name="Picture 6"/>
+            <wp:cNvGraphicFramePr>
+              <a:graphicFrameLocks xmlns:a="http://schemas.openxmlformats.org/drawingml/2006/main" noChangeAspect="1"/>
+            </wp:cNvGraphicFramePr>
+            <a:graphic xmlns:a="http://schemas.openxmlformats.org/drawingml/2006/main">
+              <a:graphicData uri="http://schemas.openxmlformats.org/drawingml/2006/picture">
+                <pic:pic xmlns:pic="http://schemas.openxmlformats.org/drawingml/2006/picture">
+                  <pic:nvPicPr>
+                    <pic:cNvPr id="1" name=""/>
                     <pic:cNvPicPr/>
                   </pic:nvPicPr>
                   <pic:blipFill>
-                    <a:blip r:embed="rId12"/>
+                    <a:blip r:embed="rId15"/>
                     <a:stretch>
                       <a:fillRect/>
                     </a:stretch>
@@ -2270,7 +3322,7 @@
                   <pic:spPr>
                     <a:xfrm>
                       <a:off x="0" y="0"/>
-                      <a:ext cx="2848373" cy="3077004"/>
+                      <a:ext cx="3593143" cy="2397347"/>
                     </a:xfrm>
                     <a:prstGeom prst="rect">
                       <a:avLst/>
@@ -2282,6 +3334,1919 @@
           </wp:inline>
         </w:drawing>
       </w:r>
+      <w:r>
+        <w:rPr>
+          <w:lang w:val="en-US"/>
+        </w:rPr>
+        <w:drawing>
+          <wp:inline distT="0" distB="0" distL="0" distR="0" wp14:anchorId="22A87E2F" wp14:editId="5C6DC2BF">
+            <wp:extent cx="3638550" cy="1476801"/>
+            <wp:effectExtent l="0" t="0" r="0" b="9525"/>
+            <wp:docPr id="7" name="Picture 7"/>
+            <wp:cNvGraphicFramePr>
+              <a:graphicFrameLocks xmlns:a="http://schemas.openxmlformats.org/drawingml/2006/main" noChangeAspect="1"/>
+            </wp:cNvGraphicFramePr>
+            <a:graphic xmlns:a="http://schemas.openxmlformats.org/drawingml/2006/main">
+              <a:graphicData uri="http://schemas.openxmlformats.org/drawingml/2006/picture">
+                <pic:pic xmlns:pic="http://schemas.openxmlformats.org/drawingml/2006/picture">
+                  <pic:nvPicPr>
+                    <pic:cNvPr id="1" name=""/>
+                    <pic:cNvPicPr/>
+                  </pic:nvPicPr>
+                  <pic:blipFill>
+                    <a:blip r:embed="rId16"/>
+                    <a:stretch>
+                      <a:fillRect/>
+                    </a:stretch>
+                  </pic:blipFill>
+                  <pic:spPr>
+                    <a:xfrm>
+                      <a:off x="0" y="0"/>
+                      <a:ext cx="3679266" cy="1493327"/>
+                    </a:xfrm>
+                    <a:prstGeom prst="rect">
+                      <a:avLst/>
+                    </a:prstGeom>
+                  </pic:spPr>
+                </pic:pic>
+              </a:graphicData>
+            </a:graphic>
+          </wp:inline>
+        </w:drawing>
+      </w:r>
+    </w:p>
+    <w:p>
+      <w:pPr>
+        <w:pStyle w:val="ListParagraph"/>
+        <w:spacing w:after="0"/>
+        <w:rPr>
+          <w:lang w:val="en-US"/>
+        </w:rPr>
+      </w:pPr>
+      <w:r>
+        <w:rPr>
+          <w:lang w:val="en-US"/>
+        </w:rPr>
+        <w:t xml:space="preserve">Se le </w:t>
+      </w:r>
+      <w:proofErr w:type="spellStart"/>
+      <w:r>
+        <w:rPr>
+          <w:lang w:val="en-US"/>
+        </w:rPr>
+        <w:t>aplicó</w:t>
+      </w:r>
+      <w:proofErr w:type="spellEnd"/>
+      <w:r>
+        <w:rPr>
+          <w:lang w:val="en-US"/>
+        </w:rPr>
+        <w:t xml:space="preserve"> el </w:t>
+      </w:r>
+      <w:proofErr w:type="spellStart"/>
+      <w:r>
+        <w:rPr>
+          <w:lang w:val="en-US"/>
+        </w:rPr>
+        <w:t>calculatePerimeter</w:t>
+      </w:r>
+      <w:proofErr w:type="spellEnd"/>
+      <w:r>
+        <w:rPr>
+          <w:lang w:val="en-US"/>
+        </w:rPr>
+        <w:t xml:space="preserve"> al </w:t>
+      </w:r>
+      <w:proofErr w:type="spellStart"/>
+      <w:r>
+        <w:rPr>
+          <w:lang w:val="en-US"/>
+        </w:rPr>
+        <w:t>changeSize</w:t>
+      </w:r>
+      <w:proofErr w:type="spellEnd"/>
+      <w:r>
+        <w:rPr>
+          <w:lang w:val="en-US"/>
+        </w:rPr>
+        <w:t xml:space="preserve"> para que al </w:t>
+      </w:r>
+      <w:proofErr w:type="spellStart"/>
+      <w:r>
+        <w:rPr>
+          <w:lang w:val="en-US"/>
+        </w:rPr>
+        <w:t>cambiar</w:t>
+      </w:r>
+      <w:proofErr w:type="spellEnd"/>
+      <w:r>
+        <w:rPr>
+          <w:lang w:val="en-US"/>
+        </w:rPr>
+        <w:t xml:space="preserve"> de </w:t>
+      </w:r>
+      <w:proofErr w:type="spellStart"/>
+      <w:r>
+        <w:rPr>
+          <w:lang w:val="en-US"/>
+        </w:rPr>
+        <w:t>tamaño</w:t>
+      </w:r>
+      <w:proofErr w:type="spellEnd"/>
+      <w:r>
+        <w:rPr>
+          <w:lang w:val="en-US"/>
+        </w:rPr>
+        <w:t xml:space="preserve"> calculate </w:t>
+      </w:r>
+      <w:proofErr w:type="spellStart"/>
+      <w:r>
+        <w:rPr>
+          <w:lang w:val="en-US"/>
+        </w:rPr>
+        <w:t>automaticamente</w:t>
+      </w:r>
+      <w:proofErr w:type="spellEnd"/>
+      <w:r>
+        <w:rPr>
+          <w:lang w:val="en-US"/>
+        </w:rPr>
+        <w:t xml:space="preserve"> el nuevo </w:t>
+      </w:r>
+      <w:proofErr w:type="spellStart"/>
+      <w:r>
+        <w:rPr>
+          <w:lang w:val="en-US"/>
+        </w:rPr>
+        <w:t>perimetro</w:t>
+      </w:r>
+      <w:proofErr w:type="spellEnd"/>
+    </w:p>
+    <w:p>
+      <w:pPr>
+        <w:pStyle w:val="ListParagraph"/>
+        <w:spacing w:after="0"/>
+        <w:rPr>
+          <w:lang w:val="en-US"/>
+        </w:rPr>
+      </w:pPr>
+      <w:r>
+        <w:rPr>
+          <w:lang w:val="en-US"/>
+        </w:rPr>
+        <w:drawing>
+          <wp:inline distT="0" distB="0" distL="0" distR="0" wp14:anchorId="48211F08" wp14:editId="2F04BDFB">
+            <wp:extent cx="2419350" cy="1768161"/>
+            <wp:effectExtent l="0" t="0" r="0" b="3810"/>
+            <wp:docPr id="8" name="Picture 8"/>
+            <wp:cNvGraphicFramePr>
+              <a:graphicFrameLocks xmlns:a="http://schemas.openxmlformats.org/drawingml/2006/main" noChangeAspect="1"/>
+            </wp:cNvGraphicFramePr>
+            <a:graphic xmlns:a="http://schemas.openxmlformats.org/drawingml/2006/main">
+              <a:graphicData uri="http://schemas.openxmlformats.org/drawingml/2006/picture">
+                <pic:pic xmlns:pic="http://schemas.openxmlformats.org/drawingml/2006/picture">
+                  <pic:nvPicPr>
+                    <pic:cNvPr id="1" name=""/>
+                    <pic:cNvPicPr/>
+                  </pic:nvPicPr>
+                  <pic:blipFill>
+                    <a:blip r:embed="rId17"/>
+                    <a:stretch>
+                      <a:fillRect/>
+                    </a:stretch>
+                  </pic:blipFill>
+                  <pic:spPr>
+                    <a:xfrm>
+                      <a:off x="0" y="0"/>
+                      <a:ext cx="2437382" cy="1781339"/>
+                    </a:xfrm>
+                    <a:prstGeom prst="rect">
+                      <a:avLst/>
+                    </a:prstGeom>
+                  </pic:spPr>
+                </pic:pic>
+              </a:graphicData>
+            </a:graphic>
+          </wp:inline>
+        </w:drawing>
+      </w:r>
+      <w:r>
+        <w:rPr>
+          <w:lang w:val="en-US"/>
+        </w:rPr>
+        <w:drawing>
+          <wp:inline distT="0" distB="0" distL="0" distR="0" wp14:anchorId="4189F432" wp14:editId="2DF9097B">
+            <wp:extent cx="2509515" cy="1761707"/>
+            <wp:effectExtent l="0" t="0" r="5715" b="0"/>
+            <wp:docPr id="9" name="Picture 9"/>
+            <wp:cNvGraphicFramePr>
+              <a:graphicFrameLocks xmlns:a="http://schemas.openxmlformats.org/drawingml/2006/main" noChangeAspect="1"/>
+            </wp:cNvGraphicFramePr>
+            <a:graphic xmlns:a="http://schemas.openxmlformats.org/drawingml/2006/main">
+              <a:graphicData uri="http://schemas.openxmlformats.org/drawingml/2006/picture">
+                <pic:pic xmlns:pic="http://schemas.openxmlformats.org/drawingml/2006/picture">
+                  <pic:nvPicPr>
+                    <pic:cNvPr id="1" name=""/>
+                    <pic:cNvPicPr/>
+                  </pic:nvPicPr>
+                  <pic:blipFill>
+                    <a:blip r:embed="rId18"/>
+                    <a:stretch>
+                      <a:fillRect/>
+                    </a:stretch>
+                  </pic:blipFill>
+                  <pic:spPr>
+                    <a:xfrm>
+                      <a:off x="0" y="0"/>
+                      <a:ext cx="2527017" cy="1773994"/>
+                    </a:xfrm>
+                    <a:prstGeom prst="rect">
+                      <a:avLst/>
+                    </a:prstGeom>
+                  </pic:spPr>
+                </pic:pic>
+              </a:graphicData>
+            </a:graphic>
+          </wp:inline>
+        </w:drawing>
+      </w:r>
+    </w:p>
+    <w:p>
+      <w:pPr>
+        <w:spacing w:after="0"/>
+        <w:rPr>
+          <w:lang w:val="en-US"/>
+        </w:rPr>
+      </w:pPr>
+    </w:p>
+    <w:p>
+      <w:pPr>
+        <w:spacing w:after="0"/>
+        <w:rPr>
+          <w:lang w:val="en-US"/>
+        </w:rPr>
+      </w:pPr>
+    </w:p>
+    <w:p>
+      <w:pPr>
+        <w:pStyle w:val="ListParagraph"/>
+        <w:numPr>
+          <w:ilvl w:val="0"/>
+          <w:numId w:val="4"/>
+        </w:numPr>
+        <w:spacing w:after="0"/>
+        <w:rPr>
+          <w:lang w:val="en-US"/>
+        </w:rPr>
+      </w:pPr>
+      <w:r>
+        <w:rPr>
+          <w:lang w:val="en-US"/>
+        </w:rPr>
+        <w:lastRenderedPageBreak/>
+        <w:t xml:space="preserve"> </w:t>
+      </w:r>
+      <w:proofErr w:type="spellStart"/>
+      <w:r>
+        <w:rPr>
+          <w:lang w:val="en-US"/>
+        </w:rPr>
+        <w:t>Desarrollen</w:t>
+      </w:r>
+      <w:proofErr w:type="spellEnd"/>
+      <w:r>
+        <w:rPr>
+          <w:lang w:val="en-US"/>
+        </w:rPr>
+        <w:t xml:space="preserve"> </w:t>
+      </w:r>
+      <w:proofErr w:type="spellStart"/>
+      <w:r>
+        <w:rPr>
+          <w:lang w:val="en-US"/>
+        </w:rPr>
+        <w:t>en</w:t>
+      </w:r>
+      <w:proofErr w:type="spellEnd"/>
+      <w:r>
+        <w:rPr>
+          <w:lang w:val="en-US"/>
+        </w:rPr>
+        <w:t xml:space="preserve"> Rectangle el </w:t>
+      </w:r>
+      <w:proofErr w:type="spellStart"/>
+      <w:r>
+        <w:rPr>
+          <w:lang w:val="en-US"/>
+        </w:rPr>
+        <w:t>método</w:t>
+      </w:r>
+      <w:proofErr w:type="spellEnd"/>
+      <w:r>
+        <w:rPr>
+          <w:lang w:val="en-US"/>
+        </w:rPr>
+        <w:t xml:space="preserve"> </w:t>
+      </w:r>
+      <w:proofErr w:type="gramStart"/>
+      <w:r>
+        <w:rPr>
+          <w:lang w:val="en-US"/>
+        </w:rPr>
+        <w:t>zoom(</w:t>
+      </w:r>
+      <w:proofErr w:type="gramEnd"/>
+      <w:r>
+        <w:rPr>
+          <w:lang w:val="en-US"/>
+        </w:rPr>
+        <w:t>z: char) (</w:t>
+      </w:r>
+      <w:proofErr w:type="spellStart"/>
+      <w:r>
+        <w:rPr>
+          <w:lang w:val="en-US"/>
+        </w:rPr>
+        <w:t>aumenta</w:t>
+      </w:r>
+      <w:proofErr w:type="spellEnd"/>
+      <w:r>
+        <w:rPr>
+          <w:lang w:val="en-US"/>
+        </w:rPr>
+        <w:t xml:space="preserve"> (+) o </w:t>
+      </w:r>
+      <w:proofErr w:type="spellStart"/>
+      <w:r>
+        <w:rPr>
+          <w:lang w:val="en-US"/>
+        </w:rPr>
+        <w:t>disminuye</w:t>
+      </w:r>
+      <w:proofErr w:type="spellEnd"/>
+      <w:r>
+        <w:rPr>
+          <w:lang w:val="en-US"/>
+        </w:rPr>
+        <w:t xml:space="preserve"> (-) 100 % el </w:t>
+      </w:r>
+      <w:proofErr w:type="spellStart"/>
+      <w:r>
+        <w:rPr>
+          <w:lang w:val="en-US"/>
+        </w:rPr>
+        <w:t>perímetro</w:t>
+      </w:r>
+      <w:proofErr w:type="spellEnd"/>
+      <w:r>
+        <w:rPr>
+          <w:lang w:val="en-US"/>
+        </w:rPr>
+        <w:t xml:space="preserve"> </w:t>
+      </w:r>
+      <w:proofErr w:type="spellStart"/>
+      <w:r>
+        <w:rPr>
+          <w:lang w:val="en-US"/>
+        </w:rPr>
+        <w:t>manteniendo</w:t>
+      </w:r>
+      <w:proofErr w:type="spellEnd"/>
+      <w:r>
+        <w:rPr>
+          <w:lang w:val="en-US"/>
+        </w:rPr>
+        <w:t xml:space="preserve"> la </w:t>
+      </w:r>
+      <w:proofErr w:type="spellStart"/>
+      <w:r>
+        <w:rPr>
+          <w:lang w:val="en-US"/>
+        </w:rPr>
+        <w:t>proporción</w:t>
+      </w:r>
+      <w:proofErr w:type="spellEnd"/>
+      <w:r>
+        <w:rPr>
+          <w:lang w:val="en-US"/>
+        </w:rPr>
+        <w:t>). ¡</w:t>
+      </w:r>
+      <w:proofErr w:type="spellStart"/>
+      <w:r>
+        <w:rPr>
+          <w:lang w:val="en-US"/>
+        </w:rPr>
+        <w:t>Pruébenlo</w:t>
+      </w:r>
+      <w:proofErr w:type="spellEnd"/>
+      <w:r>
+        <w:rPr>
+          <w:lang w:val="en-US"/>
+        </w:rPr>
+        <w:t xml:space="preserve">! </w:t>
+      </w:r>
+      <w:proofErr w:type="spellStart"/>
+      <w:r>
+        <w:rPr>
+          <w:lang w:val="en-US"/>
+        </w:rPr>
+        <w:t>Capturen</w:t>
+      </w:r>
+      <w:proofErr w:type="spellEnd"/>
+      <w:r>
+        <w:rPr>
+          <w:lang w:val="en-US"/>
+        </w:rPr>
+        <w:t xml:space="preserve"> dos </w:t>
+      </w:r>
+      <w:proofErr w:type="spellStart"/>
+      <w:r>
+        <w:rPr>
+          <w:lang w:val="en-US"/>
+        </w:rPr>
+        <w:t>pantallas</w:t>
+      </w:r>
+      <w:proofErr w:type="spellEnd"/>
+      <w:r>
+        <w:rPr>
+          <w:lang w:val="en-US"/>
+        </w:rPr>
+        <w:t>.</w:t>
+      </w:r>
+    </w:p>
+    <w:p>
+      <w:pPr>
+        <w:spacing w:after="0"/>
+        <w:rPr>
+          <w:lang w:val="en-US"/>
+        </w:rPr>
+      </w:pPr>
+      <w:r>
+        <w:rPr>
+          <w:lang w:val="en-US"/>
+        </w:rPr>
+        <w:drawing>
+          <wp:inline distT="0" distB="0" distL="0" distR="0" wp14:anchorId="4C4D8C48" wp14:editId="7A56CCA5">
+            <wp:extent cx="5943600" cy="2377440"/>
+            <wp:effectExtent l="0" t="0" r="0" b="3810"/>
+            <wp:docPr id="10" name="Picture 10"/>
+            <wp:cNvGraphicFramePr>
+              <a:graphicFrameLocks xmlns:a="http://schemas.openxmlformats.org/drawingml/2006/main" noChangeAspect="1"/>
+            </wp:cNvGraphicFramePr>
+            <a:graphic xmlns:a="http://schemas.openxmlformats.org/drawingml/2006/main">
+              <a:graphicData uri="http://schemas.openxmlformats.org/drawingml/2006/picture">
+                <pic:pic xmlns:pic="http://schemas.openxmlformats.org/drawingml/2006/picture">
+                  <pic:nvPicPr>
+                    <pic:cNvPr id="1" name=""/>
+                    <pic:cNvPicPr/>
+                  </pic:nvPicPr>
+                  <pic:blipFill>
+                    <a:blip r:embed="rId19"/>
+                    <a:stretch>
+                      <a:fillRect/>
+                    </a:stretch>
+                  </pic:blipFill>
+                  <pic:spPr>
+                    <a:xfrm>
+                      <a:off x="0" y="0"/>
+                      <a:ext cx="5943600" cy="2377440"/>
+                    </a:xfrm>
+                    <a:prstGeom prst="rect">
+                      <a:avLst/>
+                    </a:prstGeom>
+                  </pic:spPr>
+                </pic:pic>
+              </a:graphicData>
+            </a:graphic>
+          </wp:inline>
+        </w:drawing>
+      </w:r>
+    </w:p>
+    <w:p>
+      <w:pPr>
+        <w:spacing w:after="0"/>
+        <w:rPr>
+          <w:lang w:val="en-US"/>
+        </w:rPr>
+      </w:pPr>
+      <w:r>
+        <w:rPr>
+          <w:lang w:val="en-US"/>
+        </w:rPr>
+        <w:drawing>
+          <wp:inline distT="0" distB="0" distL="0" distR="0" wp14:anchorId="5B200FE3" wp14:editId="780E672E">
+            <wp:extent cx="2867425" cy="3134162"/>
+            <wp:effectExtent l="0" t="0" r="9525" b="9525"/>
+            <wp:docPr id="12" name="Picture 12"/>
+            <wp:cNvGraphicFramePr>
+              <a:graphicFrameLocks xmlns:a="http://schemas.openxmlformats.org/drawingml/2006/main" noChangeAspect="1"/>
+            </wp:cNvGraphicFramePr>
+            <a:graphic xmlns:a="http://schemas.openxmlformats.org/drawingml/2006/main">
+              <a:graphicData uri="http://schemas.openxmlformats.org/drawingml/2006/picture">
+                <pic:pic xmlns:pic="http://schemas.openxmlformats.org/drawingml/2006/picture">
+                  <pic:nvPicPr>
+                    <pic:cNvPr id="1" name=""/>
+                    <pic:cNvPicPr/>
+                  </pic:nvPicPr>
+                  <pic:blipFill>
+                    <a:blip r:embed="rId20"/>
+                    <a:stretch>
+                      <a:fillRect/>
+                    </a:stretch>
+                  </pic:blipFill>
+                  <pic:spPr>
+                    <a:xfrm>
+                      <a:off x="0" y="0"/>
+                      <a:ext cx="2867425" cy="3134162"/>
+                    </a:xfrm>
+                    <a:prstGeom prst="rect">
+                      <a:avLst/>
+                    </a:prstGeom>
+                  </pic:spPr>
+                </pic:pic>
+              </a:graphicData>
+            </a:graphic>
+          </wp:inline>
+        </w:drawing>
+      </w:r>
+      <w:r>
+        <w:rPr>
+          <w:lang w:val="en-US"/>
+        </w:rPr>
+        <w:drawing>
+          <wp:inline distT="0" distB="0" distL="0" distR="0" wp14:anchorId="0DCE1902" wp14:editId="2597A420">
+            <wp:extent cx="2847975" cy="3135556"/>
+            <wp:effectExtent l="0" t="0" r="0" b="8255"/>
+            <wp:docPr id="11" name="Picture 11"/>
+            <wp:cNvGraphicFramePr>
+              <a:graphicFrameLocks xmlns:a="http://schemas.openxmlformats.org/drawingml/2006/main" noChangeAspect="1"/>
+            </wp:cNvGraphicFramePr>
+            <a:graphic xmlns:a="http://schemas.openxmlformats.org/drawingml/2006/main">
+              <a:graphicData uri="http://schemas.openxmlformats.org/drawingml/2006/picture">
+                <pic:pic xmlns:pic="http://schemas.openxmlformats.org/drawingml/2006/picture">
+                  <pic:nvPicPr>
+                    <pic:cNvPr id="1" name=""/>
+                    <pic:cNvPicPr/>
+                  </pic:nvPicPr>
+                  <pic:blipFill>
+                    <a:blip r:embed="rId21"/>
+                    <a:stretch>
+                      <a:fillRect/>
+                    </a:stretch>
+                  </pic:blipFill>
+                  <pic:spPr>
+                    <a:xfrm>
+                      <a:off x="0" y="0"/>
+                      <a:ext cx="2854827" cy="3143100"/>
+                    </a:xfrm>
+                    <a:prstGeom prst="rect">
+                      <a:avLst/>
+                    </a:prstGeom>
+                  </pic:spPr>
+                </pic:pic>
+              </a:graphicData>
+            </a:graphic>
+          </wp:inline>
+        </w:drawing>
+      </w:r>
+    </w:p>
+    <w:p>
+      <w:pPr>
+        <w:pStyle w:val="ListParagraph"/>
+        <w:numPr>
+          <w:ilvl w:val="0"/>
+          <w:numId w:val="4"/>
+        </w:numPr>
+        <w:spacing w:after="0"/>
+        <w:rPr>
+          <w:lang w:val="en-US"/>
+        </w:rPr>
+      </w:pPr>
+      <w:proofErr w:type="spellStart"/>
+      <w:r>
+        <w:rPr>
+          <w:lang w:val="en-US"/>
+        </w:rPr>
+        <w:t>Desarrollen</w:t>
+      </w:r>
+      <w:proofErr w:type="spellEnd"/>
+      <w:r>
+        <w:rPr>
+          <w:lang w:val="en-US"/>
+        </w:rPr>
+        <w:t xml:space="preserve"> </w:t>
+      </w:r>
+      <w:proofErr w:type="spellStart"/>
+      <w:r>
+        <w:rPr>
+          <w:lang w:val="en-US"/>
+        </w:rPr>
+        <w:t>en</w:t>
+      </w:r>
+      <w:proofErr w:type="spellEnd"/>
+      <w:r>
+        <w:rPr>
+          <w:lang w:val="en-US"/>
+        </w:rPr>
+        <w:t xml:space="preserve"> Rectangle el </w:t>
+      </w:r>
+      <w:proofErr w:type="spellStart"/>
+      <w:r>
+        <w:rPr>
+          <w:lang w:val="en-US"/>
+        </w:rPr>
+        <w:t>método</w:t>
+      </w:r>
+      <w:proofErr w:type="spellEnd"/>
+      <w:r>
+        <w:rPr>
+          <w:lang w:val="en-US"/>
+        </w:rPr>
+        <w:t xml:space="preserve"> </w:t>
+      </w:r>
+      <w:proofErr w:type="gramStart"/>
+      <w:r>
+        <w:rPr>
+          <w:lang w:val="en-US"/>
+        </w:rPr>
+        <w:t>walk(</w:t>
+      </w:r>
+      <w:proofErr w:type="gramEnd"/>
+      <w:r>
+        <w:rPr>
+          <w:lang w:val="en-US"/>
+        </w:rPr>
+        <w:t>times: int) (</w:t>
+      </w:r>
+      <w:proofErr w:type="spellStart"/>
+      <w:r>
+        <w:rPr>
+          <w:lang w:val="en-US"/>
+        </w:rPr>
+        <w:t>va</w:t>
+      </w:r>
+      <w:proofErr w:type="spellEnd"/>
+      <w:r>
+        <w:rPr>
+          <w:lang w:val="en-US"/>
+        </w:rPr>
+        <w:t xml:space="preserve"> </w:t>
+      </w:r>
+      <w:proofErr w:type="spellStart"/>
+      <w:r>
+        <w:rPr>
+          <w:lang w:val="en-US"/>
+        </w:rPr>
+        <w:t>moviendose</w:t>
+      </w:r>
+      <w:proofErr w:type="spellEnd"/>
+      <w:r>
+        <w:rPr>
+          <w:lang w:val="en-US"/>
+        </w:rPr>
+        <w:t xml:space="preserve"> </w:t>
+      </w:r>
+      <w:proofErr w:type="spellStart"/>
+      <w:r>
+        <w:rPr>
+          <w:lang w:val="en-US"/>
+        </w:rPr>
+        <w:t>cayendo</w:t>
+      </w:r>
+      <w:proofErr w:type="spellEnd"/>
+      <w:r>
+        <w:rPr>
+          <w:lang w:val="en-US"/>
+        </w:rPr>
+        <w:t xml:space="preserve"> </w:t>
+      </w:r>
+      <w:proofErr w:type="spellStart"/>
+      <w:r>
+        <w:rPr>
+          <w:lang w:val="en-US"/>
+        </w:rPr>
+        <w:t>hacia</w:t>
+      </w:r>
+      <w:proofErr w:type="spellEnd"/>
+      <w:r>
+        <w:rPr>
+          <w:lang w:val="en-US"/>
+        </w:rPr>
+        <w:t xml:space="preserve"> la </w:t>
+      </w:r>
+      <w:proofErr w:type="spellStart"/>
+      <w:r>
+        <w:rPr>
+          <w:lang w:val="en-US"/>
+        </w:rPr>
+        <w:t>derecha</w:t>
+      </w:r>
+      <w:proofErr w:type="spellEnd"/>
+      <w:r>
+        <w:rPr>
+          <w:lang w:val="en-US"/>
+        </w:rPr>
+        <w:t xml:space="preserve"> (</w:t>
+      </w:r>
+      <w:proofErr w:type="spellStart"/>
+      <w:r>
+        <w:rPr>
+          <w:lang w:val="en-US"/>
+        </w:rPr>
+        <w:t>positivo</w:t>
+      </w:r>
+      <w:proofErr w:type="spellEnd"/>
+      <w:r>
+        <w:rPr>
+          <w:lang w:val="en-US"/>
+        </w:rPr>
+        <w:t>)</w:t>
+      </w:r>
+      <w:r>
+        <w:rPr>
+          <w:lang w:val="en-US"/>
+        </w:rPr>
+        <w:t xml:space="preserve"> </w:t>
+      </w:r>
+      <w:r>
+        <w:rPr>
+          <w:lang w:val="en-US"/>
+        </w:rPr>
+        <w:t xml:space="preserve">o </w:t>
+      </w:r>
+      <w:proofErr w:type="spellStart"/>
+      <w:r>
+        <w:rPr>
+          <w:lang w:val="en-US"/>
+        </w:rPr>
+        <w:t>izquierda</w:t>
+      </w:r>
+      <w:proofErr w:type="spellEnd"/>
+      <w:r>
+        <w:rPr>
+          <w:lang w:val="en-US"/>
+        </w:rPr>
+        <w:t xml:space="preserve"> (</w:t>
+      </w:r>
+      <w:proofErr w:type="spellStart"/>
+      <w:r>
+        <w:rPr>
+          <w:lang w:val="en-US"/>
+        </w:rPr>
+        <w:t>negativo</w:t>
+      </w:r>
+      <w:proofErr w:type="spellEnd"/>
+      <w:r>
+        <w:rPr>
+          <w:lang w:val="en-US"/>
+        </w:rPr>
+        <w:t xml:space="preserve">) abs(times) </w:t>
+      </w:r>
+      <w:proofErr w:type="spellStart"/>
+      <w:r>
+        <w:rPr>
+          <w:lang w:val="en-US"/>
+        </w:rPr>
+        <w:t>veces</w:t>
+      </w:r>
+      <w:proofErr w:type="spellEnd"/>
+      <w:r>
+        <w:rPr>
+          <w:lang w:val="en-US"/>
+        </w:rPr>
+        <w:t>). ¡</w:t>
+      </w:r>
+      <w:proofErr w:type="spellStart"/>
+      <w:r>
+        <w:rPr>
+          <w:lang w:val="en-US"/>
+        </w:rPr>
+        <w:t>Pruébenlo</w:t>
+      </w:r>
+      <w:proofErr w:type="spellEnd"/>
+      <w:r>
+        <w:rPr>
+          <w:lang w:val="en-US"/>
+        </w:rPr>
+        <w:t xml:space="preserve">! </w:t>
+      </w:r>
+      <w:proofErr w:type="spellStart"/>
+      <w:r>
+        <w:rPr>
+          <w:lang w:val="en-US"/>
+        </w:rPr>
+        <w:t>Capturen</w:t>
+      </w:r>
+      <w:proofErr w:type="spellEnd"/>
+      <w:r>
+        <w:rPr>
+          <w:lang w:val="en-US"/>
+        </w:rPr>
+        <w:t xml:space="preserve"> </w:t>
+      </w:r>
+      <w:proofErr w:type="spellStart"/>
+      <w:r>
+        <w:rPr>
+          <w:lang w:val="en-US"/>
+        </w:rPr>
+        <w:t>tres</w:t>
+      </w:r>
+      <w:proofErr w:type="spellEnd"/>
+      <w:r>
+        <w:rPr>
+          <w:lang w:val="en-US"/>
+        </w:rPr>
+        <w:t xml:space="preserve"> </w:t>
+      </w:r>
+      <w:proofErr w:type="spellStart"/>
+      <w:r>
+        <w:rPr>
+          <w:lang w:val="en-US"/>
+        </w:rPr>
+        <w:t>pantallas</w:t>
+      </w:r>
+      <w:proofErr w:type="spellEnd"/>
+      <w:r>
+        <w:rPr>
+          <w:lang w:val="en-US"/>
+        </w:rPr>
+        <w:t>.</w:t>
+      </w:r>
+    </w:p>
+    <w:p>
+      <w:pPr>
+        <w:pStyle w:val="ListParagraph"/>
+        <w:spacing w:after="0"/>
+        <w:rPr>
+          <w:lang w:val="en-US"/>
+        </w:rPr>
+      </w:pPr>
+    </w:p>
+    <w:p>
+      <w:pPr>
+        <w:pStyle w:val="ListParagraph"/>
+        <w:numPr>
+          <w:ilvl w:val="0"/>
+          <w:numId w:val="4"/>
+        </w:numPr>
+        <w:spacing w:after="0"/>
+        <w:rPr>
+          <w:lang w:val="en-US"/>
+        </w:rPr>
+      </w:pPr>
+      <w:proofErr w:type="spellStart"/>
+      <w:r>
+        <w:rPr>
+          <w:lang w:val="en-US"/>
+        </w:rPr>
+        <w:t>Desarrollen</w:t>
+      </w:r>
+      <w:proofErr w:type="spellEnd"/>
+      <w:r>
+        <w:rPr>
+          <w:lang w:val="en-US"/>
+        </w:rPr>
+        <w:t xml:space="preserve"> </w:t>
+      </w:r>
+      <w:proofErr w:type="spellStart"/>
+      <w:r>
+        <w:rPr>
+          <w:lang w:val="en-US"/>
+        </w:rPr>
+        <w:t>en</w:t>
+      </w:r>
+      <w:proofErr w:type="spellEnd"/>
+      <w:r>
+        <w:rPr>
+          <w:lang w:val="en-US"/>
+        </w:rPr>
+        <w:t xml:space="preserve"> Rectangle un nuevo </w:t>
+      </w:r>
+      <w:proofErr w:type="spellStart"/>
+      <w:r>
+        <w:rPr>
+          <w:lang w:val="en-US"/>
+        </w:rPr>
+        <w:t>creador</w:t>
+      </w:r>
+      <w:proofErr w:type="spellEnd"/>
+      <w:r>
+        <w:rPr>
+          <w:lang w:val="en-US"/>
+        </w:rPr>
+        <w:t xml:space="preserve"> que </w:t>
+      </w:r>
+      <w:proofErr w:type="spellStart"/>
+      <w:r>
+        <w:rPr>
+          <w:lang w:val="en-US"/>
+        </w:rPr>
+        <w:t>permita</w:t>
+      </w:r>
+      <w:proofErr w:type="spellEnd"/>
+      <w:r>
+        <w:rPr>
+          <w:lang w:val="en-US"/>
+        </w:rPr>
+        <w:t xml:space="preserve"> </w:t>
+      </w:r>
+      <w:proofErr w:type="spellStart"/>
+      <w:r>
+        <w:rPr>
+          <w:lang w:val="en-US"/>
+        </w:rPr>
+        <w:t>crear</w:t>
+      </w:r>
+      <w:proofErr w:type="spellEnd"/>
+      <w:r>
+        <w:rPr>
+          <w:lang w:val="en-US"/>
+        </w:rPr>
+        <w:t xml:space="preserve"> un </w:t>
+      </w:r>
+      <w:proofErr w:type="spellStart"/>
+      <w:r>
+        <w:rPr>
+          <w:lang w:val="en-US"/>
+        </w:rPr>
+        <w:t>cuadrado</w:t>
+      </w:r>
+      <w:proofErr w:type="spellEnd"/>
+      <w:r>
+        <w:rPr>
+          <w:lang w:val="en-US"/>
+        </w:rPr>
+        <w:t xml:space="preserve"> dado </w:t>
+      </w:r>
+      <w:proofErr w:type="spellStart"/>
+      <w:r>
+        <w:rPr>
+          <w:lang w:val="en-US"/>
+        </w:rPr>
+        <w:t>su</w:t>
+      </w:r>
+      <w:proofErr w:type="spellEnd"/>
+      <w:r>
+        <w:rPr>
+          <w:lang w:val="en-US"/>
+        </w:rPr>
+        <w:t xml:space="preserve"> </w:t>
+      </w:r>
+      <w:proofErr w:type="spellStart"/>
+      <w:r>
+        <w:rPr>
+          <w:lang w:val="en-US"/>
+        </w:rPr>
+        <w:t>perímetro</w:t>
+      </w:r>
+      <w:proofErr w:type="spellEnd"/>
+      <w:r>
+        <w:rPr>
+          <w:lang w:val="en-US"/>
+        </w:rPr>
+        <w:t xml:space="preserve">. </w:t>
+      </w:r>
+      <w:proofErr w:type="spellStart"/>
+      <w:r>
+        <w:rPr>
+          <w:lang w:val="en-US"/>
+        </w:rPr>
+        <w:t>Pruébenlo</w:t>
+      </w:r>
+      <w:proofErr w:type="spellEnd"/>
+      <w:r>
+        <w:rPr>
+          <w:lang w:val="en-US"/>
+        </w:rPr>
+        <w:t>!</w:t>
+      </w:r>
+      <w:r>
+        <w:rPr>
+          <w:lang w:val="en-US"/>
+        </w:rPr>
+        <w:t xml:space="preserve"> </w:t>
+      </w:r>
+      <w:proofErr w:type="spellStart"/>
+      <w:r>
+        <w:rPr>
+          <w:lang w:val="en-US"/>
+        </w:rPr>
+        <w:t>Capturen</w:t>
+      </w:r>
+      <w:proofErr w:type="spellEnd"/>
+      <w:r>
+        <w:rPr>
+          <w:lang w:val="en-US"/>
+        </w:rPr>
+        <w:t xml:space="preserve"> una </w:t>
+      </w:r>
+      <w:proofErr w:type="spellStart"/>
+      <w:r>
+        <w:rPr>
+          <w:lang w:val="en-US"/>
+        </w:rPr>
+        <w:t>pantalla</w:t>
+      </w:r>
+      <w:proofErr w:type="spellEnd"/>
+      <w:r>
+        <w:rPr>
+          <w:lang w:val="en-US"/>
+        </w:rPr>
+        <w:t>.</w:t>
+      </w:r>
+    </w:p>
+    <w:p>
+      <w:pPr>
+        <w:pStyle w:val="ListParagraph"/>
+        <w:rPr>
+          <w:lang w:val="en-US"/>
+        </w:rPr>
+      </w:pPr>
+    </w:p>
+    <w:p>
+      <w:pPr>
+        <w:pStyle w:val="ListParagraph"/>
+        <w:spacing w:after="0"/>
+        <w:rPr>
+          <w:lang w:val="en-US"/>
+        </w:rPr>
+      </w:pPr>
+      <w:r>
+        <w:rPr>
+          <w:lang w:val="en-US"/>
+        </w:rPr>
+        <w:lastRenderedPageBreak/>
+        <w:drawing>
+          <wp:inline distT="0" distB="0" distL="0" distR="0" wp14:anchorId="0E28DBC7" wp14:editId="69CDB6DF">
+            <wp:extent cx="3343275" cy="1818272"/>
+            <wp:effectExtent l="0" t="0" r="0" b="0"/>
+            <wp:docPr id="13" name="Picture 13"/>
+            <wp:cNvGraphicFramePr>
+              <a:graphicFrameLocks xmlns:a="http://schemas.openxmlformats.org/drawingml/2006/main" noChangeAspect="1"/>
+            </wp:cNvGraphicFramePr>
+            <a:graphic xmlns:a="http://schemas.openxmlformats.org/drawingml/2006/main">
+              <a:graphicData uri="http://schemas.openxmlformats.org/drawingml/2006/picture">
+                <pic:pic xmlns:pic="http://schemas.openxmlformats.org/drawingml/2006/picture">
+                  <pic:nvPicPr>
+                    <pic:cNvPr id="1" name=""/>
+                    <pic:cNvPicPr/>
+                  </pic:nvPicPr>
+                  <pic:blipFill>
+                    <a:blip r:embed="rId22"/>
+                    <a:stretch>
+                      <a:fillRect/>
+                    </a:stretch>
+                  </pic:blipFill>
+                  <pic:spPr>
+                    <a:xfrm>
+                      <a:off x="0" y="0"/>
+                      <a:ext cx="3406729" cy="1852782"/>
+                    </a:xfrm>
+                    <a:prstGeom prst="rect">
+                      <a:avLst/>
+                    </a:prstGeom>
+                  </pic:spPr>
+                </pic:pic>
+              </a:graphicData>
+            </a:graphic>
+          </wp:inline>
+        </w:drawing>
+      </w:r>
+    </w:p>
+    <w:p>
+      <w:pPr>
+        <w:pStyle w:val="ListParagraph"/>
+        <w:spacing w:after="0"/>
+        <w:rPr>
+          <w:lang w:val="en-US"/>
+        </w:rPr>
+      </w:pPr>
+      <w:r>
+        <w:rPr>
+          <w:lang w:val="en-US"/>
+        </w:rPr>
+        <w:t xml:space="preserve">Por </w:t>
+      </w:r>
+      <w:proofErr w:type="spellStart"/>
+      <w:r>
+        <w:rPr>
+          <w:lang w:val="en-US"/>
+        </w:rPr>
+        <w:t>practicidad</w:t>
+      </w:r>
+      <w:proofErr w:type="spellEnd"/>
+      <w:r>
+        <w:rPr>
+          <w:lang w:val="en-US"/>
+        </w:rPr>
+        <w:t xml:space="preserve">, </w:t>
+      </w:r>
+      <w:proofErr w:type="spellStart"/>
+      <w:r>
+        <w:rPr>
+          <w:lang w:val="en-US"/>
+        </w:rPr>
+        <w:t>realizamos</w:t>
+      </w:r>
+      <w:proofErr w:type="spellEnd"/>
+      <w:r>
+        <w:rPr>
+          <w:lang w:val="en-US"/>
+        </w:rPr>
+        <w:t xml:space="preserve"> una </w:t>
+      </w:r>
+      <w:proofErr w:type="spellStart"/>
+      <w:r>
+        <w:rPr>
+          <w:lang w:val="en-US"/>
+        </w:rPr>
+        <w:t>operación</w:t>
+      </w:r>
+      <w:proofErr w:type="spellEnd"/>
+      <w:r>
+        <w:rPr>
+          <w:lang w:val="en-US"/>
+        </w:rPr>
+        <w:t xml:space="preserve"> </w:t>
+      </w:r>
+      <w:proofErr w:type="spellStart"/>
+      <w:r>
+        <w:rPr>
+          <w:lang w:val="en-US"/>
+        </w:rPr>
+        <w:t>sencilla</w:t>
+      </w:r>
+      <w:proofErr w:type="spellEnd"/>
+      <w:r>
+        <w:rPr>
+          <w:lang w:val="en-US"/>
+        </w:rPr>
+        <w:t xml:space="preserve"> de </w:t>
+      </w:r>
+      <w:proofErr w:type="spellStart"/>
+      <w:r>
+        <w:rPr>
+          <w:lang w:val="en-US"/>
+        </w:rPr>
+        <w:t>generar</w:t>
+      </w:r>
+      <w:proofErr w:type="spellEnd"/>
+      <w:r>
+        <w:rPr>
+          <w:lang w:val="en-US"/>
+        </w:rPr>
+        <w:t xml:space="preserve"> un </w:t>
+      </w:r>
+      <w:proofErr w:type="spellStart"/>
+      <w:r>
+        <w:rPr>
+          <w:lang w:val="en-US"/>
+        </w:rPr>
+        <w:t>cuadrado</w:t>
+      </w:r>
+      <w:proofErr w:type="spellEnd"/>
+      <w:r>
+        <w:rPr>
+          <w:lang w:val="en-US"/>
+        </w:rPr>
+        <w:t>.</w:t>
+      </w:r>
+    </w:p>
+    <w:p>
+      <w:pPr>
+        <w:spacing w:after="0"/>
+        <w:rPr>
+          <w:lang w:val="en-US"/>
+        </w:rPr>
+      </w:pPr>
+    </w:p>
+    <w:p>
+      <w:pPr>
+        <w:pStyle w:val="ListParagraph"/>
+        <w:numPr>
+          <w:ilvl w:val="0"/>
+          <w:numId w:val="4"/>
+        </w:numPr>
+        <w:spacing w:after="0"/>
+        <w:rPr>
+          <w:lang w:val="en-US"/>
+        </w:rPr>
+      </w:pPr>
+      <w:proofErr w:type="spellStart"/>
+      <w:r>
+        <w:rPr>
+          <w:lang w:val="en-US"/>
+        </w:rPr>
+        <w:t>Propongan</w:t>
+      </w:r>
+      <w:proofErr w:type="spellEnd"/>
+      <w:r>
+        <w:rPr>
+          <w:lang w:val="en-US"/>
+        </w:rPr>
+        <w:t xml:space="preserve"> un nuevo </w:t>
+      </w:r>
+      <w:proofErr w:type="spellStart"/>
+      <w:r>
+        <w:rPr>
+          <w:lang w:val="en-US"/>
+        </w:rPr>
+        <w:t>método</w:t>
+      </w:r>
+      <w:proofErr w:type="spellEnd"/>
+      <w:r>
+        <w:rPr>
+          <w:lang w:val="en-US"/>
+        </w:rPr>
+        <w:t xml:space="preserve"> para </w:t>
+      </w:r>
+      <w:proofErr w:type="spellStart"/>
+      <w:r>
+        <w:rPr>
+          <w:lang w:val="en-US"/>
+        </w:rPr>
+        <w:t>esta</w:t>
+      </w:r>
+      <w:proofErr w:type="spellEnd"/>
+      <w:r>
+        <w:rPr>
+          <w:lang w:val="en-US"/>
+        </w:rPr>
+        <w:t xml:space="preserve"> </w:t>
+      </w:r>
+      <w:proofErr w:type="spellStart"/>
+      <w:r>
+        <w:rPr>
+          <w:lang w:val="en-US"/>
+        </w:rPr>
+        <w:t>clase</w:t>
+      </w:r>
+      <w:proofErr w:type="spellEnd"/>
+      <w:r>
+        <w:rPr>
+          <w:lang w:val="en-US"/>
+        </w:rPr>
+        <w:t xml:space="preserve">. </w:t>
+      </w:r>
+      <w:proofErr w:type="spellStart"/>
+      <w:r>
+        <w:rPr>
+          <w:lang w:val="en-US"/>
+        </w:rPr>
+        <w:t>Desarrollen</w:t>
+      </w:r>
+      <w:proofErr w:type="spellEnd"/>
+      <w:r>
+        <w:rPr>
+          <w:lang w:val="en-US"/>
+        </w:rPr>
+        <w:t xml:space="preserve"> y </w:t>
+      </w:r>
+      <w:proofErr w:type="spellStart"/>
+      <w:r>
+        <w:rPr>
+          <w:lang w:val="en-US"/>
+        </w:rPr>
+        <w:t>prueben</w:t>
+      </w:r>
+      <w:proofErr w:type="spellEnd"/>
+      <w:r>
+        <w:rPr>
+          <w:lang w:val="en-US"/>
+        </w:rPr>
+        <w:t xml:space="preserve"> el </w:t>
+      </w:r>
+      <w:proofErr w:type="spellStart"/>
+      <w:r>
+        <w:rPr>
+          <w:lang w:val="en-US"/>
+        </w:rPr>
+        <w:t>método</w:t>
+      </w:r>
+      <w:proofErr w:type="spellEnd"/>
+      <w:r>
+        <w:rPr>
+          <w:lang w:val="en-US"/>
+        </w:rPr>
+        <w:t>.</w:t>
+      </w:r>
+    </w:p>
+    <w:p>
+      <w:pPr>
+        <w:pStyle w:val="ListParagraph"/>
+        <w:spacing w:after="0"/>
+        <w:rPr>
+          <w:lang w:val="en-US"/>
+        </w:rPr>
+      </w:pPr>
+      <w:bookmarkStart w:id="0" w:name="_GoBack"/>
+      <w:bookmarkEnd w:id="0"/>
+    </w:p>
+    <w:p>
+      <w:pPr>
+        <w:pStyle w:val="ListParagraph"/>
+        <w:spacing w:after="0"/>
+        <w:rPr>
+          <w:lang w:val="en-US"/>
+        </w:rPr>
+      </w:pPr>
+      <w:proofErr w:type="spellStart"/>
+      <w:r>
+        <w:rPr>
+          <w:lang w:val="en-US"/>
+        </w:rPr>
+        <w:t>Creamos</w:t>
+      </w:r>
+      <w:proofErr w:type="spellEnd"/>
+      <w:r>
+        <w:rPr>
+          <w:lang w:val="en-US"/>
+        </w:rPr>
+        <w:t xml:space="preserve"> el </w:t>
+      </w:r>
+      <w:proofErr w:type="spellStart"/>
+      <w:r>
+        <w:rPr>
+          <w:lang w:val="en-US"/>
+        </w:rPr>
+        <w:t>metodo</w:t>
+      </w:r>
+      <w:proofErr w:type="spellEnd"/>
+      <w:r>
+        <w:rPr>
+          <w:lang w:val="en-US"/>
+        </w:rPr>
+        <w:t xml:space="preserve"> </w:t>
+      </w:r>
+      <w:proofErr w:type="gramStart"/>
+      <w:r>
+        <w:rPr>
+          <w:lang w:val="en-US"/>
+        </w:rPr>
+        <w:t>mirror(</w:t>
+      </w:r>
+      <w:proofErr w:type="gramEnd"/>
+      <w:r>
+        <w:rPr>
+          <w:lang w:val="en-US"/>
+        </w:rPr>
+        <w:t xml:space="preserve">), lo que </w:t>
+      </w:r>
+      <w:proofErr w:type="spellStart"/>
+      <w:r>
+        <w:rPr>
+          <w:lang w:val="en-US"/>
+        </w:rPr>
+        <w:t>hace</w:t>
+      </w:r>
+      <w:proofErr w:type="spellEnd"/>
+      <w:r>
+        <w:rPr>
+          <w:lang w:val="en-US"/>
+        </w:rPr>
+        <w:t xml:space="preserve"> es </w:t>
+      </w:r>
+      <w:proofErr w:type="spellStart"/>
+      <w:r>
+        <w:rPr>
+          <w:lang w:val="en-US"/>
+        </w:rPr>
+        <w:t>generar</w:t>
+      </w:r>
+      <w:proofErr w:type="spellEnd"/>
+      <w:r>
+        <w:rPr>
+          <w:lang w:val="en-US"/>
+        </w:rPr>
+        <w:t xml:space="preserve"> un </w:t>
+      </w:r>
+      <w:proofErr w:type="spellStart"/>
+      <w:r>
+        <w:rPr>
+          <w:lang w:val="en-US"/>
+        </w:rPr>
+        <w:t>rectangulo</w:t>
+      </w:r>
+      <w:proofErr w:type="spellEnd"/>
+      <w:r>
+        <w:rPr>
+          <w:lang w:val="en-US"/>
+        </w:rPr>
+        <w:t xml:space="preserve"> con las </w:t>
+      </w:r>
+      <w:proofErr w:type="spellStart"/>
+      <w:r>
+        <w:rPr>
+          <w:lang w:val="en-US"/>
+        </w:rPr>
+        <w:t>mismas</w:t>
+      </w:r>
+      <w:proofErr w:type="spellEnd"/>
+      <w:r>
+        <w:rPr>
+          <w:lang w:val="en-US"/>
+        </w:rPr>
+        <w:t xml:space="preserve"> </w:t>
+      </w:r>
+      <w:proofErr w:type="spellStart"/>
+      <w:r>
+        <w:rPr>
+          <w:lang w:val="en-US"/>
+        </w:rPr>
+        <w:t>caracteristicas</w:t>
+      </w:r>
+      <w:proofErr w:type="spellEnd"/>
+      <w:r>
+        <w:rPr>
+          <w:lang w:val="en-US"/>
+        </w:rPr>
+        <w:t xml:space="preserve"> que el original </w:t>
+      </w:r>
+      <w:proofErr w:type="spellStart"/>
+      <w:r>
+        <w:rPr>
+          <w:lang w:val="en-US"/>
+        </w:rPr>
+        <w:t>pero</w:t>
+      </w:r>
+      <w:proofErr w:type="spellEnd"/>
+      <w:r>
+        <w:rPr>
+          <w:lang w:val="en-US"/>
+        </w:rPr>
+        <w:t xml:space="preserve"> se </w:t>
+      </w:r>
+      <w:proofErr w:type="spellStart"/>
+      <w:r>
+        <w:rPr>
+          <w:lang w:val="en-US"/>
+        </w:rPr>
+        <w:t>ubica</w:t>
+      </w:r>
+      <w:proofErr w:type="spellEnd"/>
+      <w:r>
+        <w:rPr>
+          <w:lang w:val="en-US"/>
+        </w:rPr>
+        <w:t xml:space="preserve"> a la </w:t>
+      </w:r>
+      <w:proofErr w:type="spellStart"/>
+      <w:r>
+        <w:rPr>
+          <w:lang w:val="en-US"/>
+        </w:rPr>
+        <w:t>izquierda</w:t>
+      </w:r>
+      <w:proofErr w:type="spellEnd"/>
+      <w:r>
+        <w:rPr>
+          <w:lang w:val="en-US"/>
+        </w:rPr>
+        <w:t xml:space="preserve"> del original</w:t>
+      </w:r>
+      <w:r>
+        <w:rPr>
+          <w:lang w:val="en-US"/>
+        </w:rPr>
+        <w:t xml:space="preserve">. Tambien se </w:t>
+      </w:r>
+      <w:proofErr w:type="spellStart"/>
+      <w:r>
+        <w:rPr>
+          <w:lang w:val="en-US"/>
+        </w:rPr>
+        <w:t>implementaron</w:t>
+      </w:r>
+      <w:proofErr w:type="spellEnd"/>
+      <w:r>
+        <w:rPr>
+          <w:lang w:val="en-US"/>
+        </w:rPr>
+        <w:t xml:space="preserve"> </w:t>
+      </w:r>
+      <w:proofErr w:type="spellStart"/>
+      <w:r>
+        <w:rPr>
+          <w:lang w:val="en-US"/>
+        </w:rPr>
+        <w:t>cambiar</w:t>
+      </w:r>
+      <w:proofErr w:type="spellEnd"/>
+      <w:r>
+        <w:rPr>
+          <w:lang w:val="en-US"/>
+        </w:rPr>
+        <w:t xml:space="preserve"> </w:t>
+      </w:r>
+      <w:proofErr w:type="spellStart"/>
+      <w:r>
+        <w:rPr>
+          <w:lang w:val="en-US"/>
+        </w:rPr>
+        <w:t>directamente</w:t>
+      </w:r>
+      <w:proofErr w:type="spellEnd"/>
+      <w:r>
+        <w:rPr>
+          <w:lang w:val="en-US"/>
+        </w:rPr>
+        <w:t xml:space="preserve"> la </w:t>
+      </w:r>
+      <w:proofErr w:type="spellStart"/>
+      <w:r>
+        <w:rPr>
+          <w:lang w:val="en-US"/>
+        </w:rPr>
+        <w:t>posicion</w:t>
+      </w:r>
+      <w:proofErr w:type="spellEnd"/>
+      <w:r>
+        <w:rPr>
+          <w:lang w:val="en-US"/>
+        </w:rPr>
+        <w:t xml:space="preserve"> </w:t>
+      </w:r>
+      <w:proofErr w:type="spellStart"/>
+      <w:r>
+        <w:rPr>
+          <w:lang w:val="en-US"/>
+        </w:rPr>
+        <w:t>en</w:t>
+      </w:r>
+      <w:proofErr w:type="spellEnd"/>
+      <w:r>
+        <w:rPr>
+          <w:lang w:val="en-US"/>
+        </w:rPr>
+        <w:t xml:space="preserve"> x y </w:t>
+      </w:r>
+      <w:proofErr w:type="spellStart"/>
+      <w:r>
+        <w:rPr>
+          <w:lang w:val="en-US"/>
+        </w:rPr>
+        <w:t>en</w:t>
+      </w:r>
+      <w:proofErr w:type="spellEnd"/>
+      <w:r>
+        <w:rPr>
+          <w:lang w:val="en-US"/>
+        </w:rPr>
+        <w:t xml:space="preserve"> y del </w:t>
+      </w:r>
+      <w:proofErr w:type="spellStart"/>
+      <w:r>
+        <w:rPr>
+          <w:lang w:val="en-US"/>
+        </w:rPr>
+        <w:t>rectangulo</w:t>
+      </w:r>
+      <w:proofErr w:type="spellEnd"/>
+      <w:r>
+        <w:rPr>
+          <w:lang w:val="en-US"/>
+        </w:rPr>
+        <w:t>.</w:t>
+      </w:r>
+    </w:p>
+    <w:p>
+      <w:pPr>
+        <w:pStyle w:val="ListParagraph"/>
+        <w:spacing w:after="0"/>
+        <w:rPr>
+          <w:lang w:val="en-US"/>
+        </w:rPr>
+      </w:pPr>
+      <w:r>
+        <w:rPr>
+          <w:lang w:val="en-US"/>
+        </w:rPr>
+        <w:drawing>
+          <wp:inline distT="0" distB="0" distL="0" distR="0" wp14:anchorId="5BE66D36" wp14:editId="31F885A9">
+            <wp:extent cx="3534268" cy="4086795"/>
+            <wp:effectExtent l="0" t="0" r="9525" b="9525"/>
+            <wp:docPr id="16" name="Picture 16"/>
+            <wp:cNvGraphicFramePr>
+              <a:graphicFrameLocks xmlns:a="http://schemas.openxmlformats.org/drawingml/2006/main" noChangeAspect="1"/>
+            </wp:cNvGraphicFramePr>
+            <a:graphic xmlns:a="http://schemas.openxmlformats.org/drawingml/2006/main">
+              <a:graphicData uri="http://schemas.openxmlformats.org/drawingml/2006/picture">
+                <pic:pic xmlns:pic="http://schemas.openxmlformats.org/drawingml/2006/picture">
+                  <pic:nvPicPr>
+                    <pic:cNvPr id="1" name=""/>
+                    <pic:cNvPicPr/>
+                  </pic:nvPicPr>
+                  <pic:blipFill>
+                    <a:blip r:embed="rId23"/>
+                    <a:stretch>
+                      <a:fillRect/>
+                    </a:stretch>
+                  </pic:blipFill>
+                  <pic:spPr>
+                    <a:xfrm>
+                      <a:off x="0" y="0"/>
+                      <a:ext cx="3534268" cy="4086795"/>
+                    </a:xfrm>
+                    <a:prstGeom prst="rect">
+                      <a:avLst/>
+                    </a:prstGeom>
+                  </pic:spPr>
+                </pic:pic>
+              </a:graphicData>
+            </a:graphic>
+          </wp:inline>
+        </w:drawing>
+      </w:r>
+    </w:p>
+    <w:p>
+      <w:pPr>
+        <w:pStyle w:val="ListParagraph"/>
+        <w:spacing w:after="0"/>
+        <w:rPr>
+          <w:lang w:val="en-US"/>
+        </w:rPr>
+      </w:pPr>
+    </w:p>
+    <w:p>
+      <w:pPr>
+        <w:pStyle w:val="ListParagraph"/>
+        <w:spacing w:after="0"/>
+        <w:rPr>
+          <w:lang w:val="en-US"/>
+        </w:rPr>
+      </w:pPr>
+      <w:r>
+        <w:rPr>
+          <w:lang w:val="en-US"/>
+        </w:rPr>
+        <w:lastRenderedPageBreak/>
+        <w:drawing>
+          <wp:inline distT="0" distB="0" distL="0" distR="0" wp14:anchorId="054710B8" wp14:editId="5C566266">
+            <wp:extent cx="2721526" cy="3009900"/>
+            <wp:effectExtent l="0" t="0" r="3175" b="0"/>
+            <wp:docPr id="14" name="Picture 14"/>
+            <wp:cNvGraphicFramePr>
+              <a:graphicFrameLocks xmlns:a="http://schemas.openxmlformats.org/drawingml/2006/main" noChangeAspect="1"/>
+            </wp:cNvGraphicFramePr>
+            <a:graphic xmlns:a="http://schemas.openxmlformats.org/drawingml/2006/main">
+              <a:graphicData uri="http://schemas.openxmlformats.org/drawingml/2006/picture">
+                <pic:pic xmlns:pic="http://schemas.openxmlformats.org/drawingml/2006/picture">
+                  <pic:nvPicPr>
+                    <pic:cNvPr id="1" name=""/>
+                    <pic:cNvPicPr/>
+                  </pic:nvPicPr>
+                  <pic:blipFill>
+                    <a:blip r:embed="rId24"/>
+                    <a:stretch>
+                      <a:fillRect/>
+                    </a:stretch>
+                  </pic:blipFill>
+                  <pic:spPr>
+                    <a:xfrm>
+                      <a:off x="0" y="0"/>
+                      <a:ext cx="2725628" cy="3014436"/>
+                    </a:xfrm>
+                    <a:prstGeom prst="rect">
+                      <a:avLst/>
+                    </a:prstGeom>
+                  </pic:spPr>
+                </pic:pic>
+              </a:graphicData>
+            </a:graphic>
+          </wp:inline>
+        </w:drawing>
+      </w:r>
+      <w:r>
+        <w:rPr>
+          <w:lang w:val="en-US"/>
+        </w:rPr>
+        <w:drawing>
+          <wp:inline distT="0" distB="0" distL="0" distR="0" wp14:anchorId="20BABE29" wp14:editId="035A1357">
+            <wp:extent cx="2685935" cy="2952750"/>
+            <wp:effectExtent l="0" t="0" r="635" b="0"/>
+            <wp:docPr id="15" name="Picture 15"/>
+            <wp:cNvGraphicFramePr>
+              <a:graphicFrameLocks xmlns:a="http://schemas.openxmlformats.org/drawingml/2006/main" noChangeAspect="1"/>
+            </wp:cNvGraphicFramePr>
+            <a:graphic xmlns:a="http://schemas.openxmlformats.org/drawingml/2006/main">
+              <a:graphicData uri="http://schemas.openxmlformats.org/drawingml/2006/picture">
+                <pic:pic xmlns:pic="http://schemas.openxmlformats.org/drawingml/2006/picture">
+                  <pic:nvPicPr>
+                    <pic:cNvPr id="1" name=""/>
+                    <pic:cNvPicPr/>
+                  </pic:nvPicPr>
+                  <pic:blipFill>
+                    <a:blip r:embed="rId25"/>
+                    <a:stretch>
+                      <a:fillRect/>
+                    </a:stretch>
+                  </pic:blipFill>
+                  <pic:spPr>
+                    <a:xfrm>
+                      <a:off x="0" y="0"/>
+                      <a:ext cx="2687193" cy="2954133"/>
+                    </a:xfrm>
+                    <a:prstGeom prst="rect">
+                      <a:avLst/>
+                    </a:prstGeom>
+                  </pic:spPr>
+                </pic:pic>
+              </a:graphicData>
+            </a:graphic>
+          </wp:inline>
+        </w:drawing>
+      </w:r>
+    </w:p>
+    <w:p>
+      <w:pPr>
+        <w:pStyle w:val="ListParagraph"/>
+        <w:numPr>
+          <w:ilvl w:val="0"/>
+          <w:numId w:val="4"/>
+        </w:numPr>
+        <w:spacing w:after="0"/>
+        <w:rPr>
+          <w:lang w:val="en-US"/>
+        </w:rPr>
+      </w:pPr>
+      <w:proofErr w:type="spellStart"/>
+      <w:r>
+        <w:rPr>
+          <w:lang w:val="en-US"/>
+        </w:rPr>
+        <w:t>Generen</w:t>
+      </w:r>
+      <w:proofErr w:type="spellEnd"/>
+      <w:r>
+        <w:rPr>
+          <w:lang w:val="en-US"/>
+        </w:rPr>
+        <w:t xml:space="preserve"> </w:t>
+      </w:r>
+      <w:proofErr w:type="spellStart"/>
+      <w:r>
+        <w:rPr>
+          <w:lang w:val="en-US"/>
+        </w:rPr>
+        <w:t>nuevamente</w:t>
+      </w:r>
+      <w:proofErr w:type="spellEnd"/>
+      <w:r>
+        <w:rPr>
+          <w:lang w:val="en-US"/>
+        </w:rPr>
+        <w:t xml:space="preserve"> la </w:t>
+      </w:r>
+      <w:proofErr w:type="spellStart"/>
+      <w:r>
+        <w:rPr>
+          <w:lang w:val="en-US"/>
+        </w:rPr>
+        <w:t>documentación</w:t>
+      </w:r>
+      <w:proofErr w:type="spellEnd"/>
+      <w:r>
+        <w:rPr>
+          <w:lang w:val="en-US"/>
+        </w:rPr>
+        <w:t xml:space="preserve"> y </w:t>
+      </w:r>
+      <w:proofErr w:type="spellStart"/>
+      <w:r>
+        <w:rPr>
+          <w:lang w:val="en-US"/>
+        </w:rPr>
+        <w:t>revisen</w:t>
+      </w:r>
+      <w:proofErr w:type="spellEnd"/>
+      <w:r>
+        <w:rPr>
+          <w:lang w:val="en-US"/>
+        </w:rPr>
+        <w:t xml:space="preserve"> la </w:t>
+      </w:r>
+      <w:proofErr w:type="spellStart"/>
+      <w:r>
+        <w:rPr>
+          <w:lang w:val="en-US"/>
+        </w:rPr>
+        <w:t>información</w:t>
+      </w:r>
+      <w:proofErr w:type="spellEnd"/>
+      <w:r>
+        <w:rPr>
+          <w:lang w:val="en-US"/>
+        </w:rPr>
+        <w:t xml:space="preserve"> de </w:t>
+      </w:r>
+      <w:proofErr w:type="spellStart"/>
+      <w:r>
+        <w:rPr>
+          <w:lang w:val="en-US"/>
+        </w:rPr>
+        <w:t>estos</w:t>
+      </w:r>
+      <w:proofErr w:type="spellEnd"/>
+      <w:r>
+        <w:rPr>
+          <w:lang w:val="en-US"/>
+        </w:rPr>
+        <w:t xml:space="preserve"> </w:t>
+      </w:r>
+      <w:proofErr w:type="spellStart"/>
+      <w:r>
+        <w:rPr>
+          <w:lang w:val="en-US"/>
+        </w:rPr>
+        <w:t>nuevos</w:t>
+      </w:r>
+      <w:proofErr w:type="spellEnd"/>
+      <w:r>
+        <w:rPr>
+          <w:lang w:val="en-US"/>
+        </w:rPr>
+        <w:t xml:space="preserve"> </w:t>
+      </w:r>
+      <w:proofErr w:type="spellStart"/>
+      <w:r>
+        <w:rPr>
+          <w:lang w:val="en-US"/>
+        </w:rPr>
+        <w:t>métodos</w:t>
+      </w:r>
+      <w:proofErr w:type="spellEnd"/>
+      <w:r>
+        <w:rPr>
+          <w:lang w:val="en-US"/>
+        </w:rPr>
+        <w:t xml:space="preserve">. </w:t>
+      </w:r>
+      <w:proofErr w:type="spellStart"/>
+      <w:r>
+        <w:rPr>
+          <w:lang w:val="en-US"/>
+        </w:rPr>
+        <w:t>Capturen</w:t>
+      </w:r>
+      <w:proofErr w:type="spellEnd"/>
+      <w:r>
+        <w:rPr>
+          <w:lang w:val="en-US"/>
+        </w:rPr>
+        <w:t xml:space="preserve"> la</w:t>
+      </w:r>
+      <w:r>
+        <w:rPr>
+          <w:lang w:val="en-US"/>
+        </w:rPr>
+        <w:t xml:space="preserve"> </w:t>
+      </w:r>
+      <w:proofErr w:type="spellStart"/>
+      <w:r>
+        <w:rPr>
+          <w:lang w:val="en-US"/>
+        </w:rPr>
+        <w:t>pantalla</w:t>
+      </w:r>
+      <w:proofErr w:type="spellEnd"/>
+      <w:r>
+        <w:rPr>
+          <w:lang w:val="en-US"/>
+        </w:rPr>
+        <w:t>.</w:t>
+      </w:r>
+    </w:p>
+    <w:p>
+      <w:pPr>
+        <w:pStyle w:val="ListParagraph"/>
+        <w:rPr>
+          <w:lang w:val="en-US"/>
+        </w:rPr>
+      </w:pPr>
+    </w:p>
+    <w:p>
+      <w:pPr>
+        <w:pStyle w:val="ListParagraph"/>
+        <w:spacing w:after="0"/>
+        <w:rPr>
+          <w:lang w:val="en-US"/>
+        </w:rPr>
+      </w:pPr>
+    </w:p>
+    <w:p>
+      <w:pPr>
+        <w:spacing w:after="0"/>
+      </w:pPr>
+    </w:p>
+    <w:p>
+      <w:pPr>
+        <w:spacing w:after="0"/>
+        <w:ind w:left="720"/>
+        <w:rPr>
+          <w:u w:val="single"/>
+        </w:rPr>
+      </w:pPr>
     </w:p>
     <w:p>
       <w:pPr>
@@ -2322,7 +5287,7 @@
 </file>
 
 <file path=word/numbering.xml><?xml version="1.0" encoding="utf-8"?>
-<w:numbering xmlns:wpc="http://schemas.microsoft.com/office/word/2010/wordprocessingCanvas" xmlns:cx="http://schemas.microsoft.com/office/drawing/2014/chartex" xmlns:cx1="http://schemas.microsoft.com/office/drawing/2015/9/8/chartex" xmlns:cx2="http://schemas.microsoft.com/office/drawing/2015/10/21/chartex" xmlns:cx3="http://schemas.microsoft.com/office/drawing/2016/5/9/chartex" xmlns:cx4="http://schemas.microsoft.com/office/drawing/2016/5/10/chartex" xmlns:cx5="http://schemas.microsoft.com/office/drawing/2016/5/11/chartex" xmlns:cx6="http://schemas.microsoft.com/office/drawing/2016/5/12/chartex" xmlns:cx7="http://schemas.microsoft.com/office/drawing/2016/5/13/chartex" xmlns:cx8="http://schemas.microsoft.com/office/drawing/2016/5/14/chartex" xmlns:mc="http://schemas.openxmlformats.org/markup-compatibility/2006" xmlns:aink="http://schemas.microsoft.com/office/drawing/2016/ink" xmlns:am3d="http://schemas.microsoft.com/office/drawing/2017/model3d" xmlns:o="urn:schemas-microsoft-com:office:office" xmlns:oel="http://schemas.microsoft.com/office/2019/extlst" xmlns:r="http://schemas.openxmlformats.org/officeDocument/2006/relationships" xmlns:m="http://schemas.openxmlformats.org/officeDocument/2006/math" xmlns:v="urn:schemas-microsoft-com:vml" xmlns:wp14="http://schemas.microsoft.com/office/word/2010/wordprocessingDrawing" xmlns:wp="http://schemas.openxmlformats.org/drawingml/2006/wordprocessingDrawing" xmlns:w10="urn:schemas-microsoft-com:office:word" xmlns:w="http://schemas.openxmlformats.org/wordprocessingml/2006/main" xmlns:w14="http://schemas.microsoft.com/office/word/2010/wordml" xmlns:w15="http://schemas.microsoft.com/office/word/2012/wordml" xmlns:w16cex="http://schemas.microsoft.com/office/word/2018/wordml/cex" xmlns:w16cid="http://schemas.microsoft.com/office/word/2016/wordml/cid" xmlns:w16="http://schemas.microsoft.com/office/word/2018/wordml" xmlns:w16du="http://schemas.microsoft.com/office/word/2023/wordml/word16du" xmlns:w16sdtdh="http://schemas.microsoft.com/office/word/2020/wordml/sdtdatahash" xmlns:w16sdtfl="http://schemas.microsoft.com/office/word/2024/wordml/sdtformatlock" xmlns:w16se="http://schemas.microsoft.com/office/word/2015/wordml/symex" xmlns:wpg="http://schemas.microsoft.com/office/word/2010/wordprocessingGroup" xmlns:wpi="http://schemas.microsoft.com/office/word/2010/wordprocessingInk" xmlns:wne="http://schemas.microsoft.com/office/word/2006/wordml" xmlns:wps="http://schemas.microsoft.com/office/word/2010/wordprocessingShape" mc:Ignorable="w14 w15 w16se w16cid w16 w16cex w16sdtdh w16sdtfl w16du wp14">
+<w:numbering xmlns:wpc="http://schemas.microsoft.com/office/word/2010/wordprocessingCanvas" xmlns:cx="http://schemas.microsoft.com/office/drawing/2014/chartex" xmlns:cx1="http://schemas.microsoft.com/office/drawing/2015/9/8/chartex" xmlns:cx2="http://schemas.microsoft.com/office/drawing/2015/10/21/chartex" xmlns:cx3="http://schemas.microsoft.com/office/drawing/2016/5/9/chartex" xmlns:cx4="http://schemas.microsoft.com/office/drawing/2016/5/10/chartex" xmlns:cx5="http://schemas.microsoft.com/office/drawing/2016/5/11/chartex" xmlns:cx6="http://schemas.microsoft.com/office/drawing/2016/5/12/chartex" xmlns:cx7="http://schemas.microsoft.com/office/drawing/2016/5/13/chartex" xmlns:cx8="http://schemas.microsoft.com/office/drawing/2016/5/14/chartex" xmlns:mc="http://schemas.openxmlformats.org/markup-compatibility/2006" xmlns:aink="http://schemas.microsoft.com/office/drawing/2016/ink" xmlns:am3d="http://schemas.microsoft.com/office/drawing/2017/model3d" xmlns:o="urn:schemas-microsoft-com:office:office" xmlns:r="http://schemas.openxmlformats.org/officeDocument/2006/relationships" xmlns:m="http://schemas.openxmlformats.org/officeDocument/2006/math" xmlns:v="urn:schemas-microsoft-com:vml" xmlns:wp14="http://schemas.microsoft.com/office/word/2010/wordprocessingDrawing" xmlns:wp="http://schemas.openxmlformats.org/drawingml/2006/wordprocessingDrawing" xmlns:w10="urn:schemas-microsoft-com:office:word" xmlns:w="http://schemas.openxmlformats.org/wordprocessingml/2006/main" xmlns:w14="http://schemas.microsoft.com/office/word/2010/wordml" xmlns:w15="http://schemas.microsoft.com/office/word/2012/wordml" xmlns:w16cid="http://schemas.microsoft.com/office/word/2016/wordml/cid" xmlns:w16se="http://schemas.microsoft.com/office/word/2015/wordml/symex" xmlns:wpg="http://schemas.microsoft.com/office/word/2010/wordprocessingGroup" xmlns:wpi="http://schemas.microsoft.com/office/word/2010/wordprocessingInk" xmlns:wne="http://schemas.microsoft.com/office/word/2006/wordml" xmlns:wps="http://schemas.microsoft.com/office/word/2010/wordprocessingShape" mc:Ignorable="w14 w15 w16se w16cid wp14">
   <w:abstractNum w:abstractNumId="0" w15:restartNumberingAfterBreak="0">
     <w:nsid w:val="142457F2"/>
     <w:multiLevelType w:val="hybridMultilevel"/>
@@ -2502,6 +5467,95 @@
     </w:lvl>
   </w:abstractNum>
   <w:abstractNum w:abstractNumId="2" w15:restartNumberingAfterBreak="0">
+    <w:nsid w:val="45F05DDC"/>
+    <w:multiLevelType w:val="hybridMultilevel"/>
+    <w:tmpl w:val="D8107EA6"/>
+    <w:lvl w:ilvl="0" w:tplc="0409000F">
+      <w:start w:val="1"/>
+      <w:numFmt w:val="decimal"/>
+      <w:lvlText w:val="%1."/>
+      <w:lvlJc w:val="left"/>
+      <w:pPr>
+        <w:ind w:left="720" w:hanging="360"/>
+      </w:pPr>
+      <w:rPr>
+        <w:rFonts w:hint="default"/>
+      </w:rPr>
+    </w:lvl>
+    <w:lvl w:ilvl="1" w:tplc="04090019" w:tentative="1">
+      <w:start w:val="1"/>
+      <w:numFmt w:val="lowerLetter"/>
+      <w:lvlText w:val="%2."/>
+      <w:lvlJc w:val="left"/>
+      <w:pPr>
+        <w:ind w:left="1440" w:hanging="360"/>
+      </w:pPr>
+    </w:lvl>
+    <w:lvl w:ilvl="2" w:tplc="0409001B" w:tentative="1">
+      <w:start w:val="1"/>
+      <w:numFmt w:val="lowerRoman"/>
+      <w:lvlText w:val="%3."/>
+      <w:lvlJc w:val="right"/>
+      <w:pPr>
+        <w:ind w:left="2160" w:hanging="180"/>
+      </w:pPr>
+    </w:lvl>
+    <w:lvl w:ilvl="3" w:tplc="0409000F" w:tentative="1">
+      <w:start w:val="1"/>
+      <w:numFmt w:val="decimal"/>
+      <w:lvlText w:val="%4."/>
+      <w:lvlJc w:val="left"/>
+      <w:pPr>
+        <w:ind w:left="2880" w:hanging="360"/>
+      </w:pPr>
+    </w:lvl>
+    <w:lvl w:ilvl="4" w:tplc="04090019" w:tentative="1">
+      <w:start w:val="1"/>
+      <w:numFmt w:val="lowerLetter"/>
+      <w:lvlText w:val="%5."/>
+      <w:lvlJc w:val="left"/>
+      <w:pPr>
+        <w:ind w:left="3600" w:hanging="360"/>
+      </w:pPr>
+    </w:lvl>
+    <w:lvl w:ilvl="5" w:tplc="0409001B" w:tentative="1">
+      <w:start w:val="1"/>
+      <w:numFmt w:val="lowerRoman"/>
+      <w:lvlText w:val="%6."/>
+      <w:lvlJc w:val="right"/>
+      <w:pPr>
+        <w:ind w:left="4320" w:hanging="180"/>
+      </w:pPr>
+    </w:lvl>
+    <w:lvl w:ilvl="6" w:tplc="0409000F" w:tentative="1">
+      <w:start w:val="1"/>
+      <w:numFmt w:val="decimal"/>
+      <w:lvlText w:val="%7."/>
+      <w:lvlJc w:val="left"/>
+      <w:pPr>
+        <w:ind w:left="5040" w:hanging="360"/>
+      </w:pPr>
+    </w:lvl>
+    <w:lvl w:ilvl="7" w:tplc="04090019" w:tentative="1">
+      <w:start w:val="1"/>
+      <w:numFmt w:val="lowerLetter"/>
+      <w:lvlText w:val="%8."/>
+      <w:lvlJc w:val="left"/>
+      <w:pPr>
+        <w:ind w:left="5760" w:hanging="360"/>
+      </w:pPr>
+    </w:lvl>
+    <w:lvl w:ilvl="8" w:tplc="0409001B" w:tentative="1">
+      <w:start w:val="1"/>
+      <w:numFmt w:val="lowerRoman"/>
+      <w:lvlText w:val="%9."/>
+      <w:lvlJc w:val="right"/>
+      <w:pPr>
+        <w:ind w:left="6480" w:hanging="180"/>
+      </w:pPr>
+    </w:lvl>
+  </w:abstractNum>
+  <w:abstractNum w:abstractNumId="3" w15:restartNumberingAfterBreak="0">
     <w:nsid w:val="4FFC40AA"/>
     <w:multiLevelType w:val="hybridMultilevel"/>
     <w:tmpl w:val="6E2ADBA8"/>
@@ -2590,20 +5644,23 @@
       </w:pPr>
     </w:lvl>
   </w:abstractNum>
-  <w:num w:numId="1" w16cid:durableId="929850912">
-    <w:abstractNumId w:val="2"/>
+  <w:num w:numId="1">
+    <w:abstractNumId w:val="3"/>
   </w:num>
-  <w:num w:numId="2" w16cid:durableId="725183769">
+  <w:num w:numId="2">
     <w:abstractNumId w:val="1"/>
   </w:num>
-  <w:num w:numId="3" w16cid:durableId="1670863875">
+  <w:num w:numId="3">
     <w:abstractNumId w:val="0"/>
+  </w:num>
+  <w:num w:numId="4">
+    <w:abstractNumId w:val="2"/>
   </w:num>
 </w:numbering>
 </file>
 
 <file path=word/styles.xml><?xml version="1.0" encoding="utf-8"?>
-<w:styles xmlns:mc="http://schemas.openxmlformats.org/markup-compatibility/2006" xmlns:r="http://schemas.openxmlformats.org/officeDocument/2006/relationships" xmlns:w="http://schemas.openxmlformats.org/wordprocessingml/2006/main" xmlns:w14="http://schemas.microsoft.com/office/word/2010/wordml" xmlns:w15="http://schemas.microsoft.com/office/word/2012/wordml" xmlns:w16cex="http://schemas.microsoft.com/office/word/2018/wordml/cex" xmlns:w16cid="http://schemas.microsoft.com/office/word/2016/wordml/cid" xmlns:w16="http://schemas.microsoft.com/office/word/2018/wordml" xmlns:w16du="http://schemas.microsoft.com/office/word/2023/wordml/word16du" xmlns:w16sdtdh="http://schemas.microsoft.com/office/word/2020/wordml/sdtdatahash" xmlns:w16sdtfl="http://schemas.microsoft.com/office/word/2024/wordml/sdtformatlock" xmlns:w16se="http://schemas.microsoft.com/office/word/2015/wordml/symex" mc:Ignorable="w14 w15 w16se w16cid w16 w16cex w16sdtdh w16sdtfl w16du">
+<w:styles xmlns:mc="http://schemas.openxmlformats.org/markup-compatibility/2006" xmlns:r="http://schemas.openxmlformats.org/officeDocument/2006/relationships" xmlns:w="http://schemas.openxmlformats.org/wordprocessingml/2006/main" xmlns:w14="http://schemas.microsoft.com/office/word/2010/wordml" xmlns:w15="http://schemas.microsoft.com/office/word/2012/wordml" xmlns:w16cid="http://schemas.microsoft.com/office/word/2016/wordml/cid" xmlns:w16se="http://schemas.microsoft.com/office/word/2015/wordml/symex" mc:Ignorable="w14 w15 w16se w16cid">
   <w:docDefaults>
     <w:rPrDefault>
       <w:rPr>
@@ -2619,7 +5676,7 @@
       </w:pPr>
     </w:pPrDefault>
   </w:docDefaults>
-  <w:latentStyles w:defLockedState="0" w:defUIPriority="99" w:defSemiHidden="0" w:defUnhideWhenUsed="0" w:defQFormat="0" w:count="376">
+  <w:latentStyles w:defLockedState="0" w:defUIPriority="99" w:defSemiHidden="0" w:defUnhideWhenUsed="0" w:defQFormat="0" w:count="375">
     <w:lsdException w:name="Normal" w:uiPriority="0" w:qFormat="1"/>
     <w:lsdException w:name="heading 1" w:uiPriority="9" w:qFormat="1"/>
     <w:lsdException w:name="heading 2" w:semiHidden="1" w:uiPriority="9" w:unhideWhenUsed="1" w:qFormat="1"/>
@@ -2995,7 +6052,6 @@
     <w:lsdException w:name="Smart Hyperlink" w:semiHidden="1" w:unhideWhenUsed="1"/>
     <w:lsdException w:name="Hashtag" w:semiHidden="1" w:unhideWhenUsed="1"/>
     <w:lsdException w:name="Unresolved Mention" w:semiHidden="1" w:unhideWhenUsed="1"/>
-    <w:lsdException w:name="Smart Link" w:semiHidden="1" w:unhideWhenUsed="1"/>
   </w:latentStyles>
   <w:style w:type="paragraph" w:default="1" w:styleId="Normal">
     <w:name w:val="Normal"/>
@@ -3004,13 +6060,13 @@
       <w:lang w:val="es-CO"/>
     </w:rPr>
   </w:style>
-  <w:style w:type="character" w:default="1" w:styleId="Fuentedeprrafopredeter">
+  <w:style w:type="character" w:default="1" w:styleId="DefaultParagraphFont">
     <w:name w:val="Default Paragraph Font"/>
     <w:uiPriority w:val="1"/>
     <w:semiHidden/>
     <w:unhideWhenUsed/>
   </w:style>
-  <w:style w:type="table" w:default="1" w:styleId="Tablanormal">
+  <w:style w:type="table" w:default="1" w:styleId="TableNormal">
     <w:name w:val="Normal Table"/>
     <w:uiPriority w:val="99"/>
     <w:semiHidden/>
@@ -3025,13 +6081,13 @@
       </w:tblCellMar>
     </w:tblPr>
   </w:style>
-  <w:style w:type="numbering" w:default="1" w:styleId="Sinlista">
+  <w:style w:type="numbering" w:default="1" w:styleId="NoList">
     <w:name w:val="No List"/>
     <w:uiPriority w:val="99"/>
     <w:semiHidden/>
     <w:unhideWhenUsed/>
   </w:style>
-  <w:style w:type="paragraph" w:styleId="Prrafodelista">
+  <w:style w:type="paragraph" w:styleId="ListParagraph">
     <w:name w:val="List Paragraph"/>
     <w:basedOn w:val="Normal"/>
     <w:uiPriority w:val="34"/>
@@ -3041,6 +6097,42 @@
       <w:ind w:left="720"/>
       <w:contextualSpacing/>
     </w:pPr>
+  </w:style>
+  <w:style w:type="paragraph" w:styleId="NormalWeb">
+    <w:name w:val="Normal (Web)"/>
+    <w:basedOn w:val="Normal"/>
+    <w:uiPriority w:val="99"/>
+    <w:semiHidden/>
+    <w:unhideWhenUsed/>
+    <w:rsid w:val="00032A8E"/>
+    <w:pPr>
+      <w:spacing w:before="100" w:beforeAutospacing="1" w:after="100" w:afterAutospacing="1" w:line="240" w:lineRule="auto"/>
+    </w:pPr>
+    <w:rPr>
+      <w:rFonts w:ascii="Times New Roman" w:eastAsia="Times New Roman" w:hAnsi="Times New Roman" w:cs="Times New Roman"/>
+      <w:sz w:val="24"/>
+      <w:szCs w:val="24"/>
+      <w:lang w:val="en-US"/>
+    </w:rPr>
+  </w:style>
+  <w:style w:type="table" w:styleId="TableGrid">
+    <w:name w:val="Table Grid"/>
+    <w:basedOn w:val="TableNormal"/>
+    <w:uiPriority w:val="39"/>
+    <w:rsid w:val="00032A8E"/>
+    <w:pPr>
+      <w:spacing w:after="0" w:line="240" w:lineRule="auto"/>
+    </w:pPr>
+    <w:tblPr>
+      <w:tblBorders>
+        <w:top w:val="single" w:sz="4" w:space="0" w:color="auto"/>
+        <w:left w:val="single" w:sz="4" w:space="0" w:color="auto"/>
+        <w:bottom w:val="single" w:sz="4" w:space="0" w:color="auto"/>
+        <w:right w:val="single" w:sz="4" w:space="0" w:color="auto"/>
+        <w:insideH w:val="single" w:sz="4" w:space="0" w:color="auto"/>
+        <w:insideV w:val="single" w:sz="4" w:space="0" w:color="auto"/>
+      </w:tblBorders>
+    </w:tblPr>
   </w:style>
 </w:styles>
 </file>
@@ -3338,4 +6430,16 @@
     </a:ext>
   </a:extLst>
 </a:theme>
+</file>
+
+<file path=customXml/item1.xml><?xml version="1.0" encoding="utf-8"?>
+<b:Sources xmlns:b="http://schemas.openxmlformats.org/officeDocument/2006/bibliography" xmlns="http://schemas.openxmlformats.org/officeDocument/2006/bibliography" SelectedStyle="\APASixthEditionOfficeOnline.xsl" StyleName="APA" Version="6"/>
+</file>
+
+<file path=customXml/itemProps1.xml><?xml version="1.0" encoding="utf-8"?>
+<ds:datastoreItem xmlns:ds="http://schemas.openxmlformats.org/officeDocument/2006/customXml" ds:itemID="{9834F509-DBE7-43EA-B2BB-B17D8A146A53}">
+  <ds:schemaRefs>
+    <ds:schemaRef ds:uri="http://schemas.openxmlformats.org/officeDocument/2006/bibliography"/>
+  </ds:schemaRefs>
+</ds:datastoreItem>
 </file>
</xml_diff>

<commit_message>
cambie algo del docs
</commit_message>
<xml_diff>
--- a/laboratorio 1/Laboratorio 1.docx
+++ b/laboratorio 1/Laboratorio 1.docx
@@ -2220,18 +2220,12 @@
           <w:numId w:val="4"/>
         </w:numPr>
         <w:spacing w:after="0"/>
-        <w:rPr>
-          <w:lang w:val="en-US"/>
-        </w:rPr>
       </w:pPr>
       <w:r>
         <w:lastRenderedPageBreak/>
         <w:t xml:space="preserve"> Desarrollen en Rectangle el método zoom(z: char) (aumenta (+) o disminuye (-) 100 % el perímetro manteniendo la proporción). </w:t>
       </w:r>
       <w:r>
-        <w:rPr>
-          <w:lang w:val="en-US"/>
-        </w:rPr>
         <w:t>¡Pruébenlo! Capturen dos pantallas.</w:t>
       </w:r>
     </w:p>
@@ -2723,6 +2717,7 @@
       </w:pPr>
       <w:r>
         <w:rPr>
+          <w:noProof/>
           <w:lang w:val="en-US"/>
         </w:rPr>
         <w:drawing>
@@ -2783,12 +2778,81 @@
     <w:p>
       <w:pPr>
         <w:spacing w:after="0"/>
+      </w:pPr>
+    </w:p>
+    <w:p>
+      <w:pPr>
+        <w:spacing w:after="0"/>
+      </w:pPr>
+    </w:p>
+    <w:p>
+      <w:pPr>
+        <w:spacing w:after="0"/>
+      </w:pPr>
+    </w:p>
+    <w:p>
+      <w:pPr>
+        <w:spacing w:after="0"/>
+      </w:pPr>
+    </w:p>
+    <w:p>
+      <w:pPr>
+        <w:spacing w:after="0"/>
+      </w:pPr>
+    </w:p>
+    <w:p>
+      <w:pPr>
+        <w:spacing w:after="0"/>
+      </w:pPr>
+    </w:p>
+    <w:p>
+      <w:pPr>
+        <w:spacing w:after="0"/>
+      </w:pPr>
+    </w:p>
+    <w:p>
+      <w:pPr>
+        <w:spacing w:after="0"/>
+      </w:pPr>
+    </w:p>
+    <w:p>
+      <w:pPr>
+        <w:spacing w:after="0"/>
+      </w:pPr>
+    </w:p>
+    <w:p>
+      <w:pPr>
+        <w:spacing w:after="0"/>
+      </w:pPr>
+    </w:p>
+    <w:p>
+      <w:pPr>
+        <w:spacing w:after="0"/>
+      </w:pPr>
+    </w:p>
+    <w:p>
+      <w:pPr>
+        <w:spacing w:after="0"/>
+      </w:pPr>
+    </w:p>
+    <w:p>
+      <w:pPr>
+        <w:spacing w:after="0"/>
+      </w:pPr>
+    </w:p>
+    <w:p>
+      <w:pPr>
+        <w:spacing w:after="0"/>
+      </w:pPr>
+    </w:p>
+    <w:p>
+      <w:pPr>
+        <w:spacing w:after="0"/>
         <w:rPr>
           <w:b/>
           <w:bCs/>
           <w:sz w:val="28"/>
           <w:szCs w:val="28"/>
-          <w:lang w:val="en-US"/>
         </w:rPr>
       </w:pPr>
       <w:r>
@@ -2797,8 +2861,8 @@
           <w:bCs/>
           <w:sz w:val="28"/>
           <w:szCs w:val="28"/>
-          <w:lang w:val="en-US"/>
-        </w:rPr>
+        </w:rPr>
+        <w:lastRenderedPageBreak/>
         <w:t>3. HungrySnakeGame</w:t>
       </w:r>
     </w:p>
@@ -2810,7 +2874,6 @@
           <w:bCs/>
           <w:sz w:val="28"/>
           <w:szCs w:val="28"/>
-          <w:lang w:val="en-US"/>
         </w:rPr>
       </w:pPr>
     </w:p>
@@ -2860,10 +2923,10 @@
       </w:pPr>
       <w:r>
         <w:drawing>
-          <wp:inline distT="0" distB="0" distL="0" distR="0" wp14:anchorId="6CDADBB0" wp14:editId="3D877378">
-            <wp:extent cx="3153215" cy="838317"/>
-            <wp:effectExtent l="0" t="0" r="9525" b="0"/>
-            <wp:docPr id="1800504040" name="Imagen 1" descr="Texto&#10;&#10;El contenido generado por IA puede ser incorrecto."/>
+          <wp:inline distT="0" distB="0" distL="0" distR="0" wp14:anchorId="641DB9F0" wp14:editId="63731D7A">
+            <wp:extent cx="4248743" cy="1590897"/>
+            <wp:effectExtent l="0" t="0" r="0" b="9525"/>
+            <wp:docPr id="1394683451" name="Imagen 1"/>
             <wp:cNvGraphicFramePr>
               <a:graphicFrameLocks xmlns:a="http://schemas.openxmlformats.org/drawingml/2006/main" noChangeAspect="1"/>
             </wp:cNvGraphicFramePr>
@@ -2871,7 +2934,7 @@
               <a:graphicData uri="http://schemas.openxmlformats.org/drawingml/2006/picture">
                 <pic:pic xmlns:pic="http://schemas.openxmlformats.org/drawingml/2006/picture">
                   <pic:nvPicPr>
-                    <pic:cNvPr id="1800504040" name="Imagen 1" descr="Texto&#10;&#10;El contenido generado por IA puede ser incorrecto."/>
+                    <pic:cNvPr id="1394683451" name=""/>
                     <pic:cNvPicPr/>
                   </pic:nvPicPr>
                   <pic:blipFill>
@@ -2883,7 +2946,7 @@
                   <pic:spPr>
                     <a:xfrm>
                       <a:off x="0" y="0"/>
-                      <a:ext cx="3153215" cy="838317"/>
+                      <a:ext cx="4248743" cy="1590897"/>
                     </a:xfrm>
                     <a:prstGeom prst="rect">
                       <a:avLst/>
@@ -2906,7 +2969,6 @@
         <w:spacing w:after="0"/>
       </w:pPr>
       <w:r>
-        <w:lastRenderedPageBreak/>
         <w:t>Escogí estos atributos por las siguientes razones:</w:t>
       </w:r>
       <w:r>
@@ -2938,7 +3000,21 @@
         <w:spacing w:after="0"/>
       </w:pPr>
       <w:r>
-        <w:t>4) el utlmo es para saber que color tiene la serpiente</w:t>
+        <w:t xml:space="preserve">4) </w:t>
+      </w:r>
+      <w:r>
+        <w:t>color</w:t>
+      </w:r>
+      <w:r>
+        <w:t xml:space="preserve"> es para saber que color tiene la serpiente</w:t>
+      </w:r>
+    </w:p>
+    <w:p>
+      <w:pPr>
+        <w:spacing w:after="0"/>
+      </w:pPr>
+      <w:r>
+        <w:t>5) isOk es para saber si tiene puede ir sitio</w:t>
       </w:r>
     </w:p>
     <w:p>

</xml_diff>

<commit_message>
termine el docs y corregi un poco de codigo
</commit_message>
<xml_diff>
--- a/laboratorio 1/Laboratorio 1.docx
+++ b/laboratorio 1/Laboratorio 1.docx
@@ -14,12 +14,36 @@
     </w:p>
     <w:p>
       <w:r>
-        <w:t>A Conociendo el proyecto shapes. [En lab01.doc]</w:t>
-      </w:r>
-    </w:p>
-    <w:p>
-      <w:r>
-        <w:t>1. El proyecto shapes es una versión modificada de un recurso ofrecido por BlueJ. Para trabajar con él, bajen y ábranlo en BlueJ1. Capturen la pantalla.</w:t>
+        <w:t xml:space="preserve">A Conociendo el proyecto </w:t>
+      </w:r>
+      <w:proofErr w:type="spellStart"/>
+      <w:r>
+        <w:t>shapes</w:t>
+      </w:r>
+      <w:proofErr w:type="spellEnd"/>
+      <w:r>
+        <w:t>. [En lab01.doc]</w:t>
+      </w:r>
+    </w:p>
+    <w:p>
+      <w:r>
+        <w:t xml:space="preserve">1. El proyecto </w:t>
+      </w:r>
+      <w:proofErr w:type="spellStart"/>
+      <w:r>
+        <w:t>shapes</w:t>
+      </w:r>
+      <w:proofErr w:type="spellEnd"/>
+      <w:r>
+        <w:t xml:space="preserve"> es una versión modificada de un recurso ofrecido por </w:t>
+      </w:r>
+      <w:proofErr w:type="spellStart"/>
+      <w:r>
+        <w:t>BlueJ</w:t>
+      </w:r>
+      <w:proofErr w:type="spellEnd"/>
+      <w:r>
+        <w:t>. Para trabajar con él, bajen y ábranlo en BlueJ1. Capturen la pantalla.</w:t>
       </w:r>
     </w:p>
     <w:p>
@@ -79,7 +103,15 @@
         <w:jc w:val="both"/>
       </w:pPr>
       <w:r>
-        <w:t>Considerando el diagrama de clases de shapes: (a) ¿Qué clases ofrece? (b) ¿Qué relaciones existen entre</w:t>
+        <w:t xml:space="preserve">Considerando el diagrama de clases de </w:t>
+      </w:r>
+      <w:proofErr w:type="spellStart"/>
+      <w:r>
+        <w:t>shapes</w:t>
+      </w:r>
+      <w:proofErr w:type="spellEnd"/>
+      <w:r>
+        <w:t>: (a) ¿Qué clases ofrece? (b) ¿Qué relaciones existen entre</w:t>
       </w:r>
     </w:p>
     <w:p>
@@ -96,24 +128,89 @@
         <w:spacing w:after="0"/>
         <w:jc w:val="both"/>
       </w:pPr>
-      <w:r>
-        <w:t>Rta a: nos ofrece 4 clases el canvas, el circle , el triangl</w:t>
+      <w:proofErr w:type="spellStart"/>
+      <w:r>
+        <w:t>Rta</w:t>
+      </w:r>
+      <w:proofErr w:type="spellEnd"/>
+      <w:r>
+        <w:t xml:space="preserve"> a: nos ofrece 4 clases el </w:t>
+      </w:r>
+      <w:proofErr w:type="spellStart"/>
+      <w:r>
+        <w:t>canvas</w:t>
+      </w:r>
+      <w:proofErr w:type="spellEnd"/>
+      <w:r>
+        <w:t xml:space="preserve">, el </w:t>
+      </w:r>
+      <w:proofErr w:type="spellStart"/>
+      <w:r>
+        <w:t>circle</w:t>
+      </w:r>
+      <w:proofErr w:type="spellEnd"/>
+      <w:r>
+        <w:t xml:space="preserve"> , el </w:t>
+      </w:r>
+      <w:proofErr w:type="spellStart"/>
+      <w:r>
+        <w:t>triangl</w:t>
       </w:r>
       <w:r>
         <w:t>e</w:t>
       </w:r>
-      <w:r>
-        <w:t xml:space="preserve"> y el rectangulo</w:t>
-      </w:r>
+      <w:proofErr w:type="spellEnd"/>
+      <w:r>
+        <w:t xml:space="preserve"> y el </w:t>
+      </w:r>
+      <w:proofErr w:type="spellStart"/>
+      <w:r>
+        <w:t>rectangulo</w:t>
+      </w:r>
+      <w:proofErr w:type="spellEnd"/>
     </w:p>
     <w:p>
       <w:pPr>
         <w:spacing w:after="0"/>
         <w:jc w:val="both"/>
       </w:pPr>
-      <w:r>
-        <w:t>Rta b: la relaciones que existen entre estas clases es que la clase traingulo,circulo y rectangulo son dependientes de el  canvas</w:t>
-      </w:r>
+      <w:proofErr w:type="spellStart"/>
+      <w:r>
+        <w:t>Rta</w:t>
+      </w:r>
+      <w:proofErr w:type="spellEnd"/>
+      <w:r>
+        <w:t xml:space="preserve"> b: la relaciones que existen entre estas clases es que la clase </w:t>
+      </w:r>
+      <w:proofErr w:type="spellStart"/>
+      <w:r>
+        <w:t>traingulo,circulo</w:t>
+      </w:r>
+      <w:proofErr w:type="spellEnd"/>
+      <w:r>
+        <w:t xml:space="preserve"> y </w:t>
+      </w:r>
+      <w:proofErr w:type="spellStart"/>
+      <w:r>
+        <w:t>rectangulo</w:t>
+      </w:r>
+      <w:proofErr w:type="spellEnd"/>
+      <w:r>
+        <w:t xml:space="preserve"> son dependientes </w:t>
+      </w:r>
+      <w:proofErr w:type="spellStart"/>
+      <w:r>
+        <w:t>de el</w:t>
+      </w:r>
+      <w:proofErr w:type="spellEnd"/>
+      <w:r>
+        <w:t xml:space="preserve">  </w:t>
+      </w:r>
+      <w:proofErr w:type="spellStart"/>
+      <w:r>
+        <w:t>canvas</w:t>
+      </w:r>
+      <w:proofErr w:type="spellEnd"/>
     </w:p>
     <w:p/>
     <w:p>
@@ -123,38 +220,110 @@
       <w:r>
         <w:t xml:space="preserve">3. La documentación2 presenta las clases del proyecto y, en este caso, la especificación de sus </w:t>
       </w:r>
-      <w:r>
-        <w:t xml:space="preserve">components </w:t>
-      </w:r>
-      <w:r>
-        <w:t>públicos. Genere la documentación. De acuerdo con la documentación: (a) ¿Qué clases tiene el paquete shapes? (b) ¿Qué atributos tiene la clase Rectangle? (c) ¿Cuántos métodos ofrece la clase Rectangle? (d)¿Qué atributos determinan el tamaño de un Rectangle? (e) ¿Cuáles métodos ofrece la clase Rectangle para cambiar su tamaño?</w:t>
-      </w:r>
-    </w:p>
-    <w:p>
-      <w:pPr>
-        <w:spacing w:after="0"/>
-      </w:pPr>
-    </w:p>
-    <w:p>
-      <w:pPr>
-        <w:spacing w:after="0"/>
-        <w:rPr>
-          <w:lang w:val="en-US"/>
-        </w:rPr>
-      </w:pPr>
-      <w:r>
-        <w:rPr>
-          <w:lang w:val="en-US"/>
-        </w:rPr>
-        <w:t>Rta a: canvas, triangle,circule and rectangle</w:t>
-      </w:r>
-    </w:p>
-    <w:p>
-      <w:pPr>
-        <w:spacing w:after="0"/>
-      </w:pPr>
-      <w:r>
-        <w:t xml:space="preserve">Rta b: en la documentación </w:t>
+      <w:proofErr w:type="spellStart"/>
+      <w:r>
+        <w:t>components</w:t>
+      </w:r>
+      <w:proofErr w:type="spellEnd"/>
+      <w:r>
+        <w:t xml:space="preserve"> </w:t>
+      </w:r>
+      <w:r>
+        <w:t xml:space="preserve">públicos. Genere la documentación. De acuerdo con la documentación: (a) ¿Qué clases tiene el paquete </w:t>
+      </w:r>
+      <w:proofErr w:type="spellStart"/>
+      <w:r>
+        <w:t>shapes</w:t>
+      </w:r>
+      <w:proofErr w:type="spellEnd"/>
+      <w:r>
+        <w:t xml:space="preserve">? (b) ¿Qué atributos tiene la clase </w:t>
+      </w:r>
+      <w:proofErr w:type="spellStart"/>
+      <w:r>
+        <w:t>Rectangle</w:t>
+      </w:r>
+      <w:proofErr w:type="spellEnd"/>
+      <w:r>
+        <w:t xml:space="preserve">? (c) ¿Cuántos métodos ofrece la clase </w:t>
+      </w:r>
+      <w:proofErr w:type="spellStart"/>
+      <w:r>
+        <w:t>Rectangle</w:t>
+      </w:r>
+      <w:proofErr w:type="spellEnd"/>
+      <w:r>
+        <w:t xml:space="preserve">? (d)¿Qué atributos determinan el tamaño de un </w:t>
+      </w:r>
+      <w:proofErr w:type="spellStart"/>
+      <w:r>
+        <w:t>Rectangle</w:t>
+      </w:r>
+      <w:proofErr w:type="spellEnd"/>
+      <w:r>
+        <w:t xml:space="preserve">? (e) ¿Cuáles métodos ofrece la clase </w:t>
+      </w:r>
+      <w:proofErr w:type="spellStart"/>
+      <w:r>
+        <w:t>Rectangle</w:t>
+      </w:r>
+      <w:proofErr w:type="spellEnd"/>
+      <w:r>
+        <w:t xml:space="preserve"> para cambiar su tamaño?</w:t>
+      </w:r>
+    </w:p>
+    <w:p>
+      <w:pPr>
+        <w:spacing w:after="0"/>
+      </w:pPr>
+    </w:p>
+    <w:p>
+      <w:pPr>
+        <w:spacing w:after="0"/>
+        <w:rPr>
+          <w:lang w:val="en-US"/>
+        </w:rPr>
+      </w:pPr>
+      <w:proofErr w:type="spellStart"/>
+      <w:r>
+        <w:rPr>
+          <w:lang w:val="en-US"/>
+        </w:rPr>
+        <w:t>Rta</w:t>
+      </w:r>
+      <w:proofErr w:type="spellEnd"/>
+      <w:r>
+        <w:rPr>
+          <w:lang w:val="en-US"/>
+        </w:rPr>
+        <w:t xml:space="preserve"> a: canvas, </w:t>
+      </w:r>
+      <w:proofErr w:type="spellStart"/>
+      <w:r>
+        <w:rPr>
+          <w:lang w:val="en-US"/>
+        </w:rPr>
+        <w:t>triangle,circule</w:t>
+      </w:r>
+      <w:proofErr w:type="spellEnd"/>
+      <w:r>
+        <w:rPr>
+          <w:lang w:val="en-US"/>
+        </w:rPr>
+        <w:t xml:space="preserve"> and rectangle</w:t>
+      </w:r>
+    </w:p>
+    <w:p>
+      <w:pPr>
+        <w:spacing w:after="0"/>
+      </w:pPr>
+      <w:proofErr w:type="spellStart"/>
+      <w:r>
+        <w:t>Rta</w:t>
+      </w:r>
+      <w:proofErr w:type="spellEnd"/>
+      <w:r>
+        <w:t xml:space="preserve"> b: en la documentación </w:t>
       </w:r>
       <w:r>
         <w:t>solo aparece un atributo que es EDGES</w:t>
@@ -164,31 +333,61 @@
       <w:pPr>
         <w:spacing w:after="0"/>
       </w:pPr>
+      <w:proofErr w:type="spellStart"/>
       <w:r>
         <w:t>R</w:t>
       </w:r>
       <w:r>
         <w:t>ta</w:t>
       </w:r>
-      <w:r>
-        <w:t xml:space="preserve"> c: 13 métodos incluyendo el metodo constructor</w:t>
-      </w:r>
-    </w:p>
-    <w:p>
-      <w:pPr>
-        <w:spacing w:after="0"/>
-      </w:pPr>
-      <w:r>
-        <w:t>Rta d: lo determinan los atributos height,width</w:t>
-      </w:r>
-    </w:p>
-    <w:p>
-      <w:pPr>
-        <w:spacing w:after="0"/>
-      </w:pPr>
-      <w:r>
-        <w:t>Rta e: solo changeSize</w:t>
-      </w:r>
+      <w:proofErr w:type="spellEnd"/>
+      <w:r>
+        <w:t xml:space="preserve"> c: 13 métodos incluyendo el </w:t>
+      </w:r>
+      <w:proofErr w:type="spellStart"/>
+      <w:r>
+        <w:t>metodo</w:t>
+      </w:r>
+      <w:proofErr w:type="spellEnd"/>
+      <w:r>
+        <w:t xml:space="preserve"> constructor</w:t>
+      </w:r>
+    </w:p>
+    <w:p>
+      <w:pPr>
+        <w:spacing w:after="0"/>
+      </w:pPr>
+      <w:proofErr w:type="spellStart"/>
+      <w:r>
+        <w:t>Rta</w:t>
+      </w:r>
+      <w:proofErr w:type="spellEnd"/>
+      <w:r>
+        <w:t xml:space="preserve"> d: lo determinan los atributos </w:t>
+      </w:r>
+      <w:proofErr w:type="spellStart"/>
+      <w:r>
+        <w:t>height,width</w:t>
+      </w:r>
+      <w:proofErr w:type="spellEnd"/>
+    </w:p>
+    <w:p>
+      <w:pPr>
+        <w:spacing w:after="0"/>
+      </w:pPr>
+      <w:proofErr w:type="spellStart"/>
+      <w:r>
+        <w:t>Rta</w:t>
+      </w:r>
+      <w:proofErr w:type="spellEnd"/>
+      <w:r>
+        <w:t xml:space="preserve"> e: solo </w:t>
+      </w:r>
+      <w:proofErr w:type="spellStart"/>
+      <w:r>
+        <w:t>changeSize</w:t>
+      </w:r>
+      <w:proofErr w:type="spellEnd"/>
     </w:p>
     <w:p>
       <w:pPr>
@@ -203,8 +402,13 @@
       <w:pPr>
         <w:spacing w:after="0"/>
       </w:pPr>
-      <w:r>
-        <w:t>Rectangle. Con respecto a los atributos: (a) ¿Cuántos atributos realmente tiene? (b) ¿Quiénes pueden</w:t>
+      <w:proofErr w:type="spellStart"/>
+      <w:r>
+        <w:t>Rectangle</w:t>
+      </w:r>
+      <w:proofErr w:type="spellEnd"/>
+      <w:r>
+        <w:t>. Con respecto a los atributos: (a) ¿Cuántos atributos realmente tiene? (b) ¿Quiénes pueden</w:t>
       </w:r>
     </w:p>
     <w:p>
@@ -224,32 +428,52 @@
       <w:pPr>
         <w:spacing w:after="0"/>
       </w:pPr>
-      <w:r>
-        <w:t>Rta a: tiene 7 atributos</w:t>
-      </w:r>
-    </w:p>
-    <w:p>
-      <w:pPr>
-        <w:spacing w:after="0"/>
-      </w:pPr>
-      <w:r>
-        <w:t>Rta b: todos los objetos</w:t>
-      </w:r>
-    </w:p>
-    <w:p>
-      <w:pPr>
-        <w:spacing w:after="0"/>
-      </w:pPr>
-      <w:r>
-        <w:t>Rta c: 15 contando el método constructor</w:t>
-      </w:r>
-    </w:p>
-    <w:p>
-      <w:pPr>
-        <w:spacing w:after="0"/>
-      </w:pPr>
-      <w:r>
-        <w:t>Rta d: el propio objeto</w:t>
+      <w:proofErr w:type="spellStart"/>
+      <w:r>
+        <w:t>Rta</w:t>
+      </w:r>
+      <w:proofErr w:type="spellEnd"/>
+      <w:r>
+        <w:t xml:space="preserve"> a: tiene 7 atributos</w:t>
+      </w:r>
+    </w:p>
+    <w:p>
+      <w:pPr>
+        <w:spacing w:after="0"/>
+      </w:pPr>
+      <w:proofErr w:type="spellStart"/>
+      <w:r>
+        <w:t>Rta</w:t>
+      </w:r>
+      <w:proofErr w:type="spellEnd"/>
+      <w:r>
+        <w:t xml:space="preserve"> b: todos los objetos</w:t>
+      </w:r>
+    </w:p>
+    <w:p>
+      <w:pPr>
+        <w:spacing w:after="0"/>
+      </w:pPr>
+      <w:proofErr w:type="spellStart"/>
+      <w:r>
+        <w:t>Rta</w:t>
+      </w:r>
+      <w:proofErr w:type="spellEnd"/>
+      <w:r>
+        <w:t xml:space="preserve"> c: 15 contando el método constructor</w:t>
+      </w:r>
+    </w:p>
+    <w:p>
+      <w:pPr>
+        <w:spacing w:after="0"/>
+      </w:pPr>
+      <w:proofErr w:type="spellStart"/>
+      <w:r>
+        <w:t>Rta</w:t>
+      </w:r>
+      <w:proofErr w:type="spellEnd"/>
+      <w:r>
+        <w:t xml:space="preserve"> d: el propio objeto</w:t>
       </w:r>
     </w:p>
     <w:p>
@@ -280,8 +504,13 @@
       <w:pPr>
         <w:spacing w:after="0"/>
       </w:pPr>
-      <w:r>
-        <w:t>Rta a:</w:t>
+      <w:proofErr w:type="spellStart"/>
+      <w:r>
+        <w:t>Rta</w:t>
+      </w:r>
+      <w:proofErr w:type="spellEnd"/>
+      <w:r>
+        <w:t xml:space="preserve"> a:</w:t>
       </w:r>
     </w:p>
     <w:p>
@@ -389,20 +618,33 @@
         <w:spacing w:after="0"/>
       </w:pPr>
       <w:r>
-        <w:t xml:space="preserve">Rtab : los atributos y el funcionamiento de los metodos </w:t>
-      </w:r>
-    </w:p>
-    <w:p>
-      <w:pPr>
-        <w:spacing w:after="0"/>
-      </w:pPr>
-    </w:p>
-    <w:p>
-      <w:pPr>
-        <w:spacing w:after="0"/>
-      </w:pPr>
-      <w:r>
-        <w:t xml:space="preserve">Rta c: porque </w:t>
+        <w:t xml:space="preserve">Rtab : los atributos y el funcionamiento de los </w:t>
+      </w:r>
+      <w:proofErr w:type="spellStart"/>
+      <w:r>
+        <w:t>metodos</w:t>
+      </w:r>
+      <w:proofErr w:type="spellEnd"/>
+      <w:r>
+        <w:t xml:space="preserve"> </w:t>
+      </w:r>
+    </w:p>
+    <w:p>
+      <w:pPr>
+        <w:spacing w:after="0"/>
+      </w:pPr>
+    </w:p>
+    <w:p>
+      <w:pPr>
+        <w:spacing w:after="0"/>
+      </w:pPr>
+      <w:proofErr w:type="spellStart"/>
+      <w:r>
+        <w:t>Rta</w:t>
+      </w:r>
+      <w:proofErr w:type="spellEnd"/>
+      <w:r>
+        <w:t xml:space="preserve"> c: porque </w:t>
       </w:r>
       <w:r>
         <w:t>los atributos faltan en la documentación, y el funcionamiento no debe ir en la documentación solo el COMO,QUIERO,PARA PODER</w:t>
@@ -418,63 +660,150 @@
         <w:spacing w:after="0"/>
       </w:pPr>
       <w:r>
-        <w:t>6. En el código de la clase Rectangle, revise el atributo EDGES. (a) ¿Qué significa que sea public? (b) ¿Qué</w:t>
-      </w:r>
-    </w:p>
-    <w:p>
-      <w:pPr>
-        <w:spacing w:after="0"/>
-      </w:pPr>
-      <w:r>
-        <w:t>significa que sea static? (c) ¿Qué significa que sea final?</w:t>
-      </w:r>
-    </w:p>
-    <w:p>
-      <w:pPr>
-        <w:spacing w:after="0"/>
-      </w:pPr>
-    </w:p>
-    <w:p>
-      <w:pPr>
-        <w:spacing w:after="0"/>
-      </w:pPr>
-      <w:r>
-        <w:t>Rta a: significa que cualquiera objeto,clase o usuario puede acceder a ese atributo</w:t>
-      </w:r>
-    </w:p>
-    <w:p>
-      <w:pPr>
-        <w:spacing w:after="0"/>
-      </w:pPr>
-      <w:r>
-        <w:t xml:space="preserve">Rta b: que tiene el mismo valor para todo objeto que pertenezca a rectángulo </w:t>
-      </w:r>
-    </w:p>
-    <w:p>
-      <w:pPr>
-        <w:spacing w:after="0"/>
-      </w:pPr>
-      <w:r>
-        <w:t>Rrta c: significa que no se puede editar mediante metodos, posteriormente</w:t>
-      </w:r>
-    </w:p>
-    <w:p>
-      <w:pPr>
-        <w:spacing w:after="0"/>
-      </w:pPr>
-    </w:p>
-    <w:p>
-      <w:pPr>
-        <w:spacing w:after="0"/>
-      </w:pPr>
-      <w:r>
-        <w:t>7. En el código de la clase Rectangle revisen el detalle del tipo del atributo width. (a) ¿Qué se está indicando</w:t>
+        <w:t xml:space="preserve">6. En el código de la clase </w:t>
+      </w:r>
+      <w:proofErr w:type="spellStart"/>
+      <w:r>
+        <w:t>Rectangle</w:t>
+      </w:r>
+      <w:proofErr w:type="spellEnd"/>
+      <w:r>
+        <w:t xml:space="preserve">, revise el atributo EDGES. (a) ¿Qué significa que sea </w:t>
+      </w:r>
+      <w:proofErr w:type="spellStart"/>
+      <w:r>
+        <w:t>public</w:t>
+      </w:r>
+      <w:proofErr w:type="spellEnd"/>
+      <w:r>
+        <w:t>? (b) ¿Qué</w:t>
+      </w:r>
+    </w:p>
+    <w:p>
+      <w:pPr>
+        <w:spacing w:after="0"/>
+      </w:pPr>
+      <w:r>
+        <w:t xml:space="preserve">significa que sea </w:t>
+      </w:r>
+      <w:proofErr w:type="spellStart"/>
+      <w:r>
+        <w:t>static</w:t>
+      </w:r>
+      <w:proofErr w:type="spellEnd"/>
+      <w:r>
+        <w:t>? (c) ¿Qué significa que sea final?</w:t>
+      </w:r>
+    </w:p>
+    <w:p>
+      <w:pPr>
+        <w:spacing w:after="0"/>
+      </w:pPr>
+    </w:p>
+    <w:p>
+      <w:pPr>
+        <w:spacing w:after="0"/>
+      </w:pPr>
+      <w:proofErr w:type="spellStart"/>
+      <w:r>
+        <w:t>Rta</w:t>
+      </w:r>
+      <w:proofErr w:type="spellEnd"/>
+      <w:r>
+        <w:t xml:space="preserve"> a: significa que cualquiera </w:t>
+      </w:r>
+      <w:proofErr w:type="spellStart"/>
+      <w:r>
+        <w:t>objeto,clase</w:t>
+      </w:r>
+      <w:proofErr w:type="spellEnd"/>
+      <w:r>
+        <w:t xml:space="preserve"> o usuario puede acceder a ese atributo</w:t>
+      </w:r>
+    </w:p>
+    <w:p>
+      <w:pPr>
+        <w:spacing w:after="0"/>
+      </w:pPr>
+      <w:proofErr w:type="spellStart"/>
+      <w:r>
+        <w:t>Rta</w:t>
+      </w:r>
+      <w:proofErr w:type="spellEnd"/>
+      <w:r>
+        <w:t xml:space="preserve"> b: que tiene el mismo valor para todo objeto que pertenezca a rectángulo </w:t>
+      </w:r>
+    </w:p>
+    <w:p>
+      <w:pPr>
+        <w:spacing w:after="0"/>
+      </w:pPr>
+      <w:proofErr w:type="spellStart"/>
+      <w:r>
+        <w:t>Rrta</w:t>
+      </w:r>
+      <w:proofErr w:type="spellEnd"/>
+      <w:r>
+        <w:t xml:space="preserve"> c: significa que no se puede editar mediante </w:t>
+      </w:r>
+      <w:proofErr w:type="spellStart"/>
+      <w:r>
+        <w:t>metodos</w:t>
+      </w:r>
+      <w:proofErr w:type="spellEnd"/>
+      <w:r>
+        <w:t>, posteriormente</w:t>
+      </w:r>
+    </w:p>
+    <w:p>
+      <w:pPr>
+        <w:spacing w:after="0"/>
+      </w:pPr>
+    </w:p>
+    <w:p>
+      <w:pPr>
+        <w:spacing w:after="0"/>
+      </w:pPr>
+      <w:r>
+        <w:t xml:space="preserve">7. En el código de la clase </w:t>
+      </w:r>
+      <w:proofErr w:type="spellStart"/>
+      <w:r>
+        <w:t>Rectangle</w:t>
+      </w:r>
+      <w:proofErr w:type="spellEnd"/>
+      <w:r>
+        <w:t xml:space="preserve"> revisen el detalle del tipo del atributo </w:t>
+      </w:r>
+      <w:proofErr w:type="spellStart"/>
+      <w:r>
+        <w:t>width</w:t>
+      </w:r>
+      <w:proofErr w:type="spellEnd"/>
+      <w:r>
+        <w:t>. (a) ¿Qué se está indicando</w:t>
       </w:r>
       <w:r>
         <w:t xml:space="preserve"> </w:t>
       </w:r>
       <w:r>
-        <w:t>al decir que es int? (b) Si fuera byte, ¿cuál sería el área más grande posible? (c) y ¿si fuera long? (d)</w:t>
+        <w:t xml:space="preserve">al decir que es </w:t>
+      </w:r>
+      <w:proofErr w:type="spellStart"/>
+      <w:r>
+        <w:t>int</w:t>
+      </w:r>
+      <w:proofErr w:type="spellEnd"/>
+      <w:r>
+        <w:t xml:space="preserve">? (b) Si fuera byte, ¿cuál sería el área más grande posible? (c) y ¿si fuera </w:t>
+      </w:r>
+      <w:proofErr w:type="spellStart"/>
+      <w:r>
+        <w:t>long</w:t>
+      </w:r>
+      <w:proofErr w:type="spellEnd"/>
+      <w:r>
+        <w:t>? (d)</w:t>
       </w:r>
       <w:r>
         <w:t xml:space="preserve"> </w:t>
@@ -492,16 +821,26 @@
       <w:pPr>
         <w:spacing w:after="0"/>
       </w:pPr>
-      <w:r>
-        <w:t>Rta a: que es de tipo entero con capacidad de 32-bit</w:t>
-      </w:r>
-    </w:p>
-    <w:p>
-      <w:pPr>
-        <w:spacing w:after="0"/>
-      </w:pPr>
-      <w:r>
-        <w:t xml:space="preserve">Rta b: si fuera byte </w:t>
+      <w:proofErr w:type="spellStart"/>
+      <w:r>
+        <w:t>Rta</w:t>
+      </w:r>
+      <w:proofErr w:type="spellEnd"/>
+      <w:r>
+        <w:t xml:space="preserve"> a: que es de tipo entero con capacidad de 32-bit</w:t>
+      </w:r>
+    </w:p>
+    <w:p>
+      <w:pPr>
+        <w:spacing w:after="0"/>
+      </w:pPr>
+      <w:proofErr w:type="spellStart"/>
+      <w:r>
+        <w:t>Rta</w:t>
+      </w:r>
+      <w:proofErr w:type="spellEnd"/>
+      <w:r>
+        <w:t xml:space="preserve"> b: si fuera byte </w:t>
       </w:r>
       <w:r>
         <w:t xml:space="preserve">depende sin </w:t>
@@ -510,15 +849,36 @@
         <w:t>signos</w:t>
       </w:r>
       <w:r>
-        <w:t xml:space="preserve"> seria 255 el número mas grande con signos seria 127</w:t>
-      </w:r>
-    </w:p>
-    <w:p>
-      <w:pPr>
-        <w:spacing w:after="0"/>
-      </w:pPr>
-      <w:r>
-        <w:t xml:space="preserve">Rta c: si fuera long es decir 64-bit seria sin signos: 18,446,744,073,709,551,615 y con signos </w:t>
+        <w:t xml:space="preserve"> seria 255 el número </w:t>
+      </w:r>
+      <w:proofErr w:type="spellStart"/>
+      <w:r>
+        <w:t>mas</w:t>
+      </w:r>
+      <w:proofErr w:type="spellEnd"/>
+      <w:r>
+        <w:t xml:space="preserve"> grande con signos seria 127</w:t>
+      </w:r>
+    </w:p>
+    <w:p>
+      <w:pPr>
+        <w:spacing w:after="0"/>
+      </w:pPr>
+      <w:proofErr w:type="spellStart"/>
+      <w:r>
+        <w:t>Rta</w:t>
+      </w:r>
+      <w:proofErr w:type="spellEnd"/>
+      <w:r>
+        <w:t xml:space="preserve"> c: si fuera </w:t>
+      </w:r>
+      <w:proofErr w:type="spellStart"/>
+      <w:r>
+        <w:t>long</w:t>
+      </w:r>
+      <w:proofErr w:type="spellEnd"/>
+      <w:r>
+        <w:t xml:space="preserve"> es decir 64-bit seria sin signos: 18,446,744,073,709,551,615 y con signos </w:t>
       </w:r>
       <w:r>
         <w:rPr>
@@ -535,31 +895,73 @@
       <w:pPr>
         <w:spacing w:after="0"/>
       </w:pPr>
-      <w:r>
-        <w:t>Rta d:</w:t>
+      <w:proofErr w:type="spellStart"/>
+      <w:r>
+        <w:t>Rta</w:t>
+      </w:r>
+      <w:proofErr w:type="spellEnd"/>
+      <w:r>
+        <w:t xml:space="preserve"> d:</w:t>
       </w:r>
       <w:r>
         <w:t xml:space="preserve"> consideramos que</w:t>
       </w:r>
       <w:r>
-        <w:t xml:space="preserve"> el cambio debería cambiar el tipo del atributo a double ya que así podríamos tener mas capacidad de poder crear mas rectangulos</w:t>
-      </w:r>
+        <w:t xml:space="preserve"> el cambio debería cambiar el tipo del atributo a </w:t>
+      </w:r>
+      <w:proofErr w:type="spellStart"/>
+      <w:r>
+        <w:t>double</w:t>
+      </w:r>
+      <w:proofErr w:type="spellEnd"/>
+      <w:r>
+        <w:t xml:space="preserve"> ya que así podríamos tener </w:t>
+      </w:r>
+      <w:proofErr w:type="spellStart"/>
+      <w:r>
+        <w:t>mas</w:t>
+      </w:r>
+      <w:proofErr w:type="spellEnd"/>
+      <w:r>
+        <w:t xml:space="preserve"> capacidad de poder crear </w:t>
+      </w:r>
+      <w:proofErr w:type="spellStart"/>
+      <w:r>
+        <w:t>mas</w:t>
+      </w:r>
+      <w:proofErr w:type="spellEnd"/>
       <w:r>
         <w:t xml:space="preserve"> </w:t>
       </w:r>
-    </w:p>
-    <w:p>
-      <w:pPr>
-        <w:spacing w:after="0"/>
-        <w:rPr>
-          <w:lang w:val="en-US"/>
-        </w:rPr>
-      </w:pPr>
-      <w:r>
-        <w:rPr>
-          <w:lang w:val="en-US"/>
-        </w:rPr>
-        <w:t xml:space="preserve">Rta e: </w:t>
+      <w:proofErr w:type="spellStart"/>
+      <w:r>
+        <w:t>rectangulos</w:t>
+      </w:r>
+      <w:proofErr w:type="spellEnd"/>
+      <w:r>
+        <w:t xml:space="preserve"> </w:t>
+      </w:r>
+    </w:p>
+    <w:p>
+      <w:pPr>
+        <w:spacing w:after="0"/>
+        <w:rPr>
+          <w:lang w:val="en-US"/>
+        </w:rPr>
+      </w:pPr>
+      <w:proofErr w:type="spellStart"/>
+      <w:r>
+        <w:rPr>
+          <w:lang w:val="en-US"/>
+        </w:rPr>
+        <w:t>Rta</w:t>
+      </w:r>
+      <w:proofErr w:type="spellEnd"/>
+      <w:r>
+        <w:rPr>
+          <w:lang w:val="en-US"/>
+        </w:rPr>
+        <w:t xml:space="preserve"> e: </w:t>
       </w:r>
     </w:p>
     <w:p>
@@ -586,7 +988,49 @@
         <w:rPr>
           <w:lang w:val="en-US"/>
         </w:rPr>
-        <w:t>public void changeSize(int newHeight, int newWidth) {</w:t>
+        <w:t xml:space="preserve">public void </w:t>
+      </w:r>
+      <w:proofErr w:type="spellStart"/>
+      <w:r>
+        <w:rPr>
+          <w:lang w:val="en-US"/>
+        </w:rPr>
+        <w:t>changeSize</w:t>
+      </w:r>
+      <w:proofErr w:type="spellEnd"/>
+      <w:r>
+        <w:rPr>
+          <w:lang w:val="en-US"/>
+        </w:rPr>
+        <w:t xml:space="preserve">(int </w:t>
+      </w:r>
+      <w:proofErr w:type="spellStart"/>
+      <w:r>
+        <w:rPr>
+          <w:lang w:val="en-US"/>
+        </w:rPr>
+        <w:t>newHeight</w:t>
+      </w:r>
+      <w:proofErr w:type="spellEnd"/>
+      <w:r>
+        <w:rPr>
+          <w:lang w:val="en-US"/>
+        </w:rPr>
+        <w:t xml:space="preserve">, int </w:t>
+      </w:r>
+      <w:proofErr w:type="spellStart"/>
+      <w:r>
+        <w:rPr>
+          <w:lang w:val="en-US"/>
+        </w:rPr>
+        <w:t>newWidth</w:t>
+      </w:r>
+      <w:proofErr w:type="spellEnd"/>
+      <w:r>
+        <w:rPr>
+          <w:lang w:val="en-US"/>
+        </w:rPr>
+        <w:t>) {</w:t>
       </w:r>
     </w:p>
     <w:p>
@@ -614,21 +1058,49 @@
         <w:rPr>
           <w:lang w:val="en-US"/>
         </w:rPr>
-        <w:t xml:space="preserve">        height = newHeight;</w:t>
-      </w:r>
-    </w:p>
-    <w:p>
-      <w:pPr>
-        <w:spacing w:after="0"/>
-        <w:rPr>
-          <w:lang w:val="en-US"/>
-        </w:rPr>
-      </w:pPr>
-      <w:r>
-        <w:rPr>
-          <w:lang w:val="en-US"/>
-        </w:rPr>
-        <w:t xml:space="preserve">        width = newWidth;</w:t>
+        <w:t xml:space="preserve">        height = </w:t>
+      </w:r>
+      <w:proofErr w:type="spellStart"/>
+      <w:r>
+        <w:rPr>
+          <w:lang w:val="en-US"/>
+        </w:rPr>
+        <w:t>newHeight</w:t>
+      </w:r>
+      <w:proofErr w:type="spellEnd"/>
+      <w:r>
+        <w:rPr>
+          <w:lang w:val="en-US"/>
+        </w:rPr>
+        <w:t>;</w:t>
+      </w:r>
+    </w:p>
+    <w:p>
+      <w:pPr>
+        <w:spacing w:after="0"/>
+        <w:rPr>
+          <w:lang w:val="en-US"/>
+        </w:rPr>
+      </w:pPr>
+      <w:r>
+        <w:rPr>
+          <w:lang w:val="en-US"/>
+        </w:rPr>
+        <w:t xml:space="preserve">        width = </w:t>
+      </w:r>
+      <w:proofErr w:type="spellStart"/>
+      <w:r>
+        <w:rPr>
+          <w:lang w:val="en-US"/>
+        </w:rPr>
+        <w:t>newWidth</w:t>
+      </w:r>
+      <w:proofErr w:type="spellEnd"/>
+      <w:r>
+        <w:rPr>
+          <w:lang w:val="en-US"/>
+        </w:rPr>
+        <w:t>;</w:t>
       </w:r>
     </w:p>
     <w:p>
@@ -684,7 +1156,21 @@
         <w:rPr>
           <w:lang w:val="en-US"/>
         </w:rPr>
-        <w:t>public void changeSize(</w:t>
+        <w:t xml:space="preserve">public void </w:t>
+      </w:r>
+      <w:proofErr w:type="spellStart"/>
+      <w:r>
+        <w:rPr>
+          <w:lang w:val="en-US"/>
+        </w:rPr>
+        <w:t>changeSize</w:t>
+      </w:r>
+      <w:proofErr w:type="spellEnd"/>
+      <w:r>
+        <w:rPr>
+          <w:lang w:val="en-US"/>
+        </w:rPr>
+        <w:t>(</w:t>
       </w:r>
       <w:r>
         <w:rPr>
@@ -696,7 +1182,21 @@
         <w:rPr>
           <w:lang w:val="en-US"/>
         </w:rPr>
-        <w:t xml:space="preserve"> newHeight, </w:t>
+        <w:t xml:space="preserve"> </w:t>
+      </w:r>
+      <w:proofErr w:type="spellStart"/>
+      <w:r>
+        <w:rPr>
+          <w:lang w:val="en-US"/>
+        </w:rPr>
+        <w:t>newHeight</w:t>
+      </w:r>
+      <w:proofErr w:type="spellEnd"/>
+      <w:r>
+        <w:rPr>
+          <w:lang w:val="en-US"/>
+        </w:rPr>
+        <w:t xml:space="preserve">, </w:t>
       </w:r>
       <w:r>
         <w:rPr>
@@ -708,7 +1208,21 @@
         <w:rPr>
           <w:lang w:val="en-US"/>
         </w:rPr>
-        <w:t xml:space="preserve"> newWidth) {</w:t>
+        <w:t xml:space="preserve"> </w:t>
+      </w:r>
+      <w:proofErr w:type="spellStart"/>
+      <w:r>
+        <w:rPr>
+          <w:lang w:val="en-US"/>
+        </w:rPr>
+        <w:t>newWidth</w:t>
+      </w:r>
+      <w:proofErr w:type="spellEnd"/>
+      <w:r>
+        <w:rPr>
+          <w:lang w:val="en-US"/>
+        </w:rPr>
+        <w:t>) {</w:t>
       </w:r>
     </w:p>
     <w:p>
@@ -736,21 +1250,49 @@
         <w:rPr>
           <w:lang w:val="en-US"/>
         </w:rPr>
-        <w:t xml:space="preserve">        height = newHeight;</w:t>
-      </w:r>
-    </w:p>
-    <w:p>
-      <w:pPr>
-        <w:spacing w:after="0"/>
-        <w:rPr>
-          <w:lang w:val="en-US"/>
-        </w:rPr>
-      </w:pPr>
-      <w:r>
-        <w:rPr>
-          <w:lang w:val="en-US"/>
-        </w:rPr>
-        <w:t xml:space="preserve">        width = newWidth;</w:t>
+        <w:t xml:space="preserve">        height = </w:t>
+      </w:r>
+      <w:proofErr w:type="spellStart"/>
+      <w:r>
+        <w:rPr>
+          <w:lang w:val="en-US"/>
+        </w:rPr>
+        <w:t>newHeight</w:t>
+      </w:r>
+      <w:proofErr w:type="spellEnd"/>
+      <w:r>
+        <w:rPr>
+          <w:lang w:val="en-US"/>
+        </w:rPr>
+        <w:t>;</w:t>
+      </w:r>
+    </w:p>
+    <w:p>
+      <w:pPr>
+        <w:spacing w:after="0"/>
+        <w:rPr>
+          <w:lang w:val="en-US"/>
+        </w:rPr>
+      </w:pPr>
+      <w:r>
+        <w:rPr>
+          <w:lang w:val="en-US"/>
+        </w:rPr>
+        <w:t xml:space="preserve">        width = </w:t>
+      </w:r>
+      <w:proofErr w:type="spellStart"/>
+      <w:r>
+        <w:rPr>
+          <w:lang w:val="en-US"/>
+        </w:rPr>
+        <w:t>newWidth</w:t>
+      </w:r>
+      <w:proofErr w:type="spellEnd"/>
+      <w:r>
+        <w:rPr>
+          <w:lang w:val="en-US"/>
+        </w:rPr>
+        <w:t>;</w:t>
       </w:r>
     </w:p>
     <w:p>
@@ -763,8 +1305,13 @@
         </w:rPr>
         <w:t xml:space="preserve">        </w:t>
       </w:r>
-      <w:r>
-        <w:t>draw();</w:t>
+      <w:proofErr w:type="spellStart"/>
+      <w:r>
+        <w:t>draw</w:t>
+      </w:r>
+      <w:proofErr w:type="spellEnd"/>
+      <w:r>
+        <w:t>();</w:t>
       </w:r>
     </w:p>
     <w:p>
@@ -785,45 +1332,116 @@
         <w:spacing w:after="0"/>
       </w:pPr>
       <w:r>
-        <w:t>8. Si creamos 100 rectángulos, (a) ¿cuántos EDGES y cuántos width tendríamos? (b) Justifique.</w:t>
-      </w:r>
-    </w:p>
-    <w:p>
-      <w:pPr>
-        <w:spacing w:after="0"/>
-      </w:pPr>
-      <w:r>
-        <w:t>a) tendriamos 1 EDGE y 100 width</w:t>
-      </w:r>
-    </w:p>
-    <w:p>
-      <w:pPr>
-        <w:spacing w:after="0"/>
-      </w:pPr>
-      <w:r>
-        <w:t>b) porque el edge es static eso quiere decir que todos los objetos van a compartir el mismo valor de ese atributo pase lo que pase</w:t>
-      </w:r>
-    </w:p>
-    <w:p>
-      <w:pPr>
-        <w:spacing w:after="0"/>
-      </w:pPr>
-    </w:p>
-    <w:p>
-      <w:pPr>
-        <w:spacing w:after="0"/>
-      </w:pPr>
-      <w:r>
-        <w:t>9. ¿Cuál dirían es el propósito del proyecto shapes?</w:t>
-      </w:r>
-    </w:p>
-    <w:p>
-      <w:pPr>
-        <w:spacing w:after="0"/>
-      </w:pPr>
-      <w:r>
-        <w:t>Permitri la visibilidad y manipulación de las figuras geometriccas bascias sobre un canvas</w:t>
-      </w:r>
+        <w:t xml:space="preserve">8. Si creamos 100 rectángulos, (a) ¿cuántos EDGES y cuántos </w:t>
+      </w:r>
+      <w:proofErr w:type="spellStart"/>
+      <w:r>
+        <w:t>width</w:t>
+      </w:r>
+      <w:proofErr w:type="spellEnd"/>
+      <w:r>
+        <w:t xml:space="preserve"> tendríamos? (b) Justifique.</w:t>
+      </w:r>
+    </w:p>
+    <w:p>
+      <w:pPr>
+        <w:spacing w:after="0"/>
+      </w:pPr>
+      <w:r>
+        <w:t xml:space="preserve">a) </w:t>
+      </w:r>
+      <w:proofErr w:type="spellStart"/>
+      <w:r>
+        <w:t>tendriamos</w:t>
+      </w:r>
+      <w:proofErr w:type="spellEnd"/>
+      <w:r>
+        <w:t xml:space="preserve"> 1 EDGE y 100 </w:t>
+      </w:r>
+      <w:proofErr w:type="spellStart"/>
+      <w:r>
+        <w:t>width</w:t>
+      </w:r>
+      <w:proofErr w:type="spellEnd"/>
+    </w:p>
+    <w:p>
+      <w:pPr>
+        <w:spacing w:after="0"/>
+      </w:pPr>
+      <w:r>
+        <w:t xml:space="preserve">b) porque el </w:t>
+      </w:r>
+      <w:proofErr w:type="spellStart"/>
+      <w:r>
+        <w:t>edge</w:t>
+      </w:r>
+      <w:proofErr w:type="spellEnd"/>
+      <w:r>
+        <w:t xml:space="preserve"> es </w:t>
+      </w:r>
+      <w:proofErr w:type="spellStart"/>
+      <w:r>
+        <w:t>static</w:t>
+      </w:r>
+      <w:proofErr w:type="spellEnd"/>
+      <w:r>
+        <w:t xml:space="preserve"> eso quiere decir que todos los objetos van a compartir el mismo valor de ese atributo pase lo que pase</w:t>
+      </w:r>
+    </w:p>
+    <w:p>
+      <w:pPr>
+        <w:spacing w:after="0"/>
+      </w:pPr>
+    </w:p>
+    <w:p>
+      <w:pPr>
+        <w:spacing w:after="0"/>
+      </w:pPr>
+      <w:r>
+        <w:t xml:space="preserve">9. ¿Cuál dirían es el propósito del proyecto </w:t>
+      </w:r>
+      <w:proofErr w:type="spellStart"/>
+      <w:r>
+        <w:t>shapes</w:t>
+      </w:r>
+      <w:proofErr w:type="spellEnd"/>
+      <w:r>
+        <w:t>?</w:t>
+      </w:r>
+    </w:p>
+    <w:p>
+      <w:pPr>
+        <w:spacing w:after="0"/>
+      </w:pPr>
+      <w:proofErr w:type="spellStart"/>
+      <w:r>
+        <w:t>Permitri</w:t>
+      </w:r>
+      <w:proofErr w:type="spellEnd"/>
+      <w:r>
+        <w:t xml:space="preserve"> la visibilidad y manipulación de las figuras </w:t>
+      </w:r>
+      <w:proofErr w:type="spellStart"/>
+      <w:r>
+        <w:t>geometriccas</w:t>
+      </w:r>
+      <w:proofErr w:type="spellEnd"/>
+      <w:r>
+        <w:t xml:space="preserve"> </w:t>
+      </w:r>
+      <w:proofErr w:type="spellStart"/>
+      <w:r>
+        <w:t>bascias</w:t>
+      </w:r>
+      <w:proofErr w:type="spellEnd"/>
+      <w:r>
+        <w:t xml:space="preserve"> sobre un </w:t>
+      </w:r>
+      <w:proofErr w:type="spellStart"/>
+      <w:r>
+        <w:t>canvas</w:t>
+      </w:r>
+      <w:proofErr w:type="spellEnd"/>
     </w:p>
     <w:p>
       <w:pPr>
@@ -890,7 +1508,23 @@
         <w:spacing w:after="0"/>
       </w:pPr>
       <w:r>
-        <w:t>c) el canvas porque es el “lienzo” donde se van a dibujar los demas conceptos</w:t>
+        <w:t xml:space="preserve">c) el </w:t>
+      </w:r>
+      <w:proofErr w:type="spellStart"/>
+      <w:r>
+        <w:t>canvas</w:t>
+      </w:r>
+      <w:proofErr w:type="spellEnd"/>
+      <w:r>
+        <w:t xml:space="preserve"> porque es el “lienzo” donde se van a dibujar los </w:t>
+      </w:r>
+      <w:proofErr w:type="spellStart"/>
+      <w:r>
+        <w:t>demas</w:t>
+      </w:r>
+      <w:proofErr w:type="spellEnd"/>
+      <w:r>
+        <w:t xml:space="preserve"> conceptos</w:t>
       </w:r>
     </w:p>
     <w:p>
@@ -921,7 +1555,23 @@
         <w:spacing w:after="0"/>
       </w:pPr>
       <w:r>
-        <w:t xml:space="preserve">Los métodos constructores de las formas normales son casi iguales pero comparado con el canvas el método constructor es static </w:t>
+        <w:t xml:space="preserve">Los métodos constructores de las formas normales son casi iguales pero comparado con el </w:t>
+      </w:r>
+      <w:proofErr w:type="spellStart"/>
+      <w:r>
+        <w:t>canvas</w:t>
+      </w:r>
+      <w:proofErr w:type="spellEnd"/>
+      <w:r>
+        <w:t xml:space="preserve"> el método constructor es </w:t>
+      </w:r>
+      <w:proofErr w:type="spellStart"/>
+      <w:r>
+        <w:t>static</w:t>
+      </w:r>
+      <w:proofErr w:type="spellEnd"/>
+      <w:r>
+        <w:t xml:space="preserve"> </w:t>
       </w:r>
     </w:p>
     <w:p>
@@ -934,10 +1584,47 @@
         <w:spacing w:after="0"/>
       </w:pPr>
       <w:r>
-        <w:t xml:space="preserve">Esto se hace para que no se cree ningún otro canvas por que como nos damos cuenta el método estático revisa el atributo estático </w:t>
-      </w:r>
-      <w:r>
-        <w:t>private static Canvas canvasSingleton;</w:t>
+        <w:t xml:space="preserve">Esto se hace para que no se cree ningún otro </w:t>
+      </w:r>
+      <w:proofErr w:type="spellStart"/>
+      <w:r>
+        <w:t>canvas</w:t>
+      </w:r>
+      <w:proofErr w:type="spellEnd"/>
+      <w:r>
+        <w:t xml:space="preserve"> por que como nos damos cuenta el método estático revisa el atributo estático </w:t>
+      </w:r>
+      <w:proofErr w:type="spellStart"/>
+      <w:r>
+        <w:t>private</w:t>
+      </w:r>
+      <w:proofErr w:type="spellEnd"/>
+      <w:r>
+        <w:t xml:space="preserve"> </w:t>
+      </w:r>
+      <w:proofErr w:type="spellStart"/>
+      <w:r>
+        <w:t>static</w:t>
+      </w:r>
+      <w:proofErr w:type="spellEnd"/>
+      <w:r>
+        <w:t xml:space="preserve"> </w:t>
+      </w:r>
+      <w:proofErr w:type="spellStart"/>
+      <w:r>
+        <w:t>Canvas</w:t>
+      </w:r>
+      <w:proofErr w:type="spellEnd"/>
+      <w:r>
+        <w:t xml:space="preserve"> </w:t>
+      </w:r>
+      <w:proofErr w:type="spellStart"/>
+      <w:r>
+        <w:t>canvasSingleton</w:t>
+      </w:r>
+      <w:proofErr w:type="spellEnd"/>
+      <w:r>
+        <w:t>;</w:t>
       </w:r>
     </w:p>
     <w:p>
@@ -946,20 +1633,33 @@
         <w:spacing w:after="0"/>
       </w:pPr>
       <w:r>
-        <w:t>Ese atributo sirve para saber que si ya existe un canvas</w:t>
-      </w:r>
-    </w:p>
-    <w:p>
-      <w:pPr>
-        <w:spacing w:after="0"/>
-      </w:pPr>
-    </w:p>
-    <w:p>
-      <w:pPr>
-        <w:spacing w:after="0"/>
-      </w:pPr>
-      <w:r>
-        <w:t xml:space="preserve">3. Inspeccionen el estado del objeto :Rectangle. (a) Capturen la pantalla.(b) ¿Cuál es el color inicial? </w:t>
+        <w:t xml:space="preserve">Ese atributo sirve para saber que si ya existe un </w:t>
+      </w:r>
+      <w:proofErr w:type="spellStart"/>
+      <w:r>
+        <w:t>canvas</w:t>
+      </w:r>
+      <w:proofErr w:type="spellEnd"/>
+    </w:p>
+    <w:p>
+      <w:pPr>
+        <w:spacing w:after="0"/>
+      </w:pPr>
+    </w:p>
+    <w:p>
+      <w:pPr>
+        <w:spacing w:after="0"/>
+      </w:pPr>
+      <w:r>
+        <w:t>3. Inspeccionen el estado del objeto :</w:t>
+      </w:r>
+      <w:proofErr w:type="spellStart"/>
+      <w:r>
+        <w:t>Rectangle</w:t>
+      </w:r>
+      <w:proofErr w:type="spellEnd"/>
+      <w:r>
+        <w:t xml:space="preserve">. (a) Capturen la pantalla.(b) ¿Cuál es el color inicial? </w:t>
       </w:r>
     </w:p>
     <w:p>
@@ -1129,21 +1829,42 @@
         <w:spacing w:after="0"/>
       </w:pPr>
       <w:r>
-        <w:t>5. Construyan, con shapes sin escribir código, una propuesta de la imagen del logo de su videojuego favorito. (a) ¿Cuántas y cuáles clases se necesitan? (b) ¿Cuántos objetos se usan en total? (c) Capturen la pantalla.(d) Incluyan el logo original</w:t>
-      </w:r>
-    </w:p>
-    <w:p>
-      <w:pPr>
-        <w:spacing w:after="0"/>
-      </w:pPr>
-    </w:p>
-    <w:p>
-      <w:pPr>
-        <w:spacing w:after="0"/>
-      </w:pPr>
-      <w:r>
-        <w:t>a) se necesitaron las 4 clases porque usamos circule,rectangule y triangule, además del canvas</w:t>
-      </w:r>
+        <w:t xml:space="preserve">5. Construyan, con </w:t>
+      </w:r>
+      <w:proofErr w:type="spellStart"/>
+      <w:r>
+        <w:t>shapes</w:t>
+      </w:r>
+      <w:proofErr w:type="spellEnd"/>
+      <w:r>
+        <w:t xml:space="preserve"> sin escribir código, una propuesta de la imagen del logo de su videojuego favorito. (a) ¿Cuántas y cuáles clases se necesitan? (b) ¿Cuántos objetos se usan en total? (c) Capturen la pantalla.(d) Incluyan el logo original</w:t>
+      </w:r>
+    </w:p>
+    <w:p>
+      <w:pPr>
+        <w:spacing w:after="0"/>
+      </w:pPr>
+    </w:p>
+    <w:p>
+      <w:pPr>
+        <w:spacing w:after="0"/>
+      </w:pPr>
+      <w:r>
+        <w:t xml:space="preserve">a) se necesitaron las 4 clases porque usamos </w:t>
+      </w:r>
+      <w:proofErr w:type="spellStart"/>
+      <w:r>
+        <w:t>circule,rectangule</w:t>
+      </w:r>
+      <w:proofErr w:type="spellEnd"/>
+      <w:r>
+        <w:t xml:space="preserve"> y triangule, además del </w:t>
+      </w:r>
+      <w:proofErr w:type="spellStart"/>
+      <w:r>
+        <w:t>canvas</w:t>
+      </w:r>
+      <w:proofErr w:type="spellEnd"/>
     </w:p>
     <w:p>
       <w:pPr>
@@ -1443,7 +2164,23 @@
         <w:spacing w:after="0"/>
       </w:pPr>
       <w:r>
-        <w:t>2. Para cada punto señalado: (a) ¿cuántas variables existen? (b) ¿cuántos objetos existen? (no cuenten ni losobjetos String ni el objeto Canvas) (c) ¿cuántos objetos se ven?</w:t>
+        <w:t xml:space="preserve">2. Para cada punto señalado: (a) ¿cuántas variables existen? (b) ¿cuántos objetos existen? (no cuenten ni </w:t>
+      </w:r>
+      <w:proofErr w:type="spellStart"/>
+      <w:r>
+        <w:t>losobjetos</w:t>
+      </w:r>
+      <w:proofErr w:type="spellEnd"/>
+      <w:r>
+        <w:t xml:space="preserve"> String ni el objeto </w:t>
+      </w:r>
+      <w:proofErr w:type="spellStart"/>
+      <w:r>
+        <w:t>Canvas</w:t>
+      </w:r>
+      <w:proofErr w:type="spellEnd"/>
+      <w:r>
+        <w:t>) (c) ¿cuántos objetos se ven?</w:t>
       </w:r>
     </w:p>
     <w:tbl>
@@ -1934,7 +2671,39 @@
         <w:spacing w:after="0"/>
       </w:pPr>
       <w:r>
-        <w:t>La unica diferencia es la orientacion de el rectangulo azul.</w:t>
+        <w:t xml:space="preserve">La </w:t>
+      </w:r>
+      <w:proofErr w:type="spellStart"/>
+      <w:r>
+        <w:t>unica</w:t>
+      </w:r>
+      <w:proofErr w:type="spellEnd"/>
+      <w:r>
+        <w:t xml:space="preserve"> diferencia es la </w:t>
+      </w:r>
+      <w:proofErr w:type="spellStart"/>
+      <w:r>
+        <w:t>orientacion</w:t>
+      </w:r>
+      <w:proofErr w:type="spellEnd"/>
+      <w:r>
+        <w:t xml:space="preserve"> </w:t>
+      </w:r>
+      <w:proofErr w:type="spellStart"/>
+      <w:r>
+        <w:t>de el</w:t>
+      </w:r>
+      <w:proofErr w:type="spellEnd"/>
+      <w:r>
+        <w:t xml:space="preserve"> </w:t>
+      </w:r>
+      <w:proofErr w:type="spellStart"/>
+      <w:r>
+        <w:t>rectangulo</w:t>
+      </w:r>
+      <w:proofErr w:type="spellEnd"/>
+      <w:r>
+        <w:t xml:space="preserve"> azul.</w:t>
       </w:r>
     </w:p>
     <w:p>
@@ -1963,7 +2732,25 @@
           <w:sz w:val="32"/>
           <w:szCs w:val="32"/>
         </w:rPr>
-        <w:t xml:space="preserve">D Extendiendo una clase. Rectangle. </w:t>
+        <w:t xml:space="preserve">D Extendiendo una clase. </w:t>
+      </w:r>
+      <w:proofErr w:type="spellStart"/>
+      <w:r>
+        <w:rPr>
+          <w:b/>
+          <w:sz w:val="32"/>
+          <w:szCs w:val="32"/>
+        </w:rPr>
+        <w:t>Rectangle</w:t>
+      </w:r>
+      <w:proofErr w:type="spellEnd"/>
+      <w:r>
+        <w:rPr>
+          <w:b/>
+          <w:sz w:val="32"/>
+          <w:szCs w:val="32"/>
+        </w:rPr>
+        <w:t xml:space="preserve">. </w:t>
       </w:r>
       <w:r>
         <w:rPr>
@@ -1996,13 +2783,85 @@
         </w:rPr>
       </w:pPr>
       <w:r>
-        <w:t xml:space="preserve">Desarrollen en Rectangle el método perimeter() (retorna el perímetro). </w:t>
-      </w:r>
-      <w:r>
-        <w:rPr>
-          <w:lang w:val="en-US"/>
-        </w:rPr>
-        <w:t>¡Pruébenlo! Capturen una pantalla.</w:t>
+        <w:t xml:space="preserve">Desarrollen en </w:t>
+      </w:r>
+      <w:proofErr w:type="spellStart"/>
+      <w:r>
+        <w:t>Rectangle</w:t>
+      </w:r>
+      <w:proofErr w:type="spellEnd"/>
+      <w:r>
+        <w:t xml:space="preserve"> el método </w:t>
+      </w:r>
+      <w:proofErr w:type="spellStart"/>
+      <w:r>
+        <w:t>perimeter</w:t>
+      </w:r>
+      <w:proofErr w:type="spellEnd"/>
+      <w:r>
+        <w:t xml:space="preserve">() (retorna el perímetro). </w:t>
+      </w:r>
+      <w:r>
+        <w:rPr>
+          <w:lang w:val="en-US"/>
+        </w:rPr>
+        <w:t>¡</w:t>
+      </w:r>
+      <w:proofErr w:type="spellStart"/>
+      <w:r>
+        <w:rPr>
+          <w:lang w:val="en-US"/>
+        </w:rPr>
+        <w:t>Pruébenlo</w:t>
+      </w:r>
+      <w:proofErr w:type="spellEnd"/>
+      <w:r>
+        <w:rPr>
+          <w:lang w:val="en-US"/>
+        </w:rPr>
+        <w:t xml:space="preserve">! </w:t>
+      </w:r>
+      <w:proofErr w:type="spellStart"/>
+      <w:r>
+        <w:rPr>
+          <w:lang w:val="en-US"/>
+        </w:rPr>
+        <w:t>Capturen</w:t>
+      </w:r>
+      <w:proofErr w:type="spellEnd"/>
+      <w:r>
+        <w:rPr>
+          <w:lang w:val="en-US"/>
+        </w:rPr>
+        <w:t xml:space="preserve"> </w:t>
+      </w:r>
+      <w:proofErr w:type="spellStart"/>
+      <w:r>
+        <w:rPr>
+          <w:lang w:val="en-US"/>
+        </w:rPr>
+        <w:t>una</w:t>
+      </w:r>
+      <w:proofErr w:type="spellEnd"/>
+      <w:r>
+        <w:rPr>
+          <w:lang w:val="en-US"/>
+        </w:rPr>
+        <w:t xml:space="preserve"> </w:t>
+      </w:r>
+      <w:proofErr w:type="spellStart"/>
+      <w:r>
+        <w:rPr>
+          <w:lang w:val="en-US"/>
+        </w:rPr>
+        <w:t>pantalla</w:t>
+      </w:r>
+      <w:proofErr w:type="spellEnd"/>
+      <w:r>
+        <w:rPr>
+          <w:lang w:val="en-US"/>
+        </w:rPr>
+        <w:t>.</w:t>
       </w:r>
     </w:p>
     <w:p>
@@ -2102,8 +2961,45 @@
         <w:spacing w:after="0"/>
       </w:pPr>
       <w:r>
-        <w:t>Se le aplicó el calculatePerimeter al changeSize para que al cambiar de tamaño calculate automaticamente el nuevo perimetro</w:t>
-      </w:r>
+        <w:t xml:space="preserve">Se le aplicó el </w:t>
+      </w:r>
+      <w:proofErr w:type="spellStart"/>
+      <w:r>
+        <w:t>calculatePerimeter</w:t>
+      </w:r>
+      <w:proofErr w:type="spellEnd"/>
+      <w:r>
+        <w:t xml:space="preserve"> al </w:t>
+      </w:r>
+      <w:proofErr w:type="spellStart"/>
+      <w:r>
+        <w:t>changeSize</w:t>
+      </w:r>
+      <w:proofErr w:type="spellEnd"/>
+      <w:r>
+        <w:t xml:space="preserve"> para que al cambiar de tamaño </w:t>
+      </w:r>
+      <w:proofErr w:type="spellStart"/>
+      <w:r>
+        <w:t>calculate</w:t>
+      </w:r>
+      <w:proofErr w:type="spellEnd"/>
+      <w:r>
+        <w:t xml:space="preserve"> </w:t>
+      </w:r>
+      <w:proofErr w:type="spellStart"/>
+      <w:r>
+        <w:t>automaticamente</w:t>
+      </w:r>
+      <w:proofErr w:type="spellEnd"/>
+      <w:r>
+        <w:t xml:space="preserve"> el nuevo </w:t>
+      </w:r>
+      <w:proofErr w:type="spellStart"/>
+      <w:r>
+        <w:t>perimetro</w:t>
+      </w:r>
+      <w:proofErr w:type="spellEnd"/>
     </w:p>
     <w:p>
       <w:pPr>
@@ -2226,13 +3122,71 @@
       </w:pPr>
       <w:r>
         <w:lastRenderedPageBreak/>
-        <w:t xml:space="preserve"> Desarrollen en Rectangle el método zoom(z: char) (aumenta (+) o disminuye (-) 100 % el perímetro manteniendo la proporción). </w:t>
-      </w:r>
-      <w:r>
-        <w:rPr>
-          <w:lang w:val="en-US"/>
-        </w:rPr>
-        <w:t>¡Pruébenlo! Capturen dos pantallas.</w:t>
+        <w:t xml:space="preserve"> Desarrollen en </w:t>
+      </w:r>
+      <w:proofErr w:type="spellStart"/>
+      <w:r>
+        <w:t>Rectangle</w:t>
+      </w:r>
+      <w:proofErr w:type="spellEnd"/>
+      <w:r>
+        <w:t xml:space="preserve"> el método zoom(z: </w:t>
+      </w:r>
+      <w:proofErr w:type="spellStart"/>
+      <w:r>
+        <w:t>char</w:t>
+      </w:r>
+      <w:proofErr w:type="spellEnd"/>
+      <w:r>
+        <w:t xml:space="preserve">) (aumenta (+) o disminuye (-) 100 % el perímetro manteniendo la proporción). </w:t>
+      </w:r>
+      <w:r>
+        <w:rPr>
+          <w:lang w:val="en-US"/>
+        </w:rPr>
+        <w:t>¡</w:t>
+      </w:r>
+      <w:proofErr w:type="spellStart"/>
+      <w:r>
+        <w:rPr>
+          <w:lang w:val="en-US"/>
+        </w:rPr>
+        <w:t>Pruébenlo</w:t>
+      </w:r>
+      <w:proofErr w:type="spellEnd"/>
+      <w:r>
+        <w:rPr>
+          <w:lang w:val="en-US"/>
+        </w:rPr>
+        <w:t xml:space="preserve">! </w:t>
+      </w:r>
+      <w:proofErr w:type="spellStart"/>
+      <w:r>
+        <w:rPr>
+          <w:lang w:val="en-US"/>
+        </w:rPr>
+        <w:t>Capturen</w:t>
+      </w:r>
+      <w:proofErr w:type="spellEnd"/>
+      <w:r>
+        <w:rPr>
+          <w:lang w:val="en-US"/>
+        </w:rPr>
+        <w:t xml:space="preserve"> dos </w:t>
+      </w:r>
+      <w:proofErr w:type="spellStart"/>
+      <w:r>
+        <w:rPr>
+          <w:lang w:val="en-US"/>
+        </w:rPr>
+        <w:t>pantallas</w:t>
+      </w:r>
+      <w:proofErr w:type="spellEnd"/>
+      <w:r>
+        <w:rPr>
+          <w:lang w:val="en-US"/>
+        </w:rPr>
+        <w:t>.</w:t>
       </w:r>
     </w:p>
     <w:p>
@@ -2387,13 +3341,109 @@
         </w:rPr>
       </w:pPr>
       <w:r>
-        <w:t xml:space="preserve">Desarrollen en Rectangle el método walk(times: int) (va moviendose cayendo hacia la derecha (positivo) o izquierda (negativo) abs(times) veces). </w:t>
-      </w:r>
-      <w:r>
-        <w:rPr>
-          <w:lang w:val="en-US"/>
-        </w:rPr>
-        <w:t>¡Pruébenlo! Capturen tres pantallas.</w:t>
+        <w:t xml:space="preserve">Desarrollen en </w:t>
+      </w:r>
+      <w:proofErr w:type="spellStart"/>
+      <w:r>
+        <w:t>Rectangle</w:t>
+      </w:r>
+      <w:proofErr w:type="spellEnd"/>
+      <w:r>
+        <w:t xml:space="preserve"> el método </w:t>
+      </w:r>
+      <w:proofErr w:type="spellStart"/>
+      <w:r>
+        <w:t>walk</w:t>
+      </w:r>
+      <w:proofErr w:type="spellEnd"/>
+      <w:r>
+        <w:t xml:space="preserve">(times: </w:t>
+      </w:r>
+      <w:proofErr w:type="spellStart"/>
+      <w:r>
+        <w:t>int</w:t>
+      </w:r>
+      <w:proofErr w:type="spellEnd"/>
+      <w:r>
+        <w:t xml:space="preserve">) (va </w:t>
+      </w:r>
+      <w:proofErr w:type="spellStart"/>
+      <w:r>
+        <w:t>moviendose</w:t>
+      </w:r>
+      <w:proofErr w:type="spellEnd"/>
+      <w:r>
+        <w:t xml:space="preserve"> cayendo hacia la derecha (positivo) o izquierda (negativo) </w:t>
+      </w:r>
+      <w:proofErr w:type="spellStart"/>
+      <w:r>
+        <w:t>abs</w:t>
+      </w:r>
+      <w:proofErr w:type="spellEnd"/>
+      <w:r>
+        <w:t xml:space="preserve">(times) veces). </w:t>
+      </w:r>
+      <w:r>
+        <w:rPr>
+          <w:lang w:val="en-US"/>
+        </w:rPr>
+        <w:t>¡</w:t>
+      </w:r>
+      <w:proofErr w:type="spellStart"/>
+      <w:r>
+        <w:rPr>
+          <w:lang w:val="en-US"/>
+        </w:rPr>
+        <w:t>Pruébenlo</w:t>
+      </w:r>
+      <w:proofErr w:type="spellEnd"/>
+      <w:r>
+        <w:rPr>
+          <w:lang w:val="en-US"/>
+        </w:rPr>
+        <w:t xml:space="preserve">! </w:t>
+      </w:r>
+      <w:proofErr w:type="spellStart"/>
+      <w:r>
+        <w:rPr>
+          <w:lang w:val="en-US"/>
+        </w:rPr>
+        <w:t>Capturen</w:t>
+      </w:r>
+      <w:proofErr w:type="spellEnd"/>
+      <w:r>
+        <w:rPr>
+          <w:lang w:val="en-US"/>
+        </w:rPr>
+        <w:t xml:space="preserve"> </w:t>
+      </w:r>
+      <w:proofErr w:type="spellStart"/>
+      <w:r>
+        <w:rPr>
+          <w:lang w:val="en-US"/>
+        </w:rPr>
+        <w:t>tres</w:t>
+      </w:r>
+      <w:proofErr w:type="spellEnd"/>
+      <w:r>
+        <w:rPr>
+          <w:lang w:val="en-US"/>
+        </w:rPr>
+        <w:t xml:space="preserve"> </w:t>
+      </w:r>
+      <w:proofErr w:type="spellStart"/>
+      <w:r>
+        <w:rPr>
+          <w:lang w:val="en-US"/>
+        </w:rPr>
+        <w:t>pantallas</w:t>
+      </w:r>
+      <w:proofErr w:type="spellEnd"/>
+      <w:r>
+        <w:rPr>
+          <w:lang w:val="en-US"/>
+        </w:rPr>
+        <w:t>.</w:t>
       </w:r>
     </w:p>
     <w:p>
@@ -2418,13 +3468,71 @@
         </w:rPr>
       </w:pPr>
       <w:r>
-        <w:t xml:space="preserve">Desarrollen en Rectangle un nuevo creador que permita crear un cuadrado dado su perímetro. </w:t>
-      </w:r>
-      <w:r>
-        <w:rPr>
-          <w:lang w:val="en-US"/>
-        </w:rPr>
-        <w:t>Pruébenlo! Capturen una pantalla.</w:t>
+        <w:t xml:space="preserve">Desarrollen en </w:t>
+      </w:r>
+      <w:proofErr w:type="spellStart"/>
+      <w:r>
+        <w:t>Rectangle</w:t>
+      </w:r>
+      <w:proofErr w:type="spellEnd"/>
+      <w:r>
+        <w:t xml:space="preserve"> un nuevo creador que permita crear un cuadrado dado su perímetro. </w:t>
+      </w:r>
+      <w:proofErr w:type="spellStart"/>
+      <w:r>
+        <w:rPr>
+          <w:lang w:val="en-US"/>
+        </w:rPr>
+        <w:t>Pruébenlo</w:t>
+      </w:r>
+      <w:proofErr w:type="spellEnd"/>
+      <w:r>
+        <w:rPr>
+          <w:lang w:val="en-US"/>
+        </w:rPr>
+        <w:t xml:space="preserve">! </w:t>
+      </w:r>
+      <w:proofErr w:type="spellStart"/>
+      <w:r>
+        <w:rPr>
+          <w:lang w:val="en-US"/>
+        </w:rPr>
+        <w:t>Capturen</w:t>
+      </w:r>
+      <w:proofErr w:type="spellEnd"/>
+      <w:r>
+        <w:rPr>
+          <w:lang w:val="en-US"/>
+        </w:rPr>
+        <w:t xml:space="preserve"> </w:t>
+      </w:r>
+      <w:proofErr w:type="spellStart"/>
+      <w:r>
+        <w:rPr>
+          <w:lang w:val="en-US"/>
+        </w:rPr>
+        <w:t>una</w:t>
+      </w:r>
+      <w:proofErr w:type="spellEnd"/>
+      <w:r>
+        <w:rPr>
+          <w:lang w:val="en-US"/>
+        </w:rPr>
+        <w:t xml:space="preserve"> </w:t>
+      </w:r>
+      <w:proofErr w:type="spellStart"/>
+      <w:r>
+        <w:rPr>
+          <w:lang w:val="en-US"/>
+        </w:rPr>
+        <w:t>pantalla</w:t>
+      </w:r>
+      <w:proofErr w:type="spellEnd"/>
+      <w:r>
+        <w:rPr>
+          <w:lang w:val="en-US"/>
+        </w:rPr>
+        <w:t>.</w:t>
       </w:r>
     </w:p>
     <w:p>
@@ -2525,10 +3633,66 @@
         <w:spacing w:after="0"/>
       </w:pPr>
       <w:r>
-        <w:t>Creamos el metodo mirror(), lo que hace es generar un rectangulo con las mismas caracteristicas que el original pero se ubica a la izquierda del original</w:t>
-      </w:r>
-      <w:r>
-        <w:t>. Tambien se implementaron cambiar directamente la posicion en x y en y del rectangulo.</w:t>
+        <w:t xml:space="preserve">Creamos el </w:t>
+      </w:r>
+      <w:proofErr w:type="spellStart"/>
+      <w:r>
+        <w:t>metodo</w:t>
+      </w:r>
+      <w:proofErr w:type="spellEnd"/>
+      <w:r>
+        <w:t xml:space="preserve"> </w:t>
+      </w:r>
+      <w:proofErr w:type="spellStart"/>
+      <w:r>
+        <w:t>mirror</w:t>
+      </w:r>
+      <w:proofErr w:type="spellEnd"/>
+      <w:r>
+        <w:t xml:space="preserve">(), lo que hace es generar un </w:t>
+      </w:r>
+      <w:proofErr w:type="spellStart"/>
+      <w:r>
+        <w:t>rectangulo</w:t>
+      </w:r>
+      <w:proofErr w:type="spellEnd"/>
+      <w:r>
+        <w:t xml:space="preserve"> con las mismas </w:t>
+      </w:r>
+      <w:proofErr w:type="spellStart"/>
+      <w:r>
+        <w:t>caracteristicas</w:t>
+      </w:r>
+      <w:proofErr w:type="spellEnd"/>
+      <w:r>
+        <w:t xml:space="preserve"> que el original pero se ubica a la izquierda del original</w:t>
+      </w:r>
+      <w:r>
+        <w:t xml:space="preserve">. </w:t>
+      </w:r>
+      <w:proofErr w:type="spellStart"/>
+      <w:r>
+        <w:t>Tambien</w:t>
+      </w:r>
+      <w:proofErr w:type="spellEnd"/>
+      <w:r>
+        <w:t xml:space="preserve"> se implementaron cambiar directamente la </w:t>
+      </w:r>
+      <w:proofErr w:type="spellStart"/>
+      <w:r>
+        <w:t>posicion</w:t>
+      </w:r>
+      <w:proofErr w:type="spellEnd"/>
+      <w:r>
+        <w:t xml:space="preserve"> en x y en y del </w:t>
+      </w:r>
+      <w:proofErr w:type="spellStart"/>
+      <w:r>
+        <w:t>rectangulo</w:t>
+      </w:r>
+      <w:proofErr w:type="spellEnd"/>
+      <w:r>
+        <w:t>.</w:t>
       </w:r>
     </w:p>
     <w:p>
@@ -2697,11 +3861,33 @@
       <w:r>
         <w:t xml:space="preserve">Generen nuevamente la documentación y revisen la información de estos nuevos métodos. </w:t>
       </w:r>
-      <w:r>
-        <w:rPr>
-          <w:lang w:val="en-US"/>
-        </w:rPr>
-        <w:t>Capturen la pantalla.</w:t>
+      <w:proofErr w:type="spellStart"/>
+      <w:r>
+        <w:rPr>
+          <w:lang w:val="en-US"/>
+        </w:rPr>
+        <w:t>Capturen</w:t>
+      </w:r>
+      <w:proofErr w:type="spellEnd"/>
+      <w:r>
+        <w:rPr>
+          <w:lang w:val="en-US"/>
+        </w:rPr>
+        <w:t xml:space="preserve"> la </w:t>
+      </w:r>
+      <w:proofErr w:type="spellStart"/>
+      <w:r>
+        <w:rPr>
+          <w:lang w:val="en-US"/>
+        </w:rPr>
+        <w:t>pantalla</w:t>
+      </w:r>
+      <w:proofErr w:type="spellEnd"/>
+      <w:r>
+        <w:rPr>
+          <w:lang w:val="en-US"/>
+        </w:rPr>
+        <w:t>.</w:t>
       </w:r>
     </w:p>
     <w:p>
@@ -2723,6 +3909,7 @@
       </w:pPr>
       <w:r>
         <w:rPr>
+          <w:noProof/>
           <w:lang w:val="en-US"/>
         </w:rPr>
         <w:drawing>
@@ -2799,12 +3986,10 @@
           <w:szCs w:val="28"/>
           <w:lang w:val="en-US"/>
         </w:rPr>
-        <w:t>3. HungrySnakeGame</w:t>
-      </w:r>
-    </w:p>
-    <w:p>
-      <w:pPr>
-        <w:spacing w:after="0"/>
+        <w:t xml:space="preserve">3. </w:t>
+      </w:r>
+      <w:proofErr w:type="spellStart"/>
+      <w:r>
         <w:rPr>
           <w:b/>
           <w:bCs/>
@@ -2812,20 +3997,54 @@
           <w:szCs w:val="28"/>
           <w:lang w:val="en-US"/>
         </w:rPr>
-      </w:pPr>
-    </w:p>
-    <w:p>
-      <w:pPr>
-        <w:spacing w:after="0"/>
-      </w:pPr>
-      <w:r>
+        <w:t>HungrySnakeGame</w:t>
+      </w:r>
+      <w:proofErr w:type="spellEnd"/>
+    </w:p>
+    <w:p>
+      <w:pPr>
+        <w:spacing w:after="0"/>
         <w:rPr>
           <w:b/>
           <w:bCs/>
           <w:sz w:val="28"/>
           <w:szCs w:val="28"/>
-        </w:rPr>
-        <w:t>A Creando una nueva clase. Usando un paquete shapes [En lab01.doc] [En .java]</w:t>
+          <w:lang w:val="en-US"/>
+        </w:rPr>
+      </w:pPr>
+    </w:p>
+    <w:p>
+      <w:pPr>
+        <w:spacing w:after="0"/>
+      </w:pPr>
+      <w:r>
+        <w:rPr>
+          <w:b/>
+          <w:bCs/>
+          <w:sz w:val="28"/>
+          <w:szCs w:val="28"/>
+        </w:rPr>
+        <w:t xml:space="preserve">A Creando una nueva clase. Usando un paquete </w:t>
+      </w:r>
+      <w:proofErr w:type="spellStart"/>
+      <w:r>
+        <w:rPr>
+          <w:b/>
+          <w:bCs/>
+          <w:sz w:val="28"/>
+          <w:szCs w:val="28"/>
+        </w:rPr>
+        <w:t>shapes</w:t>
+      </w:r>
+      <w:proofErr w:type="spellEnd"/>
+      <w:r>
+        <w:rPr>
+          <w:b/>
+          <w:bCs/>
+          <w:sz w:val="28"/>
+          <w:szCs w:val="28"/>
+        </w:rPr>
+        <w:t xml:space="preserve"> [En lab01.doc] [En .java]</w:t>
       </w:r>
     </w:p>
     <w:p>
@@ -2859,11 +4078,12 @@
         <w:spacing w:after="0"/>
       </w:pPr>
       <w:r>
+        <w:lastRenderedPageBreak/>
         <w:drawing>
-          <wp:inline distT="0" distB="0" distL="0" distR="0" wp14:anchorId="6CDADBB0" wp14:editId="3D877378">
-            <wp:extent cx="3153215" cy="838317"/>
+          <wp:inline distT="0" distB="0" distL="0" distR="0" wp14:anchorId="7521D9C2" wp14:editId="14344C57">
+            <wp:extent cx="3515216" cy="1314633"/>
             <wp:effectExtent l="0" t="0" r="9525" b="0"/>
-            <wp:docPr id="1800504040" name="Imagen 1" descr="Texto&#10;&#10;El contenido generado por IA puede ser incorrecto."/>
+            <wp:docPr id="214253608" name="Imagen 1" descr="Texto&#10;&#10;El contenido generado por IA puede ser incorrecto."/>
             <wp:cNvGraphicFramePr>
               <a:graphicFrameLocks xmlns:a="http://schemas.openxmlformats.org/drawingml/2006/main" noChangeAspect="1"/>
             </wp:cNvGraphicFramePr>
@@ -2871,7 +4091,7 @@
               <a:graphicData uri="http://schemas.openxmlformats.org/drawingml/2006/picture">
                 <pic:pic xmlns:pic="http://schemas.openxmlformats.org/drawingml/2006/picture">
                   <pic:nvPicPr>
-                    <pic:cNvPr id="1800504040" name="Imagen 1" descr="Texto&#10;&#10;El contenido generado por IA puede ser incorrecto."/>
+                    <pic:cNvPr id="214253608" name="Imagen 1" descr="Texto&#10;&#10;El contenido generado por IA puede ser incorrecto."/>
                     <pic:cNvPicPr/>
                   </pic:nvPicPr>
                   <pic:blipFill>
@@ -2883,7 +4103,7 @@
                   <pic:spPr>
                     <a:xfrm>
                       <a:off x="0" y="0"/>
-                      <a:ext cx="3153215" cy="838317"/>
+                      <a:ext cx="3515216" cy="1314633"/>
                     </a:xfrm>
                     <a:prstGeom prst="rect">
                       <a:avLst/>
@@ -2906,62 +4126,2379 @@
         <w:spacing w:after="0"/>
       </w:pPr>
       <w:r>
+        <w:t>Escogí estos atributos por las siguientes razones:</w:t>
+      </w:r>
+      <w:r>
+        <w:br/>
+        <w:t xml:space="preserve">1) position es una lista porque la serpiente al ir creciendo </w:t>
+      </w:r>
+      <w:r>
+        <w:t>vamos a</w:t>
+      </w:r>
+      <w:r>
+        <w:t xml:space="preserve"> necesita</w:t>
+      </w:r>
+      <w:r>
+        <w:t xml:space="preserve">r </w:t>
+      </w:r>
+      <w:r>
+        <w:t xml:space="preserve">saber </w:t>
+      </w:r>
+      <w:proofErr w:type="spellStart"/>
+      <w:r>
+        <w:t>donde</w:t>
+      </w:r>
+      <w:proofErr w:type="spellEnd"/>
+      <w:r>
+        <w:t xml:space="preserve"> se encuentra cada una de sus partes.</w:t>
+      </w:r>
+    </w:p>
+    <w:p>
+      <w:pPr>
+        <w:spacing w:after="0"/>
+      </w:pPr>
+      <w:r>
+        <w:t xml:space="preserve">2) </w:t>
+      </w:r>
+      <w:r>
+        <w:t xml:space="preserve">debido a que vimos que hay métodos </w:t>
+      </w:r>
+      <w:proofErr w:type="spellStart"/>
+      <w:r>
+        <w:t>makeVisible</w:t>
+      </w:r>
+      <w:proofErr w:type="spellEnd"/>
+      <w:r>
+        <w:t xml:space="preserve">() y </w:t>
+      </w:r>
+      <w:proofErr w:type="spellStart"/>
+      <w:r>
+        <w:t>makeInvisible</w:t>
+      </w:r>
+      <w:proofErr w:type="spellEnd"/>
+      <w:r>
+        <w:t>() entonces se necesitará un atributo que nos diga si está visible o no</w:t>
+      </w:r>
+    </w:p>
+    <w:p>
+      <w:pPr>
+        <w:spacing w:after="0"/>
+      </w:pPr>
+      <w:r>
+        <w:t xml:space="preserve">3) el </w:t>
+      </w:r>
+      <w:proofErr w:type="spellStart"/>
+      <w:r>
+        <w:t>body</w:t>
+      </w:r>
+      <w:proofErr w:type="spellEnd"/>
+      <w:r>
+        <w:t xml:space="preserve"> será la lista de rectángulos que compone a la serpiente</w:t>
+      </w:r>
+    </w:p>
+    <w:p>
+      <w:pPr>
+        <w:spacing w:after="0"/>
+      </w:pPr>
+      <w:r>
+        <w:t xml:space="preserve">4) </w:t>
+      </w:r>
+      <w:r>
+        <w:t xml:space="preserve">color nos dará el color que tendrá la serpiente </w:t>
+      </w:r>
+    </w:p>
+    <w:p>
+      <w:pPr>
+        <w:spacing w:after="0"/>
+      </w:pPr>
+      <w:r>
+        <w:t xml:space="preserve">5) </w:t>
+      </w:r>
+      <w:proofErr w:type="spellStart"/>
+      <w:r>
+        <w:t>isOk</w:t>
+      </w:r>
+      <w:proofErr w:type="spellEnd"/>
+      <w:r>
+        <w:t xml:space="preserve"> dice si la serpiente está viva</w:t>
+      </w:r>
+    </w:p>
+    <w:p>
+      <w:pPr>
+        <w:spacing w:after="0"/>
+      </w:pPr>
+      <w:r>
+        <w:t xml:space="preserve">6) </w:t>
+      </w:r>
+      <w:proofErr w:type="spellStart"/>
+      <w:r>
+        <w:t>lenghtSnake</w:t>
+      </w:r>
+      <w:proofErr w:type="spellEnd"/>
+      <w:r>
+        <w:t xml:space="preserve"> dice que tan larga está la serpiente </w:t>
+      </w:r>
+    </w:p>
+    <w:p>
+      <w:pPr>
+        <w:spacing w:after="0"/>
+      </w:pPr>
+    </w:p>
+    <w:p>
+      <w:pPr>
+        <w:spacing w:after="0"/>
+      </w:pPr>
+      <w:r>
+        <w:t xml:space="preserve">2. Desarrollen la clase considerando los 3 </w:t>
+      </w:r>
+      <w:proofErr w:type="spellStart"/>
+      <w:r>
+        <w:t>mini-ciclos</w:t>
+      </w:r>
+      <w:proofErr w:type="spellEnd"/>
+      <w:r>
+        <w:t>. No olviden la documentación. Al final de cada</w:t>
+      </w:r>
+    </w:p>
+    <w:p>
+      <w:pPr>
+        <w:spacing w:after="0"/>
+      </w:pPr>
+      <w:proofErr w:type="spellStart"/>
+      <w:r>
+        <w:t>mini-ciclo</w:t>
+      </w:r>
+      <w:proofErr w:type="spellEnd"/>
+      <w:r>
+        <w:t xml:space="preserve"> realicen dos pruebas indicando su propósito. Capturen las pantallas relevantes.</w:t>
+      </w:r>
+    </w:p>
+    <w:p>
+      <w:pPr>
+        <w:spacing w:after="0"/>
+      </w:pPr>
+    </w:p>
+    <w:p>
+      <w:pPr>
+        <w:spacing w:after="0"/>
+      </w:pPr>
+      <w:r>
+        <w:t>Las primeras fotos va a ser los métodos:</w:t>
+      </w:r>
+      <w:r>
+        <w:br/>
+      </w:r>
+      <w:r>
+        <w:br/>
+        <w:t>Snake():</w:t>
+      </w:r>
+    </w:p>
+    <w:p>
+      <w:pPr>
+        <w:spacing w:after="0"/>
+      </w:pPr>
+      <w:r>
+        <w:drawing>
+          <wp:inline distT="0" distB="0" distL="0" distR="0" wp14:anchorId="2A696470" wp14:editId="44974EB2">
+            <wp:extent cx="4784651" cy="3722418"/>
+            <wp:effectExtent l="0" t="0" r="0" b="0"/>
+            <wp:docPr id="590621080" name="Imagen 1"/>
+            <wp:cNvGraphicFramePr>
+              <a:graphicFrameLocks xmlns:a="http://schemas.openxmlformats.org/drawingml/2006/main" noChangeAspect="1"/>
+            </wp:cNvGraphicFramePr>
+            <a:graphic xmlns:a="http://schemas.openxmlformats.org/drawingml/2006/main">
+              <a:graphicData uri="http://schemas.openxmlformats.org/drawingml/2006/picture">
+                <pic:pic xmlns:pic="http://schemas.openxmlformats.org/drawingml/2006/picture">
+                  <pic:nvPicPr>
+                    <pic:cNvPr id="590621080" name=""/>
+                    <pic:cNvPicPr/>
+                  </pic:nvPicPr>
+                  <pic:blipFill>
+                    <a:blip r:embed="rId28"/>
+                    <a:stretch>
+                      <a:fillRect/>
+                    </a:stretch>
+                  </pic:blipFill>
+                  <pic:spPr>
+                    <a:xfrm>
+                      <a:off x="0" y="0"/>
+                      <a:ext cx="4791175" cy="3727493"/>
+                    </a:xfrm>
+                    <a:prstGeom prst="rect">
+                      <a:avLst/>
+                    </a:prstGeom>
+                  </pic:spPr>
+                </pic:pic>
+              </a:graphicData>
+            </a:graphic>
+          </wp:inline>
+        </w:drawing>
+      </w:r>
+    </w:p>
+    <w:p>
+      <w:pPr>
+        <w:spacing w:after="0"/>
+      </w:pPr>
+      <w:proofErr w:type="spellStart"/>
+      <w:r>
         <w:lastRenderedPageBreak/>
-        <w:t>Escogí estos atributos por las siguientes razones:</w:t>
+        <w:t>snakeSiza</w:t>
+      </w:r>
+      <w:proofErr w:type="spellEnd"/>
+      <w:r>
+        <w:t>()</w:t>
+      </w:r>
+    </w:p>
+    <w:p>
+      <w:pPr>
+        <w:spacing w:after="0"/>
+      </w:pPr>
+      <w:r>
+        <w:drawing>
+          <wp:inline distT="0" distB="0" distL="0" distR="0" wp14:anchorId="25719BED" wp14:editId="1104C976">
+            <wp:extent cx="5287113" cy="1629002"/>
+            <wp:effectExtent l="0" t="0" r="8890" b="9525"/>
+            <wp:docPr id="1486469402" name="Imagen 1" descr="Interfaz de usuario gráfica, Texto, Aplicación&#10;&#10;El contenido generado por IA puede ser incorrecto."/>
+            <wp:cNvGraphicFramePr>
+              <a:graphicFrameLocks xmlns:a="http://schemas.openxmlformats.org/drawingml/2006/main" noChangeAspect="1"/>
+            </wp:cNvGraphicFramePr>
+            <a:graphic xmlns:a="http://schemas.openxmlformats.org/drawingml/2006/main">
+              <a:graphicData uri="http://schemas.openxmlformats.org/drawingml/2006/picture">
+                <pic:pic xmlns:pic="http://schemas.openxmlformats.org/drawingml/2006/picture">
+                  <pic:nvPicPr>
+                    <pic:cNvPr id="1486469402" name="Imagen 1" descr="Interfaz de usuario gráfica, Texto, Aplicación&#10;&#10;El contenido generado por IA puede ser incorrecto."/>
+                    <pic:cNvPicPr/>
+                  </pic:nvPicPr>
+                  <pic:blipFill>
+                    <a:blip r:embed="rId29"/>
+                    <a:stretch>
+                      <a:fillRect/>
+                    </a:stretch>
+                  </pic:blipFill>
+                  <pic:spPr>
+                    <a:xfrm>
+                      <a:off x="0" y="0"/>
+                      <a:ext cx="5287113" cy="1629002"/>
+                    </a:xfrm>
+                    <a:prstGeom prst="rect">
+                      <a:avLst/>
+                    </a:prstGeom>
+                  </pic:spPr>
+                </pic:pic>
+              </a:graphicData>
+            </a:graphic>
+          </wp:inline>
+        </w:drawing>
+      </w:r>
+    </w:p>
+    <w:p>
+      <w:pPr>
+        <w:spacing w:after="0"/>
+      </w:pPr>
+    </w:p>
+    <w:p>
+      <w:pPr>
+        <w:spacing w:after="0"/>
+      </w:pPr>
+      <w:proofErr w:type="spellStart"/>
+      <w:r>
+        <w:t>makeVisible</w:t>
+      </w:r>
+      <w:proofErr w:type="spellEnd"/>
+      <w:r>
+        <w:t>()</w:t>
+      </w:r>
+    </w:p>
+    <w:p>
+      <w:pPr>
+        <w:spacing w:after="0"/>
+      </w:pPr>
+      <w:r>
+        <w:drawing>
+          <wp:inline distT="0" distB="0" distL="0" distR="0" wp14:anchorId="52F840E1" wp14:editId="124D7A77">
+            <wp:extent cx="5353797" cy="2172003"/>
+            <wp:effectExtent l="0" t="0" r="0" b="0"/>
+            <wp:docPr id="1108187479" name="Imagen 1" descr="Texto&#10;&#10;El contenido generado por IA puede ser incorrecto."/>
+            <wp:cNvGraphicFramePr>
+              <a:graphicFrameLocks xmlns:a="http://schemas.openxmlformats.org/drawingml/2006/main" noChangeAspect="1"/>
+            </wp:cNvGraphicFramePr>
+            <a:graphic xmlns:a="http://schemas.openxmlformats.org/drawingml/2006/main">
+              <a:graphicData uri="http://schemas.openxmlformats.org/drawingml/2006/picture">
+                <pic:pic xmlns:pic="http://schemas.openxmlformats.org/drawingml/2006/picture">
+                  <pic:nvPicPr>
+                    <pic:cNvPr id="1108187479" name="Imagen 1" descr="Texto&#10;&#10;El contenido generado por IA puede ser incorrecto."/>
+                    <pic:cNvPicPr/>
+                  </pic:nvPicPr>
+                  <pic:blipFill>
+                    <a:blip r:embed="rId30"/>
+                    <a:stretch>
+                      <a:fillRect/>
+                    </a:stretch>
+                  </pic:blipFill>
+                  <pic:spPr>
+                    <a:xfrm>
+                      <a:off x="0" y="0"/>
+                      <a:ext cx="5353797" cy="2172003"/>
+                    </a:xfrm>
+                    <a:prstGeom prst="rect">
+                      <a:avLst/>
+                    </a:prstGeom>
+                  </pic:spPr>
+                </pic:pic>
+              </a:graphicData>
+            </a:graphic>
+          </wp:inline>
+        </w:drawing>
+      </w:r>
+    </w:p>
+    <w:p>
+      <w:pPr>
+        <w:spacing w:after="0"/>
+      </w:pPr>
+    </w:p>
+    <w:p>
+      <w:pPr>
+        <w:spacing w:after="0"/>
+      </w:pPr>
+      <w:proofErr w:type="spellStart"/>
+      <w:r>
+        <w:t>makeInvisible</w:t>
+      </w:r>
+      <w:proofErr w:type="spellEnd"/>
+      <w:r>
+        <w:t>()</w:t>
+      </w:r>
+    </w:p>
+    <w:p>
+      <w:pPr>
+        <w:spacing w:after="0"/>
+      </w:pPr>
+      <w:r>
+        <w:drawing>
+          <wp:inline distT="0" distB="0" distL="0" distR="0" wp14:anchorId="7DD26368" wp14:editId="0B3C9B13">
+            <wp:extent cx="5353797" cy="2172003"/>
+            <wp:effectExtent l="0" t="0" r="0" b="0"/>
+            <wp:docPr id="2027157901" name="Imagen 1"/>
+            <wp:cNvGraphicFramePr>
+              <a:graphicFrameLocks xmlns:a="http://schemas.openxmlformats.org/drawingml/2006/main" noChangeAspect="1"/>
+            </wp:cNvGraphicFramePr>
+            <a:graphic xmlns:a="http://schemas.openxmlformats.org/drawingml/2006/main">
+              <a:graphicData uri="http://schemas.openxmlformats.org/drawingml/2006/picture">
+                <pic:pic xmlns:pic="http://schemas.openxmlformats.org/drawingml/2006/picture">
+                  <pic:nvPicPr>
+                    <pic:cNvPr id="2027157901" name=""/>
+                    <pic:cNvPicPr/>
+                  </pic:nvPicPr>
+                  <pic:blipFill>
+                    <a:blip r:embed="rId30"/>
+                    <a:stretch>
+                      <a:fillRect/>
+                    </a:stretch>
+                  </pic:blipFill>
+                  <pic:spPr>
+                    <a:xfrm>
+                      <a:off x="0" y="0"/>
+                      <a:ext cx="5353797" cy="2172003"/>
+                    </a:xfrm>
+                    <a:prstGeom prst="rect">
+                      <a:avLst/>
+                    </a:prstGeom>
+                  </pic:spPr>
+                </pic:pic>
+              </a:graphicData>
+            </a:graphic>
+          </wp:inline>
+        </w:drawing>
+      </w:r>
+    </w:p>
+    <w:p>
+      <w:pPr>
+        <w:spacing w:after="0"/>
+      </w:pPr>
+    </w:p>
+    <w:p>
+      <w:pPr>
+        <w:spacing w:after="0"/>
+      </w:pPr>
+    </w:p>
+    <w:p>
+      <w:pPr>
+        <w:spacing w:after="0"/>
+      </w:pPr>
+    </w:p>
+    <w:p>
+      <w:pPr>
+        <w:spacing w:after="0"/>
+      </w:pPr>
+    </w:p>
+    <w:p>
+      <w:pPr>
+        <w:spacing w:after="0"/>
+      </w:pPr>
+    </w:p>
+    <w:p>
+      <w:pPr>
+        <w:spacing w:after="0"/>
+      </w:pPr>
+    </w:p>
+    <w:p>
+      <w:pPr>
+        <w:spacing w:after="0"/>
+      </w:pPr>
+    </w:p>
+    <w:p>
+      <w:pPr>
+        <w:spacing w:after="0"/>
+      </w:pPr>
+      <w:r>
+        <w:lastRenderedPageBreak/>
+        <w:t>head()</w:t>
+      </w:r>
+    </w:p>
+    <w:p>
+      <w:pPr>
+        <w:spacing w:after="0"/>
+      </w:pPr>
+      <w:r>
+        <w:drawing>
+          <wp:inline distT="0" distB="0" distL="0" distR="0" wp14:anchorId="713FB10F" wp14:editId="33788FE0">
+            <wp:extent cx="5658640" cy="1629002"/>
+            <wp:effectExtent l="0" t="0" r="0" b="9525"/>
+            <wp:docPr id="941453354" name="Imagen 1"/>
+            <wp:cNvGraphicFramePr>
+              <a:graphicFrameLocks xmlns:a="http://schemas.openxmlformats.org/drawingml/2006/main" noChangeAspect="1"/>
+            </wp:cNvGraphicFramePr>
+            <a:graphic xmlns:a="http://schemas.openxmlformats.org/drawingml/2006/main">
+              <a:graphicData uri="http://schemas.openxmlformats.org/drawingml/2006/picture">
+                <pic:pic xmlns:pic="http://schemas.openxmlformats.org/drawingml/2006/picture">
+                  <pic:nvPicPr>
+                    <pic:cNvPr id="941453354" name=""/>
+                    <pic:cNvPicPr/>
+                  </pic:nvPicPr>
+                  <pic:blipFill>
+                    <a:blip r:embed="rId31"/>
+                    <a:stretch>
+                      <a:fillRect/>
+                    </a:stretch>
+                  </pic:blipFill>
+                  <pic:spPr>
+                    <a:xfrm>
+                      <a:off x="0" y="0"/>
+                      <a:ext cx="5658640" cy="1629002"/>
+                    </a:xfrm>
+                    <a:prstGeom prst="rect">
+                      <a:avLst/>
+                    </a:prstGeom>
+                  </pic:spPr>
+                </pic:pic>
+              </a:graphicData>
+            </a:graphic>
+          </wp:inline>
+        </w:drawing>
+      </w:r>
+    </w:p>
+    <w:p>
+      <w:pPr>
+        <w:spacing w:after="0"/>
+      </w:pPr>
+    </w:p>
+    <w:p>
+      <w:pPr>
+        <w:spacing w:after="0"/>
+      </w:pPr>
+      <w:proofErr w:type="spellStart"/>
+      <w:r>
+        <w:t>tail</w:t>
+      </w:r>
+      <w:proofErr w:type="spellEnd"/>
+      <w:r>
+        <w:t>()</w:t>
+      </w:r>
+    </w:p>
+    <w:p>
+      <w:pPr>
+        <w:spacing w:after="0"/>
+      </w:pPr>
+      <w:r>
+        <w:drawing>
+          <wp:inline distT="0" distB="0" distL="0" distR="0" wp14:anchorId="781DA6C3" wp14:editId="24936CBF">
+            <wp:extent cx="5849166" cy="1629002"/>
+            <wp:effectExtent l="0" t="0" r="0" b="9525"/>
+            <wp:docPr id="1212679767" name="Imagen 1"/>
+            <wp:cNvGraphicFramePr>
+              <a:graphicFrameLocks xmlns:a="http://schemas.openxmlformats.org/drawingml/2006/main" noChangeAspect="1"/>
+            </wp:cNvGraphicFramePr>
+            <a:graphic xmlns:a="http://schemas.openxmlformats.org/drawingml/2006/main">
+              <a:graphicData uri="http://schemas.openxmlformats.org/drawingml/2006/picture">
+                <pic:pic xmlns:pic="http://schemas.openxmlformats.org/drawingml/2006/picture">
+                  <pic:nvPicPr>
+                    <pic:cNvPr id="1212679767" name=""/>
+                    <pic:cNvPicPr/>
+                  </pic:nvPicPr>
+                  <pic:blipFill>
+                    <a:blip r:embed="rId32"/>
+                    <a:stretch>
+                      <a:fillRect/>
+                    </a:stretch>
+                  </pic:blipFill>
+                  <pic:spPr>
+                    <a:xfrm>
+                      <a:off x="0" y="0"/>
+                      <a:ext cx="5849166" cy="1629002"/>
+                    </a:xfrm>
+                    <a:prstGeom prst="rect">
+                      <a:avLst/>
+                    </a:prstGeom>
+                  </pic:spPr>
+                </pic:pic>
+              </a:graphicData>
+            </a:graphic>
+          </wp:inline>
+        </w:drawing>
+      </w:r>
+    </w:p>
+    <w:p>
+      <w:pPr>
+        <w:spacing w:after="0"/>
+      </w:pPr>
+    </w:p>
+    <w:p>
+      <w:pPr>
+        <w:spacing w:after="0"/>
+      </w:pPr>
+    </w:p>
+    <w:p>
+      <w:pPr>
+        <w:spacing w:after="0"/>
+      </w:pPr>
+    </w:p>
+    <w:p>
+      <w:pPr>
+        <w:spacing w:after="0"/>
+      </w:pPr>
+    </w:p>
+    <w:p>
+      <w:pPr>
+        <w:spacing w:after="0"/>
+      </w:pPr>
+    </w:p>
+    <w:p>
+      <w:pPr>
+        <w:spacing w:after="0"/>
+      </w:pPr>
+    </w:p>
+    <w:p>
+      <w:pPr>
+        <w:spacing w:after="0"/>
+      </w:pPr>
+    </w:p>
+    <w:p>
+      <w:pPr>
+        <w:spacing w:after="0"/>
+      </w:pPr>
+    </w:p>
+    <w:p>
+      <w:pPr>
+        <w:spacing w:after="0"/>
+      </w:pPr>
+    </w:p>
+    <w:p>
+      <w:pPr>
+        <w:spacing w:after="0"/>
+      </w:pPr>
+    </w:p>
+    <w:p>
+      <w:pPr>
+        <w:spacing w:after="0"/>
+      </w:pPr>
+    </w:p>
+    <w:p>
+      <w:pPr>
+        <w:spacing w:after="0"/>
+      </w:pPr>
+    </w:p>
+    <w:p>
+      <w:pPr>
+        <w:spacing w:after="0"/>
+      </w:pPr>
+    </w:p>
+    <w:p>
+      <w:pPr>
+        <w:spacing w:after="0"/>
+      </w:pPr>
+    </w:p>
+    <w:p>
+      <w:pPr>
+        <w:spacing w:after="0"/>
+      </w:pPr>
+    </w:p>
+    <w:p>
+      <w:pPr>
+        <w:spacing w:after="0"/>
+      </w:pPr>
+    </w:p>
+    <w:p>
+      <w:pPr>
+        <w:spacing w:after="0"/>
+      </w:pPr>
+    </w:p>
+    <w:p>
+      <w:pPr>
+        <w:spacing w:after="0"/>
+      </w:pPr>
+    </w:p>
+    <w:p>
+      <w:pPr>
+        <w:spacing w:after="0"/>
+      </w:pPr>
+    </w:p>
+    <w:p>
+      <w:pPr>
+        <w:spacing w:after="0"/>
+      </w:pPr>
+    </w:p>
+    <w:p>
+      <w:pPr>
+        <w:spacing w:after="0"/>
+      </w:pPr>
+    </w:p>
+    <w:p>
+      <w:pPr>
+        <w:spacing w:after="0"/>
+      </w:pPr>
+    </w:p>
+    <w:p>
+      <w:pPr>
+        <w:spacing w:after="0"/>
+      </w:pPr>
+    </w:p>
+    <w:p>
+      <w:pPr>
+        <w:spacing w:after="0"/>
+      </w:pPr>
+    </w:p>
+    <w:p>
+      <w:pPr>
+        <w:spacing w:after="0"/>
+      </w:pPr>
+      <w:proofErr w:type="spellStart"/>
+      <w:r>
+        <w:t>move</w:t>
+      </w:r>
+      <w:proofErr w:type="spellEnd"/>
+      <w:r>
+        <w:t>()</w:t>
+      </w:r>
+    </w:p>
+    <w:p>
+      <w:pPr>
+        <w:spacing w:after="0"/>
+      </w:pPr>
+      <w:r>
+        <w:drawing>
+          <wp:inline distT="0" distB="0" distL="0" distR="0" wp14:anchorId="46028B0A" wp14:editId="2776F6E9">
+            <wp:extent cx="3792584" cy="5229225"/>
+            <wp:effectExtent l="0" t="0" r="0" b="0"/>
+            <wp:docPr id="611794894" name="Imagen 1"/>
+            <wp:cNvGraphicFramePr>
+              <a:graphicFrameLocks xmlns:a="http://schemas.openxmlformats.org/drawingml/2006/main" noChangeAspect="1"/>
+            </wp:cNvGraphicFramePr>
+            <a:graphic xmlns:a="http://schemas.openxmlformats.org/drawingml/2006/main">
+              <a:graphicData uri="http://schemas.openxmlformats.org/drawingml/2006/picture">
+                <pic:pic xmlns:pic="http://schemas.openxmlformats.org/drawingml/2006/picture">
+                  <pic:nvPicPr>
+                    <pic:cNvPr id="611794894" name=""/>
+                    <pic:cNvPicPr/>
+                  </pic:nvPicPr>
+                  <pic:blipFill rotWithShape="1">
+                    <a:blip r:embed="rId33"/>
+                    <a:srcRect r="26306"/>
+                    <a:stretch>
+                      <a:fillRect/>
+                    </a:stretch>
+                  </pic:blipFill>
+                  <pic:spPr bwMode="auto">
+                    <a:xfrm>
+                      <a:off x="0" y="0"/>
+                      <a:ext cx="3796565" cy="5234715"/>
+                    </a:xfrm>
+                    <a:prstGeom prst="rect">
+                      <a:avLst/>
+                    </a:prstGeom>
+                    <a:ln>
+                      <a:noFill/>
+                    </a:ln>
+                    <a:extLst>
+                      <a:ext uri="{53640926-AAD7-44D8-BBD7-CCE9431645EC}">
+                        <a14:shadowObscured xmlns:a14="http://schemas.microsoft.com/office/drawing/2010/main"/>
+                      </a:ext>
+                    </a:extLst>
+                  </pic:spPr>
+                </pic:pic>
+              </a:graphicData>
+            </a:graphic>
+          </wp:inline>
+        </w:drawing>
+      </w:r>
+    </w:p>
+    <w:p>
+      <w:pPr>
+        <w:spacing w:after="0"/>
+      </w:pPr>
+    </w:p>
+    <w:p>
+      <w:pPr>
+        <w:spacing w:after="0"/>
+      </w:pPr>
+    </w:p>
+    <w:p>
+      <w:pPr>
+        <w:spacing w:after="0"/>
+      </w:pPr>
+    </w:p>
+    <w:p>
+      <w:pPr>
+        <w:spacing w:after="0"/>
+      </w:pPr>
+    </w:p>
+    <w:p>
+      <w:pPr>
+        <w:spacing w:after="0"/>
+      </w:pPr>
+    </w:p>
+    <w:p>
+      <w:pPr>
+        <w:spacing w:after="0"/>
+      </w:pPr>
+    </w:p>
+    <w:p>
+      <w:pPr>
+        <w:spacing w:after="0"/>
+      </w:pPr>
+    </w:p>
+    <w:p>
+      <w:pPr>
+        <w:spacing w:after="0"/>
+      </w:pPr>
+    </w:p>
+    <w:p>
+      <w:pPr>
+        <w:spacing w:after="0"/>
+      </w:pPr>
+    </w:p>
+    <w:p>
+      <w:pPr>
+        <w:spacing w:after="0"/>
+      </w:pPr>
+    </w:p>
+    <w:p>
+      <w:pPr>
+        <w:spacing w:after="0"/>
+      </w:pPr>
+    </w:p>
+    <w:p>
+      <w:pPr>
+        <w:spacing w:after="0"/>
+      </w:pPr>
+    </w:p>
+    <w:p>
+      <w:pPr>
+        <w:spacing w:after="0"/>
+      </w:pPr>
+    </w:p>
+    <w:p>
+      <w:pPr>
+        <w:spacing w:after="0"/>
+      </w:pPr>
+    </w:p>
+    <w:p>
+      <w:pPr>
+        <w:spacing w:after="0"/>
+      </w:pPr>
+      <w:proofErr w:type="spellStart"/>
+      <w:r>
+        <w:lastRenderedPageBreak/>
+        <w:t>grow</w:t>
+      </w:r>
+      <w:proofErr w:type="spellEnd"/>
+      <w:r>
+        <w:t>()</w:t>
+      </w:r>
+    </w:p>
+    <w:p>
+      <w:pPr>
+        <w:spacing w:after="0"/>
+      </w:pPr>
+      <w:r>
+        <w:drawing>
+          <wp:inline distT="0" distB="0" distL="0" distR="0" wp14:anchorId="5475AFA8" wp14:editId="434A7AE0">
+            <wp:extent cx="5943600" cy="4364355"/>
+            <wp:effectExtent l="0" t="0" r="0" b="0"/>
+            <wp:docPr id="1319637051" name="Imagen 1"/>
+            <wp:cNvGraphicFramePr>
+              <a:graphicFrameLocks xmlns:a="http://schemas.openxmlformats.org/drawingml/2006/main" noChangeAspect="1"/>
+            </wp:cNvGraphicFramePr>
+            <a:graphic xmlns:a="http://schemas.openxmlformats.org/drawingml/2006/main">
+              <a:graphicData uri="http://schemas.openxmlformats.org/drawingml/2006/picture">
+                <pic:pic xmlns:pic="http://schemas.openxmlformats.org/drawingml/2006/picture">
+                  <pic:nvPicPr>
+                    <pic:cNvPr id="1319637051" name=""/>
+                    <pic:cNvPicPr/>
+                  </pic:nvPicPr>
+                  <pic:blipFill>
+                    <a:blip r:embed="rId34"/>
+                    <a:stretch>
+                      <a:fillRect/>
+                    </a:stretch>
+                  </pic:blipFill>
+                  <pic:spPr>
+                    <a:xfrm>
+                      <a:off x="0" y="0"/>
+                      <a:ext cx="5943600" cy="4364355"/>
+                    </a:xfrm>
+                    <a:prstGeom prst="rect">
+                      <a:avLst/>
+                    </a:prstGeom>
+                  </pic:spPr>
+                </pic:pic>
+              </a:graphicData>
+            </a:graphic>
+          </wp:inline>
+        </w:drawing>
+      </w:r>
+    </w:p>
+    <w:p>
+      <w:pPr>
+        <w:spacing w:after="0"/>
+      </w:pPr>
+      <w:r>
+        <w:drawing>
+          <wp:inline distT="0" distB="0" distL="0" distR="0" wp14:anchorId="5A366BE1" wp14:editId="1B539314">
+            <wp:extent cx="5943600" cy="3422650"/>
+            <wp:effectExtent l="0" t="0" r="0" b="6350"/>
+            <wp:docPr id="996450426" name="Imagen 1" descr="Interfaz de usuario gráfica, Texto, Aplicación&#10;&#10;El contenido generado por IA puede ser incorrecto."/>
+            <wp:cNvGraphicFramePr>
+              <a:graphicFrameLocks xmlns:a="http://schemas.openxmlformats.org/drawingml/2006/main" noChangeAspect="1"/>
+            </wp:cNvGraphicFramePr>
+            <a:graphic xmlns:a="http://schemas.openxmlformats.org/drawingml/2006/main">
+              <a:graphicData uri="http://schemas.openxmlformats.org/drawingml/2006/picture">
+                <pic:pic xmlns:pic="http://schemas.openxmlformats.org/drawingml/2006/picture">
+                  <pic:nvPicPr>
+                    <pic:cNvPr id="996450426" name="Imagen 1" descr="Interfaz de usuario gráfica, Texto, Aplicación&#10;&#10;El contenido generado por IA puede ser incorrecto."/>
+                    <pic:cNvPicPr/>
+                  </pic:nvPicPr>
+                  <pic:blipFill>
+                    <a:blip r:embed="rId35"/>
+                    <a:stretch>
+                      <a:fillRect/>
+                    </a:stretch>
+                  </pic:blipFill>
+                  <pic:spPr>
+                    <a:xfrm>
+                      <a:off x="0" y="0"/>
+                      <a:ext cx="5943600" cy="3422650"/>
+                    </a:xfrm>
+                    <a:prstGeom prst="rect">
+                      <a:avLst/>
+                    </a:prstGeom>
+                  </pic:spPr>
+                </pic:pic>
+              </a:graphicData>
+            </a:graphic>
+          </wp:inline>
+        </w:drawing>
+      </w:r>
+    </w:p>
+    <w:p>
+      <w:pPr>
+        <w:spacing w:after="0"/>
+      </w:pPr>
+    </w:p>
+    <w:p>
+      <w:pPr>
+        <w:spacing w:after="0"/>
+      </w:pPr>
+      <w:r>
+        <w:lastRenderedPageBreak/>
+        <w:t>Las siguientes fotos son para mostrar la prueba.</w:t>
+      </w:r>
+    </w:p>
+    <w:p>
+      <w:pPr>
+        <w:spacing w:after="0"/>
+      </w:pPr>
+      <w:r>
+        <w:t>Acá vemos como seleccionamos el método para crearse:</w:t>
+      </w:r>
+    </w:p>
+    <w:p>
+      <w:pPr>
+        <w:spacing w:after="0"/>
+      </w:pPr>
+    </w:p>
+    <w:p>
+      <w:pPr>
+        <w:spacing w:after="0"/>
+      </w:pPr>
+      <w:r>
+        <w:drawing>
+          <wp:inline distT="0" distB="0" distL="0" distR="0" wp14:anchorId="063D52A4" wp14:editId="0003BB46">
+            <wp:extent cx="5943600" cy="1819275"/>
+            <wp:effectExtent l="0" t="0" r="0" b="9525"/>
+            <wp:docPr id="1827902391" name="Imagen 1" descr="Interfaz de usuario gráfica&#10;&#10;El contenido generado por IA puede ser incorrecto."/>
+            <wp:cNvGraphicFramePr>
+              <a:graphicFrameLocks xmlns:a="http://schemas.openxmlformats.org/drawingml/2006/main" noChangeAspect="1"/>
+            </wp:cNvGraphicFramePr>
+            <a:graphic xmlns:a="http://schemas.openxmlformats.org/drawingml/2006/main">
+              <a:graphicData uri="http://schemas.openxmlformats.org/drawingml/2006/picture">
+                <pic:pic xmlns:pic="http://schemas.openxmlformats.org/drawingml/2006/picture">
+                  <pic:nvPicPr>
+                    <pic:cNvPr id="1827902391" name="Imagen 1" descr="Interfaz de usuario gráfica&#10;&#10;El contenido generado por IA puede ser incorrecto."/>
+                    <pic:cNvPicPr/>
+                  </pic:nvPicPr>
+                  <pic:blipFill rotWithShape="1">
+                    <a:blip r:embed="rId36"/>
+                    <a:srcRect b="26102"/>
+                    <a:stretch>
+                      <a:fillRect/>
+                    </a:stretch>
+                  </pic:blipFill>
+                  <pic:spPr bwMode="auto">
+                    <a:xfrm>
+                      <a:off x="0" y="0"/>
+                      <a:ext cx="5943600" cy="1819275"/>
+                    </a:xfrm>
+                    <a:prstGeom prst="rect">
+                      <a:avLst/>
+                    </a:prstGeom>
+                    <a:ln>
+                      <a:noFill/>
+                    </a:ln>
+                    <a:extLst>
+                      <a:ext uri="{53640926-AAD7-44D8-BBD7-CCE9431645EC}">
+                        <a14:shadowObscured xmlns:a14="http://schemas.microsoft.com/office/drawing/2010/main"/>
+                      </a:ext>
+                    </a:extLst>
+                  </pic:spPr>
+                </pic:pic>
+              </a:graphicData>
+            </a:graphic>
+          </wp:inline>
+        </w:drawing>
+      </w:r>
+    </w:p>
+    <w:p>
+      <w:pPr>
+        <w:spacing w:after="0"/>
+      </w:pPr>
+    </w:p>
+    <w:p>
+      <w:pPr>
+        <w:spacing w:after="0"/>
+      </w:pPr>
+      <w:r>
+        <w:t>Acá vemos como ponemos los parámetros para crear la serpiente:</w:t>
+      </w:r>
+    </w:p>
+    <w:p>
+      <w:pPr>
+        <w:spacing w:after="0"/>
+      </w:pPr>
+      <w:r>
+        <w:drawing>
+          <wp:inline distT="0" distB="0" distL="0" distR="0" wp14:anchorId="132E0273" wp14:editId="6720A80D">
+            <wp:extent cx="3429479" cy="3667637"/>
+            <wp:effectExtent l="0" t="0" r="0" b="9525"/>
+            <wp:docPr id="467972277" name="Imagen 1"/>
+            <wp:cNvGraphicFramePr>
+              <a:graphicFrameLocks xmlns:a="http://schemas.openxmlformats.org/drawingml/2006/main" noChangeAspect="1"/>
+            </wp:cNvGraphicFramePr>
+            <a:graphic xmlns:a="http://schemas.openxmlformats.org/drawingml/2006/main">
+              <a:graphicData uri="http://schemas.openxmlformats.org/drawingml/2006/picture">
+                <pic:pic xmlns:pic="http://schemas.openxmlformats.org/drawingml/2006/picture">
+                  <pic:nvPicPr>
+                    <pic:cNvPr id="467972277" name=""/>
+                    <pic:cNvPicPr/>
+                  </pic:nvPicPr>
+                  <pic:blipFill>
+                    <a:blip r:embed="rId37"/>
+                    <a:stretch>
+                      <a:fillRect/>
+                    </a:stretch>
+                  </pic:blipFill>
+                  <pic:spPr>
+                    <a:xfrm>
+                      <a:off x="0" y="0"/>
+                      <a:ext cx="3429479" cy="3667637"/>
+                    </a:xfrm>
+                    <a:prstGeom prst="rect">
+                      <a:avLst/>
+                    </a:prstGeom>
+                  </pic:spPr>
+                </pic:pic>
+              </a:graphicData>
+            </a:graphic>
+          </wp:inline>
+        </w:drawing>
+      </w:r>
+    </w:p>
+    <w:p>
+      <w:pPr>
+        <w:spacing w:after="0"/>
+      </w:pPr>
+    </w:p>
+    <w:p>
+      <w:pPr>
+        <w:spacing w:after="0"/>
+      </w:pPr>
+    </w:p>
+    <w:p>
+      <w:pPr>
+        <w:spacing w:after="0"/>
+      </w:pPr>
+    </w:p>
+    <w:p>
+      <w:pPr>
+        <w:spacing w:after="0"/>
+      </w:pPr>
+    </w:p>
+    <w:p>
+      <w:pPr>
+        <w:spacing w:after="0"/>
+      </w:pPr>
+    </w:p>
+    <w:p>
+      <w:pPr>
+        <w:spacing w:after="0"/>
+      </w:pPr>
+    </w:p>
+    <w:p>
+      <w:pPr>
+        <w:spacing w:after="0"/>
+      </w:pPr>
+    </w:p>
+    <w:p>
+      <w:pPr>
+        <w:spacing w:after="0"/>
+      </w:pPr>
+    </w:p>
+    <w:p>
+      <w:pPr>
+        <w:spacing w:after="0"/>
+      </w:pPr>
+    </w:p>
+    <w:p>
+      <w:pPr>
+        <w:spacing w:after="0"/>
+      </w:pPr>
+    </w:p>
+    <w:p>
+      <w:pPr>
+        <w:spacing w:after="0"/>
+      </w:pPr>
+      <w:r>
+        <w:t>Acá vemos ya creado la cabeza:</w:t>
+      </w:r>
+    </w:p>
+    <w:p>
+      <w:pPr>
+        <w:spacing w:after="0"/>
+      </w:pPr>
+      <w:r>
+        <w:drawing>
+          <wp:inline distT="0" distB="0" distL="0" distR="0" wp14:anchorId="34B95BC5" wp14:editId="633BE104">
+            <wp:extent cx="2838846" cy="3115110"/>
+            <wp:effectExtent l="0" t="0" r="0" b="9525"/>
+            <wp:docPr id="1736132587" name="Imagen 1" descr="Gráfico&#10;&#10;El contenido generado por IA puede ser incorrecto."/>
+            <wp:cNvGraphicFramePr>
+              <a:graphicFrameLocks xmlns:a="http://schemas.openxmlformats.org/drawingml/2006/main" noChangeAspect="1"/>
+            </wp:cNvGraphicFramePr>
+            <a:graphic xmlns:a="http://schemas.openxmlformats.org/drawingml/2006/main">
+              <a:graphicData uri="http://schemas.openxmlformats.org/drawingml/2006/picture">
+                <pic:pic xmlns:pic="http://schemas.openxmlformats.org/drawingml/2006/picture">
+                  <pic:nvPicPr>
+                    <pic:cNvPr id="1736132587" name="Imagen 1" descr="Gráfico&#10;&#10;El contenido generado por IA puede ser incorrecto."/>
+                    <pic:cNvPicPr/>
+                  </pic:nvPicPr>
+                  <pic:blipFill>
+                    <a:blip r:embed="rId38"/>
+                    <a:stretch>
+                      <a:fillRect/>
+                    </a:stretch>
+                  </pic:blipFill>
+                  <pic:spPr>
+                    <a:xfrm>
+                      <a:off x="0" y="0"/>
+                      <a:ext cx="2838846" cy="3115110"/>
+                    </a:xfrm>
+                    <a:prstGeom prst="rect">
+                      <a:avLst/>
+                    </a:prstGeom>
+                  </pic:spPr>
+                </pic:pic>
+              </a:graphicData>
+            </a:graphic>
+          </wp:inline>
+        </w:drawing>
+      </w:r>
+    </w:p>
+    <w:p>
+      <w:pPr>
+        <w:spacing w:after="0"/>
+      </w:pPr>
+    </w:p>
+    <w:p>
+      <w:pPr>
+        <w:spacing w:after="0"/>
+      </w:pPr>
+    </w:p>
+    <w:p>
+      <w:pPr>
+        <w:spacing w:after="0"/>
+      </w:pPr>
+    </w:p>
+    <w:p>
+      <w:pPr>
+        <w:spacing w:after="0"/>
+      </w:pPr>
+    </w:p>
+    <w:p>
+      <w:pPr>
+        <w:spacing w:after="0"/>
+      </w:pPr>
+    </w:p>
+    <w:p>
+      <w:pPr>
+        <w:spacing w:after="0"/>
+      </w:pPr>
+    </w:p>
+    <w:p>
+      <w:pPr>
+        <w:spacing w:after="0"/>
+      </w:pPr>
+    </w:p>
+    <w:p>
+      <w:pPr>
+        <w:spacing w:after="0"/>
+      </w:pPr>
+    </w:p>
+    <w:p>
+      <w:pPr>
+        <w:spacing w:after="0"/>
+      </w:pPr>
+    </w:p>
+    <w:p>
+      <w:pPr>
+        <w:spacing w:after="0"/>
+      </w:pPr>
+    </w:p>
+    <w:p>
+      <w:pPr>
+        <w:spacing w:after="0"/>
+      </w:pPr>
+    </w:p>
+    <w:p>
+      <w:pPr>
+        <w:spacing w:after="0"/>
+      </w:pPr>
+      <w:r>
+        <w:lastRenderedPageBreak/>
+        <w:t xml:space="preserve">Acá vemos la interfaz que genera </w:t>
+      </w:r>
+      <w:proofErr w:type="spellStart"/>
+      <w:r>
+        <w:t>blueJ</w:t>
+      </w:r>
+      <w:proofErr w:type="spellEnd"/>
+      <w:r>
+        <w:t xml:space="preserve"> para cuando aplicamos el método </w:t>
+      </w:r>
+      <w:proofErr w:type="spellStart"/>
+      <w:r>
+        <w:t>grow</w:t>
+      </w:r>
+      <w:proofErr w:type="spellEnd"/>
+      <w:r>
+        <w:t xml:space="preserve"> y como se ve la serpiente crecida:</w:t>
       </w:r>
       <w:r>
         <w:br/>
-        <w:t>1) position es una lista porque la serpiente al ir creciendo, entonces necesitamos saber donde se encuentra cada una de sus partes.</w:t>
-      </w:r>
-    </w:p>
-    <w:p>
-      <w:pPr>
-        <w:spacing w:after="0"/>
-      </w:pPr>
-      <w:r>
-        <w:t>2) como vi que hay métodos makeVisible() y makeInvidible() significa que necesitamos un atributo para poder saber si esta visible o no</w:t>
-      </w:r>
-    </w:p>
-    <w:p>
-      <w:pPr>
-        <w:spacing w:after="0"/>
-      </w:pPr>
-      <w:r>
-        <w:t xml:space="preserve">3) el </w:t>
-      </w:r>
-      <w:r>
-        <w:t>body será la lista de rectángulos que compone a la serpiente</w:t>
-      </w:r>
-    </w:p>
-    <w:p>
-      <w:pPr>
-        <w:spacing w:after="0"/>
-      </w:pPr>
-      <w:r>
-        <w:t>4) el utlmo es para saber que color tiene la serpiente</w:t>
-      </w:r>
-    </w:p>
-    <w:p>
-      <w:pPr>
-        <w:spacing w:after="0"/>
-      </w:pPr>
-    </w:p>
-    <w:p>
-      <w:pPr>
-        <w:spacing w:after="0"/>
-        <w:ind w:left="720"/>
-      </w:pPr>
-    </w:p>
-    <w:p>
-      <w:pPr>
-        <w:spacing w:after="0"/>
-        <w:ind w:left="720"/>
-      </w:pPr>
-    </w:p>
-    <w:p>
-      <w:pPr>
-        <w:spacing w:after="0"/>
-        <w:ind w:left="720"/>
+      </w:r>
+      <w:r>
+        <w:drawing>
+          <wp:inline distT="0" distB="0" distL="0" distR="0" wp14:anchorId="186D26E1" wp14:editId="2E79443B">
+            <wp:extent cx="3429479" cy="2581635"/>
+            <wp:effectExtent l="0" t="0" r="0" b="0"/>
+            <wp:docPr id="1017262484" name="Imagen 1"/>
+            <wp:cNvGraphicFramePr>
+              <a:graphicFrameLocks xmlns:a="http://schemas.openxmlformats.org/drawingml/2006/main" noChangeAspect="1"/>
+            </wp:cNvGraphicFramePr>
+            <a:graphic xmlns:a="http://schemas.openxmlformats.org/drawingml/2006/main">
+              <a:graphicData uri="http://schemas.openxmlformats.org/drawingml/2006/picture">
+                <pic:pic xmlns:pic="http://schemas.openxmlformats.org/drawingml/2006/picture">
+                  <pic:nvPicPr>
+                    <pic:cNvPr id="1017262484" name=""/>
+                    <pic:cNvPicPr/>
+                  </pic:nvPicPr>
+                  <pic:blipFill>
+                    <a:blip r:embed="rId39"/>
+                    <a:stretch>
+                      <a:fillRect/>
+                    </a:stretch>
+                  </pic:blipFill>
+                  <pic:spPr>
+                    <a:xfrm>
+                      <a:off x="0" y="0"/>
+                      <a:ext cx="3429479" cy="2581635"/>
+                    </a:xfrm>
+                    <a:prstGeom prst="rect">
+                      <a:avLst/>
+                    </a:prstGeom>
+                  </pic:spPr>
+                </pic:pic>
+              </a:graphicData>
+            </a:graphic>
+          </wp:inline>
+        </w:drawing>
+      </w:r>
+    </w:p>
+    <w:p>
+      <w:pPr>
+        <w:spacing w:after="0"/>
+      </w:pPr>
+      <w:r>
+        <w:drawing>
+          <wp:inline distT="0" distB="0" distL="0" distR="0" wp14:anchorId="75498974" wp14:editId="0B837B7B">
+            <wp:extent cx="2791215" cy="3086531"/>
+            <wp:effectExtent l="0" t="0" r="9525" b="0"/>
+            <wp:docPr id="807711111" name="Imagen 1" descr="Interfaz de usuario gráfica&#10;&#10;El contenido generado por IA puede ser incorrecto."/>
+            <wp:cNvGraphicFramePr>
+              <a:graphicFrameLocks xmlns:a="http://schemas.openxmlformats.org/drawingml/2006/main" noChangeAspect="1"/>
+            </wp:cNvGraphicFramePr>
+            <a:graphic xmlns:a="http://schemas.openxmlformats.org/drawingml/2006/main">
+              <a:graphicData uri="http://schemas.openxmlformats.org/drawingml/2006/picture">
+                <pic:pic xmlns:pic="http://schemas.openxmlformats.org/drawingml/2006/picture">
+                  <pic:nvPicPr>
+                    <pic:cNvPr id="807711111" name="Imagen 1" descr="Interfaz de usuario gráfica&#10;&#10;El contenido generado por IA puede ser incorrecto."/>
+                    <pic:cNvPicPr/>
+                  </pic:nvPicPr>
+                  <pic:blipFill>
+                    <a:blip r:embed="rId40"/>
+                    <a:stretch>
+                      <a:fillRect/>
+                    </a:stretch>
+                  </pic:blipFill>
+                  <pic:spPr>
+                    <a:xfrm>
+                      <a:off x="0" y="0"/>
+                      <a:ext cx="2791215" cy="3086531"/>
+                    </a:xfrm>
+                    <a:prstGeom prst="rect">
+                      <a:avLst/>
+                    </a:prstGeom>
+                  </pic:spPr>
+                </pic:pic>
+              </a:graphicData>
+            </a:graphic>
+          </wp:inline>
+        </w:drawing>
+      </w:r>
+    </w:p>
+    <w:p>
+      <w:pPr>
+        <w:spacing w:after="0"/>
+      </w:pPr>
+    </w:p>
+    <w:p>
+      <w:pPr>
+        <w:spacing w:after="0"/>
+      </w:pPr>
+      <w:r>
+        <w:t xml:space="preserve">Y acá vemos el método </w:t>
+      </w:r>
+      <w:proofErr w:type="spellStart"/>
+      <w:r>
+        <w:t>move</w:t>
+      </w:r>
+      <w:proofErr w:type="spellEnd"/>
+      <w:r>
+        <w:t>:</w:t>
+      </w:r>
+    </w:p>
+    <w:p>
+      <w:pPr>
+        <w:spacing w:after="0"/>
+      </w:pPr>
+      <w:r>
+        <w:lastRenderedPageBreak/>
+        <w:drawing>
+          <wp:inline distT="0" distB="0" distL="0" distR="0" wp14:anchorId="616E3FC9" wp14:editId="5D91E765">
+            <wp:extent cx="2867425" cy="3134162"/>
+            <wp:effectExtent l="0" t="0" r="9525" b="9525"/>
+            <wp:docPr id="418996078" name="Imagen 1"/>
+            <wp:cNvGraphicFramePr>
+              <a:graphicFrameLocks xmlns:a="http://schemas.openxmlformats.org/drawingml/2006/main" noChangeAspect="1"/>
+            </wp:cNvGraphicFramePr>
+            <a:graphic xmlns:a="http://schemas.openxmlformats.org/drawingml/2006/main">
+              <a:graphicData uri="http://schemas.openxmlformats.org/drawingml/2006/picture">
+                <pic:pic xmlns:pic="http://schemas.openxmlformats.org/drawingml/2006/picture">
+                  <pic:nvPicPr>
+                    <pic:cNvPr id="418996078" name=""/>
+                    <pic:cNvPicPr/>
+                  </pic:nvPicPr>
+                  <pic:blipFill>
+                    <a:blip r:embed="rId41"/>
+                    <a:stretch>
+                      <a:fillRect/>
+                    </a:stretch>
+                  </pic:blipFill>
+                  <pic:spPr>
+                    <a:xfrm>
+                      <a:off x="0" y="0"/>
+                      <a:ext cx="2867425" cy="3134162"/>
+                    </a:xfrm>
+                    <a:prstGeom prst="rect">
+                      <a:avLst/>
+                    </a:prstGeom>
+                  </pic:spPr>
+                </pic:pic>
+              </a:graphicData>
+            </a:graphic>
+          </wp:inline>
+        </w:drawing>
+      </w:r>
+    </w:p>
+    <w:p>
+      <w:pPr>
+        <w:spacing w:after="0"/>
+      </w:pPr>
+    </w:p>
+    <w:p>
+      <w:pPr>
+        <w:spacing w:after="0"/>
+      </w:pPr>
+      <w:r>
+        <w:br/>
+      </w:r>
+    </w:p>
+    <w:p>
+      <w:pPr>
+        <w:spacing w:after="0"/>
+      </w:pPr>
+    </w:p>
+    <w:p>
+      <w:pPr>
+        <w:spacing w:after="0"/>
+      </w:pPr>
+    </w:p>
+    <w:p>
+      <w:pPr>
+        <w:spacing w:after="0"/>
+        <w:rPr>
+          <w:b/>
+          <w:bCs/>
+        </w:rPr>
+      </w:pPr>
+      <w:r>
+        <w:rPr>
+          <w:b/>
+          <w:bCs/>
+        </w:rPr>
+        <w:t xml:space="preserve">B Definiendo y creando una nueva clase. </w:t>
+      </w:r>
+      <w:proofErr w:type="spellStart"/>
+      <w:r>
+        <w:rPr>
+          <w:b/>
+          <w:bCs/>
+        </w:rPr>
+        <w:t>HungrySnakeGame</w:t>
+      </w:r>
+      <w:proofErr w:type="spellEnd"/>
+      <w:r>
+        <w:rPr>
+          <w:b/>
+          <w:bCs/>
+        </w:rPr>
+        <w:t xml:space="preserve">. </w:t>
+      </w:r>
+      <w:r>
+        <w:rPr>
+          <w:b/>
+          <w:bCs/>
+        </w:rPr>
+        <w:t xml:space="preserve"> </w:t>
+      </w:r>
+      <w:r>
+        <w:rPr>
+          <w:b/>
+          <w:bCs/>
+        </w:rPr>
+        <w:t xml:space="preserve">En este punto vamos a desarrollar la </w:t>
+      </w:r>
+      <w:proofErr w:type="spellStart"/>
+      <w:r>
+        <w:rPr>
+          <w:b/>
+          <w:bCs/>
+        </w:rPr>
+        <w:t>mini-aplicación</w:t>
+      </w:r>
+      <w:proofErr w:type="spellEnd"/>
+      <w:r>
+        <w:rPr>
+          <w:b/>
+          <w:bCs/>
+        </w:rPr>
+        <w:t xml:space="preserve"> para </w:t>
+      </w:r>
+      <w:proofErr w:type="spellStart"/>
+      <w:r>
+        <w:rPr>
+          <w:b/>
+          <w:bCs/>
+        </w:rPr>
+        <w:t>HungrySnakeGame</w:t>
+      </w:r>
+      <w:proofErr w:type="spellEnd"/>
+      <w:r>
+        <w:rPr>
+          <w:b/>
+          <w:bCs/>
+        </w:rPr>
+        <w:t>.</w:t>
+      </w:r>
+    </w:p>
+    <w:p>
+      <w:pPr>
+        <w:spacing w:after="0"/>
+      </w:pPr>
+    </w:p>
+    <w:p>
+      <w:pPr>
+        <w:spacing w:after="0"/>
+      </w:pPr>
+      <w:r>
+        <w:t>1. Diseñen la clase, es decir, definan los métodos que debe ofrecer.</w:t>
+      </w:r>
+    </w:p>
+    <w:p>
+      <w:pPr>
+        <w:spacing w:after="0"/>
+      </w:pPr>
+      <w:r>
+        <w:t>Los métodos que vamos a realizar son los siguientes</w:t>
+      </w:r>
+      <w:r>
+        <w:t xml:space="preserve">: </w:t>
+      </w:r>
+    </w:p>
+    <w:p>
+      <w:pPr>
+        <w:spacing w:after="0"/>
+      </w:pPr>
+      <w:r>
+        <w:t>El constructor que va a tener adentro un array que va a tener como tal el tablero de juego</w:t>
+      </w:r>
+      <w:r>
+        <w:t xml:space="preserve"> la posición inicial de la manzana además de la serpiente como tal.</w:t>
+      </w:r>
+    </w:p>
+    <w:p>
+      <w:pPr>
+        <w:spacing w:after="0"/>
+      </w:pPr>
+      <w:r>
+        <w:t xml:space="preserve">Un </w:t>
+      </w:r>
+      <w:proofErr w:type="spellStart"/>
+      <w:r>
+        <w:t>move</w:t>
+      </w:r>
+      <w:proofErr w:type="spellEnd"/>
+      <w:r>
+        <w:t xml:space="preserve"> que va a tener dentro </w:t>
+      </w:r>
+      <w:r>
+        <w:t>la lógica para que se coma la manzana crezca y ponga la manzana al azar en el tablero</w:t>
+      </w:r>
+    </w:p>
+    <w:p>
+      <w:pPr>
+        <w:spacing w:after="0"/>
+      </w:pPr>
+      <w:r>
+        <w:t>Uno que mande un mensaje de consolación</w:t>
+      </w:r>
+    </w:p>
+    <w:p>
+      <w:pPr>
+        <w:spacing w:after="0"/>
+      </w:pPr>
+      <w:r>
+        <w:t xml:space="preserve">Un método </w:t>
+      </w:r>
+      <w:proofErr w:type="spellStart"/>
+      <w:r>
+        <w:t>state</w:t>
+      </w:r>
+      <w:proofErr w:type="spellEnd"/>
+      <w:r>
+        <w:t xml:space="preserve"> que diga  que tan larga es la serpiente</w:t>
+      </w:r>
+    </w:p>
+    <w:p>
+      <w:pPr>
+        <w:spacing w:after="0"/>
+      </w:pPr>
+      <w:r>
+        <w:t>Y uno que reinicie el juego</w:t>
+      </w:r>
+    </w:p>
+    <w:p>
+      <w:pPr>
+        <w:spacing w:after="0"/>
+      </w:pPr>
+    </w:p>
+    <w:p>
+      <w:pPr>
+        <w:spacing w:after="0"/>
+      </w:pPr>
+    </w:p>
+    <w:p>
+      <w:pPr>
+        <w:spacing w:after="0"/>
+      </w:pPr>
+    </w:p>
+    <w:p>
+      <w:pPr>
+        <w:spacing w:after="0"/>
+      </w:pPr>
+    </w:p>
+    <w:p>
+      <w:pPr>
+        <w:spacing w:after="0"/>
+      </w:pPr>
+      <w:r>
+        <w:t xml:space="preserve">2. Planifiquen la construcción considerando algunos </w:t>
+      </w:r>
+      <w:proofErr w:type="spellStart"/>
+      <w:r>
+        <w:t>mini-ciclos</w:t>
+      </w:r>
+      <w:proofErr w:type="spellEnd"/>
+      <w:r>
+        <w:t>.</w:t>
+      </w:r>
+    </w:p>
+    <w:p>
+      <w:pPr>
+        <w:spacing w:after="0"/>
+      </w:pPr>
+      <w:r>
+        <w:t xml:space="preserve">Ciclo 1: </w:t>
+      </w:r>
+      <w:proofErr w:type="spellStart"/>
+      <w:r>
+        <w:t>creator</w:t>
+      </w:r>
+      <w:proofErr w:type="spellEnd"/>
+      <w:r>
+        <w:t xml:space="preserve"> y </w:t>
+      </w:r>
+      <w:proofErr w:type="spellStart"/>
+      <w:r>
+        <w:t>move</w:t>
+      </w:r>
+      <w:proofErr w:type="spellEnd"/>
+    </w:p>
+    <w:p>
+      <w:pPr>
+        <w:spacing w:after="0"/>
+      </w:pPr>
+      <w:r>
+        <w:t xml:space="preserve">Ciclo 2: </w:t>
+      </w:r>
+      <w:proofErr w:type="spellStart"/>
+      <w:r>
+        <w:t>consolacion</w:t>
+      </w:r>
+      <w:proofErr w:type="spellEnd"/>
+      <w:r>
+        <w:t xml:space="preserve"> y </w:t>
+      </w:r>
+      <w:proofErr w:type="spellStart"/>
+      <w:r>
+        <w:t>state</w:t>
+      </w:r>
+      <w:proofErr w:type="spellEnd"/>
+    </w:p>
+    <w:p>
+      <w:pPr>
+        <w:spacing w:after="0"/>
+      </w:pPr>
+      <w:r>
+        <w:t>Ciclo 3: reinicio</w:t>
+      </w:r>
+    </w:p>
+    <w:p>
+      <w:pPr>
+        <w:spacing w:after="0"/>
+      </w:pPr>
+    </w:p>
+    <w:p>
+      <w:pPr>
+        <w:spacing w:after="0"/>
+      </w:pPr>
+    </w:p>
+    <w:p>
+      <w:pPr>
+        <w:spacing w:after="0"/>
+      </w:pPr>
+      <w:r>
+        <w:lastRenderedPageBreak/>
+        <w:t xml:space="preserve">3. Implementen la clase. Al final de cada </w:t>
+      </w:r>
+      <w:proofErr w:type="spellStart"/>
+      <w:r>
+        <w:t>mini-ciclo</w:t>
+      </w:r>
+      <w:proofErr w:type="spellEnd"/>
+      <w:r>
+        <w:t xml:space="preserve"> realicen una prueba indicando su propósito. </w:t>
+      </w:r>
+      <w:proofErr w:type="spellStart"/>
+      <w:r>
+        <w:t>Cap</w:t>
+      </w:r>
+      <w:proofErr w:type="spellEnd"/>
+      <w:r>
+        <w:t>-</w:t>
+      </w:r>
+    </w:p>
+    <w:p>
+      <w:pPr>
+        <w:spacing w:after="0"/>
+      </w:pPr>
+      <w:r>
+        <w:t>turen las pantallas relevantes.</w:t>
+      </w:r>
+    </w:p>
+    <w:p>
+      <w:pPr>
+        <w:spacing w:after="0"/>
+      </w:pPr>
+    </w:p>
+    <w:p>
+      <w:pPr>
+        <w:spacing w:after="0"/>
+      </w:pPr>
+      <w:r>
+        <w:t>Primero tenemos el creador aquí:</w:t>
+      </w:r>
+      <w:r>
+        <w:br/>
+      </w:r>
+      <w:r>
+        <w:drawing>
+          <wp:inline distT="0" distB="0" distL="0" distR="0" wp14:anchorId="3638C389" wp14:editId="115166A8">
+            <wp:extent cx="3985275" cy="3829050"/>
+            <wp:effectExtent l="0" t="0" r="0" b="0"/>
+            <wp:docPr id="1073502968" name="Imagen 1" descr="Interfaz de usuario gráfica&#10;&#10;El contenido generado por IA puede ser incorrecto."/>
+            <wp:cNvGraphicFramePr>
+              <a:graphicFrameLocks xmlns:a="http://schemas.openxmlformats.org/drawingml/2006/main" noChangeAspect="1"/>
+            </wp:cNvGraphicFramePr>
+            <a:graphic xmlns:a="http://schemas.openxmlformats.org/drawingml/2006/main">
+              <a:graphicData uri="http://schemas.openxmlformats.org/drawingml/2006/picture">
+                <pic:pic xmlns:pic="http://schemas.openxmlformats.org/drawingml/2006/picture">
+                  <pic:nvPicPr>
+                    <pic:cNvPr id="1073502968" name="Imagen 1" descr="Interfaz de usuario gráfica&#10;&#10;El contenido generado por IA puede ser incorrecto."/>
+                    <pic:cNvPicPr/>
+                  </pic:nvPicPr>
+                  <pic:blipFill rotWithShape="1">
+                    <a:blip r:embed="rId42"/>
+                    <a:srcRect r="17147"/>
+                    <a:stretch>
+                      <a:fillRect/>
+                    </a:stretch>
+                  </pic:blipFill>
+                  <pic:spPr bwMode="auto">
+                    <a:xfrm>
+                      <a:off x="0" y="0"/>
+                      <a:ext cx="3986601" cy="3830324"/>
+                    </a:xfrm>
+                    <a:prstGeom prst="rect">
+                      <a:avLst/>
+                    </a:prstGeom>
+                    <a:ln>
+                      <a:noFill/>
+                    </a:ln>
+                    <a:extLst>
+                      <a:ext uri="{53640926-AAD7-44D8-BBD7-CCE9431645EC}">
+                        <a14:shadowObscured xmlns:a14="http://schemas.microsoft.com/office/drawing/2010/main"/>
+                      </a:ext>
+                    </a:extLst>
+                  </pic:spPr>
+                </pic:pic>
+              </a:graphicData>
+            </a:graphic>
+          </wp:inline>
+        </w:drawing>
+      </w:r>
+    </w:p>
+    <w:p>
+      <w:pPr>
+        <w:spacing w:after="0"/>
+      </w:pPr>
+    </w:p>
+    <w:p>
+      <w:pPr>
+        <w:spacing w:after="0"/>
+      </w:pPr>
+      <w:r>
+        <w:t>Al ejecutar el método nos da este tablero:</w:t>
+      </w:r>
+    </w:p>
+    <w:p>
+      <w:pPr>
+        <w:spacing w:after="0"/>
+      </w:pPr>
+      <w:r>
+        <w:drawing>
+          <wp:inline distT="0" distB="0" distL="0" distR="0" wp14:anchorId="4C7545C2" wp14:editId="4B820586">
+            <wp:extent cx="2848373" cy="3124636"/>
+            <wp:effectExtent l="0" t="0" r="9525" b="0"/>
+            <wp:docPr id="2025011155" name="Imagen 1" descr="Gráfico, Gráfico en cascada&#10;&#10;El contenido generado por IA puede ser incorrecto."/>
+            <wp:cNvGraphicFramePr>
+              <a:graphicFrameLocks xmlns:a="http://schemas.openxmlformats.org/drawingml/2006/main" noChangeAspect="1"/>
+            </wp:cNvGraphicFramePr>
+            <a:graphic xmlns:a="http://schemas.openxmlformats.org/drawingml/2006/main">
+              <a:graphicData uri="http://schemas.openxmlformats.org/drawingml/2006/picture">
+                <pic:pic xmlns:pic="http://schemas.openxmlformats.org/drawingml/2006/picture">
+                  <pic:nvPicPr>
+                    <pic:cNvPr id="2025011155" name="Imagen 1" descr="Gráfico, Gráfico en cascada&#10;&#10;El contenido generado por IA puede ser incorrecto."/>
+                    <pic:cNvPicPr/>
+                  </pic:nvPicPr>
+                  <pic:blipFill>
+                    <a:blip r:embed="rId43"/>
+                    <a:stretch>
+                      <a:fillRect/>
+                    </a:stretch>
+                  </pic:blipFill>
+                  <pic:spPr>
+                    <a:xfrm>
+                      <a:off x="0" y="0"/>
+                      <a:ext cx="2848373" cy="3124636"/>
+                    </a:xfrm>
+                    <a:prstGeom prst="rect">
+                      <a:avLst/>
+                    </a:prstGeom>
+                  </pic:spPr>
+                </pic:pic>
+              </a:graphicData>
+            </a:graphic>
+          </wp:inline>
+        </w:drawing>
+      </w:r>
+    </w:p>
+    <w:p>
+      <w:pPr>
+        <w:spacing w:after="0"/>
+      </w:pPr>
+    </w:p>
+    <w:p>
+      <w:pPr>
+        <w:spacing w:after="0"/>
+      </w:pPr>
+      <w:r>
+        <w:t xml:space="preserve">Ahora el siguiente método es el de </w:t>
+      </w:r>
+      <w:proofErr w:type="spellStart"/>
+      <w:r>
+        <w:t>move</w:t>
+      </w:r>
+      <w:proofErr w:type="spellEnd"/>
+      <w:r>
+        <w:t>()</w:t>
+      </w:r>
+    </w:p>
+    <w:p>
+      <w:pPr>
+        <w:spacing w:after="0"/>
+      </w:pPr>
+      <w:r>
+        <w:drawing>
+          <wp:inline distT="0" distB="0" distL="0" distR="0" wp14:anchorId="4386F64D" wp14:editId="7A32ABED">
+            <wp:extent cx="5943600" cy="3822065"/>
+            <wp:effectExtent l="0" t="0" r="0" b="6985"/>
+            <wp:docPr id="42633194" name="Imagen 1" descr="Interfaz de usuario gráfica, Texto, Aplicación, Correo electrónico&#10;&#10;El contenido generado por IA puede ser incorrecto."/>
+            <wp:cNvGraphicFramePr>
+              <a:graphicFrameLocks xmlns:a="http://schemas.openxmlformats.org/drawingml/2006/main" noChangeAspect="1"/>
+            </wp:cNvGraphicFramePr>
+            <a:graphic xmlns:a="http://schemas.openxmlformats.org/drawingml/2006/main">
+              <a:graphicData uri="http://schemas.openxmlformats.org/drawingml/2006/picture">
+                <pic:pic xmlns:pic="http://schemas.openxmlformats.org/drawingml/2006/picture">
+                  <pic:nvPicPr>
+                    <pic:cNvPr id="42633194" name="Imagen 1" descr="Interfaz de usuario gráfica, Texto, Aplicación, Correo electrónico&#10;&#10;El contenido generado por IA puede ser incorrecto."/>
+                    <pic:cNvPicPr/>
+                  </pic:nvPicPr>
+                  <pic:blipFill>
+                    <a:blip r:embed="rId44"/>
+                    <a:stretch>
+                      <a:fillRect/>
+                    </a:stretch>
+                  </pic:blipFill>
+                  <pic:spPr>
+                    <a:xfrm>
+                      <a:off x="0" y="0"/>
+                      <a:ext cx="5943600" cy="3822065"/>
+                    </a:xfrm>
+                    <a:prstGeom prst="rect">
+                      <a:avLst/>
+                    </a:prstGeom>
+                  </pic:spPr>
+                </pic:pic>
+              </a:graphicData>
+            </a:graphic>
+          </wp:inline>
+        </w:drawing>
+      </w:r>
+    </w:p>
+    <w:p>
+      <w:pPr>
+        <w:spacing w:after="0"/>
+      </w:pPr>
+      <w:r>
+        <w:drawing>
+          <wp:inline distT="0" distB="0" distL="0" distR="0" wp14:anchorId="5C0CAE7E" wp14:editId="42ABFADA">
+            <wp:extent cx="5943600" cy="945515"/>
+            <wp:effectExtent l="0" t="0" r="0" b="6985"/>
+            <wp:docPr id="1016685291" name="Imagen 1" descr="Imagen que contiene Tabla&#10;&#10;El contenido generado por IA puede ser incorrecto."/>
+            <wp:cNvGraphicFramePr>
+              <a:graphicFrameLocks xmlns:a="http://schemas.openxmlformats.org/drawingml/2006/main" noChangeAspect="1"/>
+            </wp:cNvGraphicFramePr>
+            <a:graphic xmlns:a="http://schemas.openxmlformats.org/drawingml/2006/main">
+              <a:graphicData uri="http://schemas.openxmlformats.org/drawingml/2006/picture">
+                <pic:pic xmlns:pic="http://schemas.openxmlformats.org/drawingml/2006/picture">
+                  <pic:nvPicPr>
+                    <pic:cNvPr id="1016685291" name="Imagen 1" descr="Imagen que contiene Tabla&#10;&#10;El contenido generado por IA puede ser incorrecto."/>
+                    <pic:cNvPicPr/>
+                  </pic:nvPicPr>
+                  <pic:blipFill>
+                    <a:blip r:embed="rId45"/>
+                    <a:stretch>
+                      <a:fillRect/>
+                    </a:stretch>
+                  </pic:blipFill>
+                  <pic:spPr>
+                    <a:xfrm>
+                      <a:off x="0" y="0"/>
+                      <a:ext cx="5943600" cy="945515"/>
+                    </a:xfrm>
+                    <a:prstGeom prst="rect">
+                      <a:avLst/>
+                    </a:prstGeom>
+                  </pic:spPr>
+                </pic:pic>
+              </a:graphicData>
+            </a:graphic>
+          </wp:inline>
+        </w:drawing>
+      </w:r>
+    </w:p>
+    <w:p>
+      <w:pPr>
+        <w:spacing w:after="0"/>
+      </w:pPr>
+    </w:p>
+    <w:p>
+      <w:pPr>
+        <w:spacing w:after="0"/>
+      </w:pPr>
+      <w:r>
+        <w:t>Y después de comer la manzana pasa lo siguiente:</w:t>
+      </w:r>
+    </w:p>
+    <w:p>
+      <w:pPr>
+        <w:spacing w:after="0"/>
+      </w:pPr>
+      <w:r>
+        <w:lastRenderedPageBreak/>
+        <w:drawing>
+          <wp:inline distT="0" distB="0" distL="0" distR="0" wp14:anchorId="56B9E6D9" wp14:editId="27FA4CEA">
+            <wp:extent cx="2867425" cy="3096057"/>
+            <wp:effectExtent l="0" t="0" r="9525" b="9525"/>
+            <wp:docPr id="406624130" name="Imagen 1" descr="Gráfico en cascada&#10;&#10;El contenido generado por IA puede ser incorrecto."/>
+            <wp:cNvGraphicFramePr>
+              <a:graphicFrameLocks xmlns:a="http://schemas.openxmlformats.org/drawingml/2006/main" noChangeAspect="1"/>
+            </wp:cNvGraphicFramePr>
+            <a:graphic xmlns:a="http://schemas.openxmlformats.org/drawingml/2006/main">
+              <a:graphicData uri="http://schemas.openxmlformats.org/drawingml/2006/picture">
+                <pic:pic xmlns:pic="http://schemas.openxmlformats.org/drawingml/2006/picture">
+                  <pic:nvPicPr>
+                    <pic:cNvPr id="406624130" name="Imagen 1" descr="Gráfico en cascada&#10;&#10;El contenido generado por IA puede ser incorrecto."/>
+                    <pic:cNvPicPr/>
+                  </pic:nvPicPr>
+                  <pic:blipFill>
+                    <a:blip r:embed="rId46"/>
+                    <a:stretch>
+                      <a:fillRect/>
+                    </a:stretch>
+                  </pic:blipFill>
+                  <pic:spPr>
+                    <a:xfrm>
+                      <a:off x="0" y="0"/>
+                      <a:ext cx="2867425" cy="3096057"/>
+                    </a:xfrm>
+                    <a:prstGeom prst="rect">
+                      <a:avLst/>
+                    </a:prstGeom>
+                  </pic:spPr>
+                </pic:pic>
+              </a:graphicData>
+            </a:graphic>
+          </wp:inline>
+        </w:drawing>
+      </w:r>
+    </w:p>
+    <w:p>
+      <w:pPr>
+        <w:spacing w:after="0"/>
+      </w:pPr>
+    </w:p>
+    <w:p>
+      <w:pPr>
+        <w:spacing w:after="0"/>
+      </w:pPr>
+      <w:r>
+        <w:tab/>
+      </w:r>
+    </w:p>
+    <w:p>
+      <w:pPr>
+        <w:spacing w:after="0"/>
+      </w:pPr>
+      <w:r>
+        <w:t xml:space="preserve">Si pierdes chochando con el mapa sale el mensaje de </w:t>
+      </w:r>
+      <w:proofErr w:type="spellStart"/>
+      <w:r>
+        <w:t>consolacion</w:t>
+      </w:r>
+      <w:proofErr w:type="spellEnd"/>
+      <w:r>
+        <w:t>:</w:t>
+      </w:r>
+    </w:p>
+    <w:p>
+      <w:pPr>
+        <w:spacing w:after="0"/>
+      </w:pPr>
+      <w:r>
+        <w:drawing>
+          <wp:inline distT="0" distB="0" distL="0" distR="0" wp14:anchorId="43AC369E" wp14:editId="741A5F96">
+            <wp:extent cx="2438740" cy="1028844"/>
+            <wp:effectExtent l="0" t="0" r="0" b="0"/>
+            <wp:docPr id="1225016381" name="Imagen 1" descr="Interfaz de usuario gráfica, Aplicación&#10;&#10;El contenido generado por IA puede ser incorrecto."/>
+            <wp:cNvGraphicFramePr>
+              <a:graphicFrameLocks xmlns:a="http://schemas.openxmlformats.org/drawingml/2006/main" noChangeAspect="1"/>
+            </wp:cNvGraphicFramePr>
+            <a:graphic xmlns:a="http://schemas.openxmlformats.org/drawingml/2006/main">
+              <a:graphicData uri="http://schemas.openxmlformats.org/drawingml/2006/picture">
+                <pic:pic xmlns:pic="http://schemas.openxmlformats.org/drawingml/2006/picture">
+                  <pic:nvPicPr>
+                    <pic:cNvPr id="1225016381" name="Imagen 1" descr="Interfaz de usuario gráfica, Aplicación&#10;&#10;El contenido generado por IA puede ser incorrecto."/>
+                    <pic:cNvPicPr/>
+                  </pic:nvPicPr>
+                  <pic:blipFill>
+                    <a:blip r:embed="rId47"/>
+                    <a:stretch>
+                      <a:fillRect/>
+                    </a:stretch>
+                  </pic:blipFill>
+                  <pic:spPr>
+                    <a:xfrm>
+                      <a:off x="0" y="0"/>
+                      <a:ext cx="2438740" cy="1028844"/>
+                    </a:xfrm>
+                    <a:prstGeom prst="rect">
+                      <a:avLst/>
+                    </a:prstGeom>
+                  </pic:spPr>
+                </pic:pic>
+              </a:graphicData>
+            </a:graphic>
+          </wp:inline>
+        </w:drawing>
+      </w:r>
+    </w:p>
+    <w:p>
+      <w:pPr>
+        <w:spacing w:after="0"/>
+      </w:pPr>
+      <w:r>
+        <w:drawing>
+          <wp:inline distT="0" distB="0" distL="0" distR="0" wp14:anchorId="73D75F05" wp14:editId="26B16519">
+            <wp:extent cx="5943600" cy="319405"/>
+            <wp:effectExtent l="0" t="0" r="0" b="4445"/>
+            <wp:docPr id="1388034001" name="Imagen 1"/>
+            <wp:cNvGraphicFramePr>
+              <a:graphicFrameLocks xmlns:a="http://schemas.openxmlformats.org/drawingml/2006/main" noChangeAspect="1"/>
+            </wp:cNvGraphicFramePr>
+            <a:graphic xmlns:a="http://schemas.openxmlformats.org/drawingml/2006/main">
+              <a:graphicData uri="http://schemas.openxmlformats.org/drawingml/2006/picture">
+                <pic:pic xmlns:pic="http://schemas.openxmlformats.org/drawingml/2006/picture">
+                  <pic:nvPicPr>
+                    <pic:cNvPr id="1388034001" name=""/>
+                    <pic:cNvPicPr/>
+                  </pic:nvPicPr>
+                  <pic:blipFill>
+                    <a:blip r:embed="rId48"/>
+                    <a:stretch>
+                      <a:fillRect/>
+                    </a:stretch>
+                  </pic:blipFill>
+                  <pic:spPr>
+                    <a:xfrm>
+                      <a:off x="0" y="0"/>
+                      <a:ext cx="5943600" cy="319405"/>
+                    </a:xfrm>
+                    <a:prstGeom prst="rect">
+                      <a:avLst/>
+                    </a:prstGeom>
+                  </pic:spPr>
+                </pic:pic>
+              </a:graphicData>
+            </a:graphic>
+          </wp:inline>
+        </w:drawing>
+      </w:r>
+    </w:p>
+    <w:p>
+      <w:pPr>
+        <w:spacing w:after="0"/>
+      </w:pPr>
+    </w:p>
+    <w:p>
+      <w:pPr>
+        <w:spacing w:after="0"/>
+      </w:pPr>
+      <w:r>
+        <w:t>Para saber el tamaño de la serpiente es el siguiente método:</w:t>
+      </w:r>
+    </w:p>
+    <w:p>
+      <w:pPr>
+        <w:spacing w:after="0"/>
+      </w:pPr>
+      <w:r>
+        <w:drawing>
+          <wp:inline distT="0" distB="0" distL="0" distR="0" wp14:anchorId="6BBAD5F0" wp14:editId="2B9F5E42">
+            <wp:extent cx="5877745" cy="495369"/>
+            <wp:effectExtent l="0" t="0" r="8890" b="0"/>
+            <wp:docPr id="1775465979" name="Imagen 1" descr="Imagen que contiene Interfaz de usuario gráfica&#10;&#10;El contenido generado por IA puede ser incorrecto."/>
+            <wp:cNvGraphicFramePr>
+              <a:graphicFrameLocks xmlns:a="http://schemas.openxmlformats.org/drawingml/2006/main" noChangeAspect="1"/>
+            </wp:cNvGraphicFramePr>
+            <a:graphic xmlns:a="http://schemas.openxmlformats.org/drawingml/2006/main">
+              <a:graphicData uri="http://schemas.openxmlformats.org/drawingml/2006/picture">
+                <pic:pic xmlns:pic="http://schemas.openxmlformats.org/drawingml/2006/picture">
+                  <pic:nvPicPr>
+                    <pic:cNvPr id="1775465979" name="Imagen 1" descr="Imagen que contiene Interfaz de usuario gráfica&#10;&#10;El contenido generado por IA puede ser incorrecto."/>
+                    <pic:cNvPicPr/>
+                  </pic:nvPicPr>
+                  <pic:blipFill>
+                    <a:blip r:embed="rId49"/>
+                    <a:stretch>
+                      <a:fillRect/>
+                    </a:stretch>
+                  </pic:blipFill>
+                  <pic:spPr>
+                    <a:xfrm>
+                      <a:off x="0" y="0"/>
+                      <a:ext cx="5877745" cy="495369"/>
+                    </a:xfrm>
+                    <a:prstGeom prst="rect">
+                      <a:avLst/>
+                    </a:prstGeom>
+                  </pic:spPr>
+                </pic:pic>
+              </a:graphicData>
+            </a:graphic>
+          </wp:inline>
+        </w:drawing>
+      </w:r>
+    </w:p>
+    <w:p>
+      <w:pPr>
+        <w:spacing w:after="0"/>
+      </w:pPr>
+    </w:p>
+    <w:p>
+      <w:pPr>
+        <w:spacing w:after="0"/>
+      </w:pPr>
+    </w:p>
+    <w:p>
+      <w:pPr>
+        <w:spacing w:after="0"/>
+      </w:pPr>
+      <w:r>
+        <w:t xml:space="preserve">4. Indiquen las extensiones necesarias para reutilizar la clase Snake y el paquete </w:t>
+      </w:r>
+      <w:proofErr w:type="spellStart"/>
+      <w:r>
+        <w:t>shapes</w:t>
+      </w:r>
+      <w:proofErr w:type="spellEnd"/>
+      <w:r>
+        <w:t>. Expliquen.</w:t>
+      </w:r>
+    </w:p>
+    <w:p>
+      <w:pPr>
+        <w:spacing w:after="0"/>
+      </w:pPr>
+    </w:p>
+    <w:p>
+      <w:pPr>
+        <w:spacing w:after="0"/>
+      </w:pPr>
+      <w:r>
+        <w:t xml:space="preserve">Para reutilizar la clase Snake junto con el paquete </w:t>
+      </w:r>
+      <w:proofErr w:type="spellStart"/>
+      <w:r>
+        <w:t>shapes</w:t>
+      </w:r>
+      <w:proofErr w:type="spellEnd"/>
+      <w:r>
+        <w:t xml:space="preserve">, es necesario importar las librerías de Java que permiten el uso de listas dinámicas (List y </w:t>
+      </w:r>
+      <w:proofErr w:type="spellStart"/>
+      <w:r>
+        <w:t>ArrayList</w:t>
+      </w:r>
+      <w:proofErr w:type="spellEnd"/>
+      <w:r>
+        <w:t>), ya que el cuerpo de la serpiente puede crecer durante el juego.</w:t>
+      </w:r>
+    </w:p>
+    <w:p>
+      <w:pPr>
+        <w:spacing w:after="0"/>
+      </w:pPr>
+      <w:r>
+        <w:t xml:space="preserve">También se debe importar el paquete donde se encuentra la clase </w:t>
+      </w:r>
+      <w:proofErr w:type="spellStart"/>
+      <w:r>
+        <w:t>Rectangle</w:t>
+      </w:r>
+      <w:proofErr w:type="spellEnd"/>
+      <w:r>
+        <w:t xml:space="preserve">, porque la clase Snake utiliza objetos </w:t>
+      </w:r>
+      <w:proofErr w:type="spellStart"/>
+      <w:r>
+        <w:t>Rectangle</w:t>
+      </w:r>
+      <w:proofErr w:type="spellEnd"/>
+      <w:r>
+        <w:t xml:space="preserve"> para representar gráficamente cada parte de su cuerpo.</w:t>
+      </w:r>
+    </w:p>
+    <w:p>
+      <w:pPr>
+        <w:spacing w:after="0"/>
+      </w:pPr>
+      <w:r>
+        <w:t xml:space="preserve">Además, se utilizan las clases </w:t>
+      </w:r>
+      <w:proofErr w:type="spellStart"/>
+      <w:r>
+        <w:t>JOptionPane</w:t>
+      </w:r>
+      <w:proofErr w:type="spellEnd"/>
+      <w:r>
+        <w:t xml:space="preserve"> y Random, necesarias para mostrar mensajes al usuario y generar posiciones aleatorias para la manzana, respectivamente.</w:t>
+      </w:r>
+    </w:p>
+    <w:p>
+      <w:pPr>
+        <w:spacing w:after="0"/>
+      </w:pPr>
+      <w:r>
+        <w:lastRenderedPageBreak/>
+        <w:t xml:space="preserve">No es necesario que la clase Snake extienda a </w:t>
+      </w:r>
+      <w:proofErr w:type="spellStart"/>
+      <w:r>
+        <w:t>Rectangle</w:t>
+      </w:r>
+      <w:proofErr w:type="spellEnd"/>
+      <w:r>
+        <w:t>, ya que se usa composición, lo que hace el diseño más flexible y reutiliza</w:t>
+      </w:r>
+    </w:p>
+    <w:p>
+      <w:pPr>
+        <w:spacing w:after="0"/>
+      </w:pPr>
+    </w:p>
+    <w:p>
+      <w:pPr>
+        <w:spacing w:after="0"/>
+      </w:pPr>
+      <w:r>
+        <w:t>1. ¿Cuál fue el tiempo total invertido en el laboratorio por cada uno de ustedes? (Horas)</w:t>
+      </w:r>
+    </w:p>
+    <w:p>
+      <w:pPr>
+        <w:spacing w:after="0"/>
+      </w:pPr>
+      <w:r>
+        <w:t>Ambos nos gastamos mas o menos unas 6 horas</w:t>
+      </w:r>
+    </w:p>
+    <w:p>
+      <w:pPr>
+        <w:spacing w:after="0"/>
+      </w:pPr>
+      <w:r>
+        <w:t>2. ¿Cuál es el estado actual del laboratorio? ¿Por qué?</w:t>
+      </w:r>
+    </w:p>
+    <w:p>
+      <w:pPr>
+        <w:spacing w:after="0"/>
+      </w:pPr>
+      <w:r>
+        <w:t xml:space="preserve">Casi finalizado porque nos gustaría poder agregar mas elementos al </w:t>
+      </w:r>
+      <w:proofErr w:type="spellStart"/>
+      <w:r>
+        <w:t>snake</w:t>
+      </w:r>
+      <w:proofErr w:type="spellEnd"/>
+      <w:r>
+        <w:t xml:space="preserve"> como un mejor personaje y que el movimiento sea con las teclas</w:t>
+      </w:r>
+    </w:p>
+    <w:p>
+      <w:pPr>
+        <w:spacing w:after="0"/>
+      </w:pPr>
+      <w:r>
+        <w:t>3. Considerando las prácticas XP del laboratorio, ¿cuál fue la más útil? ¿por qué?</w:t>
+      </w:r>
+    </w:p>
+    <w:p>
+      <w:pPr>
+        <w:spacing w:after="0"/>
+      </w:pPr>
+      <w:proofErr w:type="spellStart"/>
+      <w:r>
+        <w:t>Programing</w:t>
+      </w:r>
+      <w:proofErr w:type="spellEnd"/>
+      <w:r>
+        <w:t xml:space="preserve"> </w:t>
+      </w:r>
+      <w:proofErr w:type="spellStart"/>
+      <w:r>
+        <w:t>pair</w:t>
+      </w:r>
+      <w:proofErr w:type="spellEnd"/>
+      <w:r>
+        <w:t xml:space="preserve"> ya que pudimos ver los errores más fácilmente</w:t>
+      </w:r>
+    </w:p>
+    <w:p>
+      <w:pPr>
+        <w:spacing w:after="0"/>
+      </w:pPr>
+      <w:r>
+        <w:t>4. ¿Cuál consideran fue el mayor logro? ¿Por qué?</w:t>
+      </w:r>
+    </w:p>
+    <w:p>
+      <w:pPr>
+        <w:spacing w:after="0"/>
+      </w:pPr>
+      <w:r>
+        <w:t>Poder entender bien como usar los atributos y los métodos y como usar el lenguaje en java</w:t>
+      </w:r>
+    </w:p>
+    <w:p>
+      <w:pPr>
+        <w:spacing w:after="0"/>
+      </w:pPr>
+      <w:r>
+        <w:t>5. ¿Cuál consideran que fue el mayor problema técnico? ¿Qué hicieron para resolverlo?</w:t>
+      </w:r>
+    </w:p>
+    <w:p>
+      <w:pPr>
+        <w:spacing w:after="0"/>
+      </w:pPr>
+      <w:r>
+        <w:t>Falta de requerimientos por no haber preguntado antes lo solucionamos preguntando a compañeros que si habían podido pedir mejor los requisitos</w:t>
+      </w:r>
+    </w:p>
+    <w:p>
+      <w:pPr>
+        <w:spacing w:after="0"/>
+      </w:pPr>
+      <w:r>
+        <w:t>6. ¿Qué hicieron bien como equipo? ¿Qué se comprometen a hacer para mejorar los resultados?</w:t>
+      </w:r>
+    </w:p>
+    <w:p>
+      <w:pPr>
+        <w:spacing w:after="0"/>
+      </w:pPr>
+      <w:r>
+        <w:t>Una buena comunicación y apoyo, mejorar en hacerlo mas juntos y no cada uno por su lado</w:t>
+      </w:r>
+    </w:p>
+    <w:p>
+      <w:pPr>
+        <w:spacing w:after="0"/>
+      </w:pPr>
+      <w:r>
+        <w:t>7. ¿Qué referencias usaron? ¿Cuál fue la más útil? Incluyan citas con estándares adecuados.</w:t>
+      </w:r>
+    </w:p>
+    <w:p>
+      <w:pPr>
+        <w:spacing w:after="0"/>
+      </w:pPr>
+      <w:r>
+        <w:t xml:space="preserve">Referencias no usamos cuando teníamos dudas tipo como importar un </w:t>
+      </w:r>
+      <w:proofErr w:type="spellStart"/>
+      <w:r>
+        <w:t>randomizador</w:t>
+      </w:r>
+      <w:proofErr w:type="spellEnd"/>
+      <w:r>
+        <w:t xml:space="preserve"> le preguntábamos a IA como chat </w:t>
+      </w:r>
+      <w:proofErr w:type="spellStart"/>
+      <w:r>
+        <w:t>gpt</w:t>
+      </w:r>
+      <w:proofErr w:type="spellEnd"/>
+      <w:r>
+        <w:t xml:space="preserve"> y nos explicaba como poder agregarlo</w:t>
+      </w:r>
+    </w:p>
+    <w:p>
+      <w:pPr>
+        <w:spacing w:after="0"/>
       </w:pPr>
     </w:p>
     <w:sectPr>
@@ -3752,7 +7289,6 @@
   <w:style w:type="character" w:default="1" w:styleId="Fuentedeprrafopredeter">
     <w:name w:val="Default Paragraph Font"/>
     <w:uiPriority w:val="1"/>
-    <w:semiHidden/>
     <w:unhideWhenUsed/>
   </w:style>
   <w:style w:type="table" w:default="1" w:styleId="Tablanormal">

</xml_diff>